<commit_message>
docs: prepare Release 1 scope and permissions for review (#17, #19)
Prepared at Manaswi's request with Codex assistance. Team agreement and runtime verification remain pending.
</commit_message>
<xml_diff>
--- a/docs/part-1/Online_Exam_Portal_SAD.docx
+++ b/docs/part-1/Online_Exam_Portal_SAD.docx
@@ -22,68 +22,57 @@
         <w:rPr>
           <w:b/>
         </w:rPr>
-        <w:t xml:space="preserve">Project: </w:t>
-      </w:r>
-      <w:r>
-        <w:t>Online Exam Portal</w:t>
-      </w:r>
-      <w:r>
+        <w:t>Project: Online Exam Portal</w:t>
+        <w:br/>
+        <w:t>Version: 1.1</w:t>
+        <w:br/>
+        <w:t>Authors: Tanusha Prakash, Guntupalli Manaswi, Vidimalla Guru Teja</w:t>
+        <w:br/>
+        <w:t>Date: 19 October 2026</w:t>
+        <w:br/>
+        <w:t>Status: Pending team review</w:t>
         <w:br/>
       </w:r>
+      <w:r/>
+      <w:r/>
       <w:r>
         <w:rPr>
           <w:b/>
         </w:rPr>
-        <w:t xml:space="preserve">Version: </w:t>
       </w:r>
-      <w:r>
-        <w:t>1.0</w:t>
-      </w:r>
-      <w:r>
-        <w:br/>
-      </w:r>
+      <w:r/>
+      <w:r/>
       <w:r>
         <w:rPr>
           <w:b/>
         </w:rPr>
-        <w:t xml:space="preserve">Authors: </w:t>
       </w:r>
-      <w:r>
-        <w:t>Tanusha, Manaswi, Gururaj</w:t>
-      </w:r>
-      <w:r>
-        <w:br/>
-      </w:r>
+      <w:r/>
+      <w:r/>
       <w:r>
         <w:rPr>
           <w:b/>
         </w:rPr>
-        <w:t xml:space="preserve">Date: </w:t>
       </w:r>
-      <w:r>
-        <w:t>09 October 2026</w:t>
-      </w:r>
-      <w:r>
-        <w:br/>
-      </w:r>
+      <w:r/>
+      <w:r/>
       <w:r>
         <w:rPr>
           <w:b/>
         </w:rPr>
-        <w:t xml:space="preserve">Status: </w:t>
       </w:r>
-      <w:r>
-        <w:t>Initial Baseline</w:t>
-      </w:r>
-      <w:r>
-        <w:br/>
-      </w:r>
+      <w:r/>
+      <w:r/>
     </w:p>
     <w:p>
       <w:pPr>
         <w:pStyle w:val="Heading1"/>
       </w:pPr>
       <w:r>
+        <w:rPr>
+          <w:color w:val="000000"/>
+          <w:u w:val="none"/>
+        </w:rPr>
         <w:t>Revision History</w:t>
       </w:r>
     </w:p>
@@ -92,42 +81,74 @@
         <w:tblStyle w:val="TableGrid"/>
         <w:tblW w:w="0" w:type="auto"/>
         <w:jc w:val="center"/>
+        <w:tblLayout w:type="fixed"/>
         <w:tblLook w:val="04A0" w:firstRow="1" w:lastRow="0" w:firstColumn="1" w:lastColumn="0" w:noHBand="0" w:noVBand="1"/>
+        <w:tblBorders>
+          <w:top w:val="single" w:sz="4" w:color="D9D9D9"/>
+          <w:left w:val="single" w:sz="4" w:color="D9D9D9"/>
+          <w:bottom w:val="single" w:sz="4" w:color="D9D9D9"/>
+          <w:right w:val="single" w:sz="4" w:color="D9D9D9"/>
+          <w:insideH w:val="single" w:sz="4" w:color="D9D9D9"/>
+          <w:insideV w:val="single" w:sz="4" w:color="D9D9D9"/>
+        </w:tblBorders>
+        <w:tblCellMar>
+          <w:top w:w="70" w:type="dxa"/>
+          <w:bottom w:w="70" w:type="dxa"/>
+          <w:left w:w="70" w:type="dxa"/>
+          <w:right w:w="70" w:type="dxa"/>
+        </w:tblCellMar>
       </w:tblPr>
       <w:tblGrid>
-        <w:gridCol w:w="2520"/>
-        <w:gridCol w:w="2520"/>
-        <w:gridCol w:w="2520"/>
-        <w:gridCol w:w="2520"/>
+        <w:gridCol w:w="864"/>
+        <w:gridCol w:w="1656"/>
+        <w:gridCol w:w="2304"/>
+        <w:gridCol w:w="5256"/>
       </w:tblGrid>
       <w:tr>
         <w:trPr>
           <w:tblHeader/>
           <w:jc w:val="center"/>
+          <w:cantSplit/>
         </w:trPr>
         <w:tc>
           <w:tcPr>
-            <w:tcW w:w="2520" w:type="dxa"/>
+            <w:tcW w:w="864" w:type="dxa"/>
             <w:vAlign w:val="center"/>
+            <w:shd w:fill="F1F1F1"/>
           </w:tcPr>
           <w:p>
+            <w:pPr>
+              <w:keepNext/>
+              <w:spacing w:before="0" w:after="0" w:line="252" w:lineRule="auto"/>
+              <w:jc w:val="left"/>
+            </w:pPr>
             <w:r>
               <w:rPr>
                 <w:b/>
+                <w:color w:val="000000"/>
+                <w:sz w:val="20"/>
               </w:rPr>
-              <w:t>Version</w:t>
+              <w:t>Ver</w:t>
             </w:r>
           </w:p>
         </w:tc>
         <w:tc>
           <w:tcPr>
-            <w:tcW w:w="2520" w:type="dxa"/>
+            <w:tcW w:w="1656" w:type="dxa"/>
             <w:vAlign w:val="center"/>
+            <w:shd w:fill="F1F1F1"/>
           </w:tcPr>
           <w:p>
+            <w:pPr>
+              <w:keepNext/>
+              <w:spacing w:before="0" w:after="0" w:line="252" w:lineRule="auto"/>
+              <w:jc w:val="left"/>
+            </w:pPr>
             <w:r>
               <w:rPr>
                 <w:b/>
+                <w:color w:val="000000"/>
+                <w:sz w:val="20"/>
               </w:rPr>
               <w:t>Date</w:t>
             </w:r>
@@ -135,13 +156,21 @@
         </w:tc>
         <w:tc>
           <w:tcPr>
-            <w:tcW w:w="2520" w:type="dxa"/>
+            <w:tcW w:w="2304" w:type="dxa"/>
             <w:vAlign w:val="center"/>
+            <w:shd w:fill="F1F1F1"/>
           </w:tcPr>
           <w:p>
+            <w:pPr>
+              <w:keepNext/>
+              <w:spacing w:before="0" w:after="0" w:line="252" w:lineRule="auto"/>
+              <w:jc w:val="left"/>
+            </w:pPr>
             <w:r>
               <w:rPr>
                 <w:b/>
+                <w:color w:val="000000"/>
+                <w:sz w:val="20"/>
               </w:rPr>
               <w:t>Author</w:t>
             </w:r>
@@ -149,13 +178,21 @@
         </w:tc>
         <w:tc>
           <w:tcPr>
-            <w:tcW w:w="2520" w:type="dxa"/>
+            <w:tcW w:w="5256" w:type="dxa"/>
             <w:vAlign w:val="center"/>
+            <w:shd w:fill="F1F1F1"/>
           </w:tcPr>
           <w:p>
+            <w:pPr>
+              <w:keepNext/>
+              <w:spacing w:before="0" w:after="0" w:line="252" w:lineRule="auto"/>
+              <w:jc w:val="left"/>
+            </w:pPr>
             <w:r>
               <w:rPr>
                 <w:b/>
+                <w:color w:val="000000"/>
+                <w:sz w:val="20"/>
               </w:rPr>
               <w:t>Change Summary</w:t>
             </w:r>
@@ -165,44 +202,170 @@
       <w:tr>
         <w:trPr>
           <w:jc w:val="center"/>
+          <w:cantSplit/>
         </w:trPr>
         <w:tc>
           <w:tcPr>
-            <w:tcW w:w="2520" w:type="dxa"/>
+            <w:tcW w:w="864" w:type="dxa"/>
+            <w:vAlign w:val="center"/>
           </w:tcPr>
           <w:p>
+            <w:pPr>
+              <w:keepNext w:val="0"/>
+              <w:spacing w:before="0" w:after="0" w:line="252" w:lineRule="auto"/>
+              <w:jc w:val="left"/>
+            </w:pPr>
             <w:r>
+              <w:rPr>
+                <w:color w:val="000000"/>
+                <w:sz w:val="20"/>
+              </w:rPr>
               <w:t>1.0</w:t>
             </w:r>
           </w:p>
         </w:tc>
         <w:tc>
           <w:tcPr>
-            <w:tcW w:w="2520" w:type="dxa"/>
+            <w:tcW w:w="1656" w:type="dxa"/>
+            <w:vAlign w:val="center"/>
           </w:tcPr>
           <w:p>
+            <w:pPr>
+              <w:keepNext w:val="0"/>
+              <w:spacing w:before="0" w:after="0" w:line="252" w:lineRule="auto"/>
+              <w:jc w:val="left"/>
+            </w:pPr>
             <w:r>
+              <w:rPr>
+                <w:color w:val="000000"/>
+                <w:sz w:val="20"/>
+              </w:rPr>
               <w:t>09 October 2026</w:t>
             </w:r>
           </w:p>
         </w:tc>
         <w:tc>
           <w:tcPr>
-            <w:tcW w:w="2520" w:type="dxa"/>
+            <w:tcW w:w="2304" w:type="dxa"/>
+            <w:vAlign w:val="center"/>
           </w:tcPr>
           <w:p>
+            <w:pPr>
+              <w:keepNext w:val="0"/>
+              <w:spacing w:before="0" w:after="0" w:line="252" w:lineRule="auto"/>
+              <w:jc w:val="left"/>
+            </w:pPr>
             <w:r>
-              <w:t>Tanusha, Manasvi, Gururaj</w:t>
+              <w:rPr>
+                <w:color w:val="000000"/>
+                <w:sz w:val="20"/>
+              </w:rPr>
+              <w:t>Tanusha, Manaswi, Vidimalla Guru Teja</w:t>
             </w:r>
           </w:p>
         </w:tc>
         <w:tc>
           <w:tcPr>
-            <w:tcW w:w="2520" w:type="dxa"/>
+            <w:tcW w:w="5256" w:type="dxa"/>
+            <w:vAlign w:val="center"/>
           </w:tcPr>
           <w:p>
+            <w:pPr>
+              <w:keepNext w:val="0"/>
+              <w:spacing w:before="0" w:after="0" w:line="252" w:lineRule="auto"/>
+              <w:jc w:val="left"/>
+            </w:pPr>
             <w:r>
+              <w:rPr>
+                <w:color w:val="000000"/>
+                <w:sz w:val="20"/>
+              </w:rPr>
               <w:t>Initial architecture and design baseline</w:t>
+            </w:r>
+          </w:p>
+        </w:tc>
+      </w:tr>
+      <w:tr>
+        <w:trPr>
+          <w:cantSplit/>
+        </w:trPr>
+        <w:tc>
+          <w:tcPr>
+            <w:tcW w:type="dxa" w:w="864"/>
+            <w:vAlign w:val="center"/>
+          </w:tcPr>
+          <w:p>
+            <w:pPr>
+              <w:keepNext w:val="0"/>
+              <w:spacing w:before="0" w:after="0" w:line="252" w:lineRule="auto"/>
+              <w:jc w:val="left"/>
+            </w:pPr>
+            <w:r>
+              <w:rPr>
+                <w:color w:val="000000"/>
+                <w:sz w:val="20"/>
+              </w:rPr>
+              <w:t>1.1</w:t>
+            </w:r>
+          </w:p>
+        </w:tc>
+        <w:tc>
+          <w:tcPr>
+            <w:tcW w:type="dxa" w:w="1656"/>
+            <w:vAlign w:val="center"/>
+          </w:tcPr>
+          <w:p>
+            <w:pPr>
+              <w:keepNext w:val="0"/>
+              <w:spacing w:before="0" w:after="0" w:line="252" w:lineRule="auto"/>
+              <w:jc w:val="left"/>
+            </w:pPr>
+            <w:r>
+              <w:rPr>
+                <w:color w:val="000000"/>
+                <w:sz w:val="20"/>
+              </w:rPr>
+              <w:t>19 October 2026</w:t>
+            </w:r>
+          </w:p>
+        </w:tc>
+        <w:tc>
+          <w:tcPr>
+            <w:tcW w:type="dxa" w:w="2304"/>
+            <w:vAlign w:val="center"/>
+          </w:tcPr>
+          <w:p>
+            <w:pPr>
+              <w:keepNext w:val="0"/>
+              <w:spacing w:before="0" w:after="0" w:line="252" w:lineRule="auto"/>
+              <w:jc w:val="left"/>
+            </w:pPr>
+            <w:r>
+              <w:rPr>
+                <w:color w:val="000000"/>
+                <w:sz w:val="20"/>
+              </w:rPr>
+              <w:t>Manaswi (Codex assisted)</w:t>
+            </w:r>
+          </w:p>
+        </w:tc>
+        <w:tc>
+          <w:tcPr>
+            <w:tcW w:type="dxa" w:w="5256"/>
+            <w:vAlign w:val="center"/>
+          </w:tcPr>
+          <w:p>
+            <w:pPr>
+              <w:keepNext w:val="0"/>
+              <w:spacing w:before="0" w:after="0" w:line="252" w:lineRule="auto"/>
+              <w:jc w:val="left"/>
+            </w:pPr>
+            <w:r>
+              <w:rPr>
+                <w:color w:val="000000"/>
+                <w:sz w:val="20"/>
+              </w:rPr>
+              <w:t>Align scope and permissions with #17/#19; correct team names</w:t>
             </w:r>
           </w:p>
         </w:tc>
@@ -213,6 +376,10 @@
         <w:pStyle w:val="Heading1"/>
       </w:pPr>
       <w:r>
+        <w:rPr>
+          <w:color w:val="000000"/>
+          <w:u w:val="none"/>
+        </w:rPr>
         <w:t>Approvals</w:t>
       </w:r>
     </w:p>
@@ -221,27 +388,51 @@
         <w:tblStyle w:val="TableGrid"/>
         <w:tblW w:w="0" w:type="auto"/>
         <w:jc w:val="center"/>
+        <w:tblLayout w:type="fixed"/>
         <w:tblLook w:val="04A0" w:firstRow="1" w:lastRow="0" w:firstColumn="1" w:lastColumn="0" w:noHBand="0" w:noVBand="1"/>
+        <w:tblBorders>
+          <w:top w:val="single" w:sz="4" w:color="D9D9D9"/>
+          <w:left w:val="single" w:sz="4" w:color="D9D9D9"/>
+          <w:bottom w:val="single" w:sz="4" w:color="D9D9D9"/>
+          <w:right w:val="single" w:sz="4" w:color="D9D9D9"/>
+          <w:insideH w:val="single" w:sz="4" w:color="D9D9D9"/>
+          <w:insideV w:val="single" w:sz="4" w:color="D9D9D9"/>
+        </w:tblBorders>
+        <w:tblCellMar>
+          <w:top w:w="70" w:type="dxa"/>
+          <w:bottom w:w="70" w:type="dxa"/>
+          <w:left w:w="70" w:type="dxa"/>
+          <w:right w:w="70" w:type="dxa"/>
+        </w:tblCellMar>
       </w:tblPr>
       <w:tblGrid>
-        <w:gridCol w:w="3360"/>
-        <w:gridCol w:w="3360"/>
-        <w:gridCol w:w="3360"/>
+        <w:gridCol w:w="3024"/>
+        <w:gridCol w:w="3312"/>
+        <w:gridCol w:w="3744"/>
       </w:tblGrid>
       <w:tr>
         <w:trPr>
           <w:tblHeader/>
           <w:jc w:val="center"/>
+          <w:cantSplit/>
         </w:trPr>
         <w:tc>
           <w:tcPr>
-            <w:tcW w:w="3360" w:type="dxa"/>
+            <w:tcW w:w="3024" w:type="dxa"/>
             <w:vAlign w:val="center"/>
+            <w:shd w:fill="F1F1F1"/>
           </w:tcPr>
           <w:p>
+            <w:pPr>
+              <w:keepNext/>
+              <w:spacing w:before="0" w:after="0" w:line="252" w:lineRule="auto"/>
+              <w:jc w:val="left"/>
+            </w:pPr>
             <w:r>
               <w:rPr>
                 <w:b/>
+                <w:color w:val="000000"/>
+                <w:sz w:val="20"/>
               </w:rPr>
               <w:t>Role</w:t>
             </w:r>
@@ -249,13 +440,21 @@
         </w:tc>
         <w:tc>
           <w:tcPr>
-            <w:tcW w:w="3360" w:type="dxa"/>
+            <w:tcW w:w="3312" w:type="dxa"/>
             <w:vAlign w:val="center"/>
+            <w:shd w:fill="F1F1F1"/>
           </w:tcPr>
           <w:p>
+            <w:pPr>
+              <w:keepNext/>
+              <w:spacing w:before="0" w:after="0" w:line="252" w:lineRule="auto"/>
+              <w:jc w:val="left"/>
+            </w:pPr>
             <w:r>
               <w:rPr>
                 <w:b/>
+                <w:color w:val="000000"/>
+                <w:sz w:val="20"/>
               </w:rPr>
               <w:t>Name</w:t>
             </w:r>
@@ -263,13 +462,21 @@
         </w:tc>
         <w:tc>
           <w:tcPr>
-            <w:tcW w:w="3360" w:type="dxa"/>
+            <w:tcW w:w="3744" w:type="dxa"/>
             <w:vAlign w:val="center"/>
+            <w:shd w:fill="F1F1F1"/>
           </w:tcPr>
           <w:p>
+            <w:pPr>
+              <w:keepNext/>
+              <w:spacing w:before="0" w:after="0" w:line="252" w:lineRule="auto"/>
+              <w:jc w:val="left"/>
+            </w:pPr>
             <w:r>
               <w:rPr>
                 <w:b/>
+                <w:color w:val="000000"/>
+                <w:sz w:val="20"/>
               </w:rPr>
               <w:t>Signature / Date</w:t>
             </w:r>
@@ -279,55 +486,105 @@
       <w:tr>
         <w:trPr>
           <w:jc w:val="center"/>
+          <w:cantSplit/>
         </w:trPr>
         <w:tc>
           <w:tcPr>
-            <w:tcW w:w="3360" w:type="dxa"/>
+            <w:tcW w:w="3024" w:type="dxa"/>
+            <w:vAlign w:val="center"/>
           </w:tcPr>
           <w:p>
+            <w:pPr>
+              <w:keepNext w:val="0"/>
+              <w:spacing w:before="0" w:after="0" w:line="252" w:lineRule="auto"/>
+              <w:jc w:val="left"/>
+            </w:pPr>
             <w:r>
+              <w:rPr>
+                <w:color w:val="000000"/>
+                <w:sz w:val="20"/>
+              </w:rPr>
               <w:t>Team Reviewer</w:t>
             </w:r>
           </w:p>
         </w:tc>
         <w:tc>
           <w:tcPr>
-            <w:tcW w:w="3360" w:type="dxa"/>
+            <w:tcW w:w="3312" w:type="dxa"/>
+            <w:vAlign w:val="center"/>
           </w:tcPr>
-          <w:p/>
+          <w:p>
+            <w:pPr>
+              <w:keepNext w:val="0"/>
+              <w:spacing w:before="0" w:after="0" w:line="252" w:lineRule="auto"/>
+              <w:jc w:val="left"/>
+            </w:pPr>
+          </w:p>
         </w:tc>
         <w:tc>
           <w:tcPr>
-            <w:tcW w:w="3360" w:type="dxa"/>
+            <w:tcW w:w="3744" w:type="dxa"/>
+            <w:vAlign w:val="center"/>
           </w:tcPr>
-          <w:p/>
+          <w:p>
+            <w:pPr>
+              <w:keepNext w:val="0"/>
+              <w:spacing w:before="0" w:after="0" w:line="252" w:lineRule="auto"/>
+              <w:jc w:val="left"/>
+            </w:pPr>
+          </w:p>
         </w:tc>
       </w:tr>
       <w:tr>
         <w:trPr>
           <w:jc w:val="center"/>
+          <w:cantSplit/>
         </w:trPr>
         <w:tc>
           <w:tcPr>
-            <w:tcW w:w="3360" w:type="dxa"/>
+            <w:tcW w:w="3024" w:type="dxa"/>
+            <w:vAlign w:val="center"/>
           </w:tcPr>
           <w:p>
+            <w:pPr>
+              <w:keepNext w:val="0"/>
+              <w:spacing w:before="0" w:after="0" w:line="252" w:lineRule="auto"/>
+              <w:jc w:val="left"/>
+            </w:pPr>
             <w:r>
+              <w:rPr>
+                <w:color w:val="000000"/>
+                <w:sz w:val="20"/>
+              </w:rPr>
               <w:t>Course Evaluator</w:t>
             </w:r>
           </w:p>
         </w:tc>
         <w:tc>
           <w:tcPr>
-            <w:tcW w:w="3360" w:type="dxa"/>
+            <w:tcW w:w="3312" w:type="dxa"/>
+            <w:vAlign w:val="center"/>
           </w:tcPr>
-          <w:p/>
+          <w:p>
+            <w:pPr>
+              <w:keepNext w:val="0"/>
+              <w:spacing w:before="0" w:after="0" w:line="252" w:lineRule="auto"/>
+              <w:jc w:val="left"/>
+            </w:pPr>
+          </w:p>
         </w:tc>
         <w:tc>
           <w:tcPr>
-            <w:tcW w:w="3360" w:type="dxa"/>
+            <w:tcW w:w="3744" w:type="dxa"/>
+            <w:vAlign w:val="center"/>
           </w:tcPr>
-          <w:p/>
+          <w:p>
+            <w:pPr>
+              <w:keepNext w:val="0"/>
+              <w:spacing w:before="0" w:after="0" w:line="252" w:lineRule="auto"/>
+              <w:jc w:val="left"/>
+            </w:pPr>
+          </w:p>
         </w:tc>
       </w:tr>
     </w:tbl>
@@ -336,6 +593,10 @@
         <w:pStyle w:val="Heading1"/>
       </w:pPr>
       <w:r>
+        <w:rPr>
+          <w:color w:val="000000"/>
+          <w:u w:val="none"/>
+        </w:rPr>
         <w:t>1. Introduction</w:t>
       </w:r>
     </w:p>
@@ -344,6 +605,10 @@
         <w:pStyle w:val="Heading2"/>
       </w:pPr>
       <w:r>
+        <w:rPr>
+          <w:color w:val="000000"/>
+          <w:u w:val="none"/>
+        </w:rPr>
         <w:t>1.1 Purpose</w:t>
       </w:r>
     </w:p>
@@ -357,6 +622,10 @@
         <w:pStyle w:val="Heading2"/>
       </w:pPr>
       <w:r>
+        <w:rPr>
+          <w:color w:val="000000"/>
+          <w:u w:val="none"/>
+        </w:rPr>
         <w:t>1.2 Scope</w:t>
       </w:r>
     </w:p>
@@ -370,6 +639,10 @@
         <w:pStyle w:val="Heading2"/>
       </w:pPr>
       <w:r>
+        <w:rPr>
+          <w:color w:val="000000"/>
+          <w:u w:val="none"/>
+        </w:rPr>
         <w:t>1.3 Audience</w:t>
       </w:r>
     </w:p>
@@ -383,6 +656,10 @@
         <w:pStyle w:val="Heading2"/>
       </w:pPr>
       <w:r>
+        <w:rPr>
+          <w:color w:val="000000"/>
+          <w:u w:val="none"/>
+        </w:rPr>
         <w:t>1.4 Definitions</w:t>
       </w:r>
     </w:p>
@@ -396,6 +673,10 @@
         <w:pStyle w:val="Heading1"/>
       </w:pPr>
       <w:r>
+        <w:rPr>
+          <w:color w:val="000000"/>
+          <w:u w:val="none"/>
+        </w:rPr>
         <w:t>2. Document Overview</w:t>
       </w:r>
     </w:p>
@@ -404,6 +685,10 @@
         <w:pStyle w:val="Heading2"/>
       </w:pPr>
       <w:r>
+        <w:rPr>
+          <w:color w:val="000000"/>
+          <w:u w:val="none"/>
+        </w:rPr>
         <w:t>2.1 How to Use This Document</w:t>
       </w:r>
     </w:p>
@@ -417,6 +702,10 @@
         <w:pStyle w:val="Heading2"/>
       </w:pPr>
       <w:r>
+        <w:rPr>
+          <w:color w:val="000000"/>
+          <w:u w:val="none"/>
+        </w:rPr>
         <w:lastRenderedPageBreak/>
         <w:t>2.2 Related Documents</w:t>
       </w:r>
@@ -427,10 +716,19 @@
       </w:r>
     </w:p>
     <w:p>
+      <w:r>
+        <w:t>The scope crosswalk, shared permission matrix and planned authorization cases are in docs/RELEASE_1_AGREEMENT.md (#17/#19), pending team review. Current GitHub #23/#24/#51 use that same role/ownership baseline.</w:t>
+      </w:r>
+    </w:p>
+    <w:p>
       <w:pPr>
         <w:pStyle w:val="Heading1"/>
       </w:pPr>
       <w:r>
+        <w:rPr>
+          <w:color w:val="000000"/>
+          <w:u w:val="none"/>
+        </w:rPr>
         <w:t>3. Architecture</w:t>
       </w:r>
     </w:p>
@@ -439,6 +737,10 @@
         <w:pStyle w:val="Heading2"/>
       </w:pPr>
       <w:r>
+        <w:rPr>
+          <w:color w:val="000000"/>
+          <w:u w:val="none"/>
+        </w:rPr>
         <w:t>3.1 Goals &amp; Constraints</w:t>
       </w:r>
     </w:p>
@@ -471,6 +773,10 @@
         <w:pStyle w:val="Heading2"/>
       </w:pPr>
       <w:r>
+        <w:rPr>
+          <w:color w:val="000000"/>
+          <w:u w:val="none"/>
+        </w:rPr>
         <w:t>3.2 Stakeholders &amp; Concerns</w:t>
       </w:r>
     </w:p>
@@ -479,26 +785,50 @@
         <w:tblStyle w:val="TableGrid"/>
         <w:tblW w:w="0" w:type="auto"/>
         <w:jc w:val="center"/>
+        <w:tblLayout w:type="fixed"/>
         <w:tblLook w:val="04A0" w:firstRow="1" w:lastRow="0" w:firstColumn="1" w:lastColumn="0" w:noHBand="0" w:noVBand="1"/>
+        <w:tblBorders>
+          <w:top w:val="single" w:sz="4" w:color="D9D9D9"/>
+          <w:left w:val="single" w:sz="4" w:color="D9D9D9"/>
+          <w:bottom w:val="single" w:sz="4" w:color="D9D9D9"/>
+          <w:right w:val="single" w:sz="4" w:color="D9D9D9"/>
+          <w:insideH w:val="single" w:sz="4" w:color="D9D9D9"/>
+          <w:insideV w:val="single" w:sz="4" w:color="D9D9D9"/>
+        </w:tblBorders>
+        <w:tblCellMar>
+          <w:top w:w="70" w:type="dxa"/>
+          <w:bottom w:w="70" w:type="dxa"/>
+          <w:left w:w="70" w:type="dxa"/>
+          <w:right w:w="70" w:type="dxa"/>
+        </w:tblCellMar>
       </w:tblPr>
       <w:tblGrid>
-        <w:gridCol w:w="5040"/>
-        <w:gridCol w:w="5040"/>
+        <w:gridCol w:w="2448"/>
+        <w:gridCol w:w="7632"/>
       </w:tblGrid>
       <w:tr>
         <w:trPr>
           <w:tblHeader/>
           <w:jc w:val="center"/>
+          <w:cantSplit/>
         </w:trPr>
         <w:tc>
           <w:tcPr>
-            <w:tcW w:w="5040" w:type="dxa"/>
+            <w:tcW w:w="2448" w:type="dxa"/>
             <w:vAlign w:val="center"/>
+            <w:shd w:fill="F1F1F1"/>
           </w:tcPr>
           <w:p>
+            <w:pPr>
+              <w:keepNext/>
+              <w:spacing w:before="0" w:after="0" w:line="252" w:lineRule="auto"/>
+              <w:jc w:val="left"/>
+            </w:pPr>
             <w:r>
               <w:rPr>
                 <w:b/>
+                <w:color w:val="000000"/>
+                <w:sz w:val="20"/>
               </w:rPr>
               <w:t>Stakeholder</w:t>
             </w:r>
@@ -506,13 +836,21 @@
         </w:tc>
         <w:tc>
           <w:tcPr>
-            <w:tcW w:w="5040" w:type="dxa"/>
+            <w:tcW w:w="7632" w:type="dxa"/>
             <w:vAlign w:val="center"/>
+            <w:shd w:fill="F1F1F1"/>
           </w:tcPr>
           <w:p>
+            <w:pPr>
+              <w:keepNext/>
+              <w:spacing w:before="0" w:after="0" w:line="252" w:lineRule="auto"/>
+              <w:jc w:val="left"/>
+            </w:pPr>
             <w:r>
               <w:rPr>
                 <w:b/>
+                <w:color w:val="000000"/>
+                <w:sz w:val="20"/>
               </w:rPr>
               <w:t>Primary Concerns</w:t>
             </w:r>
@@ -522,23 +860,44 @@
       <w:tr>
         <w:trPr>
           <w:jc w:val="center"/>
+          <w:cantSplit/>
         </w:trPr>
         <w:tc>
           <w:tcPr>
-            <w:tcW w:w="5040" w:type="dxa"/>
+            <w:tcW w:w="2448" w:type="dxa"/>
+            <w:vAlign w:val="center"/>
           </w:tcPr>
           <w:p>
+            <w:pPr>
+              <w:keepNext w:val="0"/>
+              <w:spacing w:before="0" w:after="0" w:line="252" w:lineRule="auto"/>
+              <w:jc w:val="left"/>
+            </w:pPr>
             <w:r>
+              <w:rPr>
+                <w:color w:val="000000"/>
+                <w:sz w:val="20"/>
+              </w:rPr>
               <w:t>Student</w:t>
             </w:r>
           </w:p>
         </w:tc>
         <w:tc>
           <w:tcPr>
-            <w:tcW w:w="5040" w:type="dxa"/>
+            <w:tcW w:w="7632" w:type="dxa"/>
+            <w:vAlign w:val="center"/>
           </w:tcPr>
           <w:p>
+            <w:pPr>
+              <w:keepNext w:val="0"/>
+              <w:spacing w:before="0" w:after="0" w:line="252" w:lineRule="auto"/>
+              <w:jc w:val="left"/>
+            </w:pPr>
             <w:r>
+              <w:rPr>
+                <w:color w:val="000000"/>
+                <w:sz w:val="20"/>
+              </w:rPr>
               <w:t>Reliable timed attempt, saved responses, privacy of own result</w:t>
             </w:r>
           </w:p>
@@ -547,23 +906,44 @@
       <w:tr>
         <w:trPr>
           <w:jc w:val="center"/>
+          <w:cantSplit/>
         </w:trPr>
         <w:tc>
           <w:tcPr>
-            <w:tcW w:w="5040" w:type="dxa"/>
+            <w:tcW w:w="2448" w:type="dxa"/>
+            <w:vAlign w:val="center"/>
           </w:tcPr>
           <w:p>
+            <w:pPr>
+              <w:keepNext w:val="0"/>
+              <w:spacing w:before="0" w:after="0" w:line="252" w:lineRule="auto"/>
+              <w:jc w:val="left"/>
+            </w:pPr>
             <w:r>
+              <w:rPr>
+                <w:color w:val="000000"/>
+                <w:sz w:val="20"/>
+              </w:rPr>
               <w:t>Instructor</w:t>
             </w:r>
           </w:p>
         </w:tc>
         <w:tc>
           <w:tcPr>
-            <w:tcW w:w="5040" w:type="dxa"/>
+            <w:tcW w:w="7632" w:type="dxa"/>
+            <w:vAlign w:val="center"/>
           </w:tcPr>
           <w:p>
+            <w:pPr>
+              <w:keepNext w:val="0"/>
+              <w:spacing w:before="0" w:after="0" w:line="252" w:lineRule="auto"/>
+              <w:jc w:val="left"/>
+            </w:pPr>
             <w:r>
+              <w:rPr>
+                <w:color w:val="000000"/>
+                <w:sz w:val="20"/>
+              </w:rPr>
               <w:t>Simple exam/question management, ownership protection, correct results</w:t>
             </w:r>
           </w:p>
@@ -572,23 +952,44 @@
       <w:tr>
         <w:trPr>
           <w:jc w:val="center"/>
+          <w:cantSplit/>
         </w:trPr>
         <w:tc>
           <w:tcPr>
-            <w:tcW w:w="5040" w:type="dxa"/>
+            <w:tcW w:w="2448" w:type="dxa"/>
+            <w:vAlign w:val="center"/>
           </w:tcPr>
           <w:p>
+            <w:pPr>
+              <w:keepNext w:val="0"/>
+              <w:spacing w:before="0" w:after="0" w:line="252" w:lineRule="auto"/>
+              <w:jc w:val="left"/>
+            </w:pPr>
             <w:r>
+              <w:rPr>
+                <w:color w:val="000000"/>
+                <w:sz w:val="20"/>
+              </w:rPr>
               <w:t>Admin</w:t>
             </w:r>
           </w:p>
         </w:tc>
         <w:tc>
           <w:tcPr>
-            <w:tcW w:w="5040" w:type="dxa"/>
+            <w:tcW w:w="7632" w:type="dxa"/>
+            <w:vAlign w:val="center"/>
           </w:tcPr>
           <w:p>
+            <w:pPr>
+              <w:keepNext w:val="0"/>
+              <w:spacing w:before="0" w:after="0" w:line="252" w:lineRule="auto"/>
+              <w:jc w:val="left"/>
+            </w:pPr>
             <w:r>
+              <w:rPr>
+                <w:color w:val="000000"/>
+                <w:sz w:val="20"/>
+              </w:rPr>
               <w:t>Controlled user/role management</w:t>
             </w:r>
           </w:p>
@@ -597,23 +998,44 @@
       <w:tr>
         <w:trPr>
           <w:jc w:val="center"/>
+          <w:cantSplit/>
         </w:trPr>
         <w:tc>
           <w:tcPr>
-            <w:tcW w:w="5040" w:type="dxa"/>
+            <w:tcW w:w="2448" w:type="dxa"/>
+            <w:vAlign w:val="center"/>
           </w:tcPr>
           <w:p>
+            <w:pPr>
+              <w:keepNext w:val="0"/>
+              <w:spacing w:before="0" w:after="0" w:line="252" w:lineRule="auto"/>
+              <w:jc w:val="left"/>
+            </w:pPr>
             <w:r>
+              <w:rPr>
+                <w:color w:val="000000"/>
+                <w:sz w:val="20"/>
+              </w:rPr>
               <w:t>Developers/Testers</w:t>
             </w:r>
           </w:p>
         </w:tc>
         <w:tc>
           <w:tcPr>
-            <w:tcW w:w="5040" w:type="dxa"/>
+            <w:tcW w:w="7632" w:type="dxa"/>
+            <w:vAlign w:val="center"/>
           </w:tcPr>
           <w:p>
+            <w:pPr>
+              <w:keepNext w:val="0"/>
+              <w:spacing w:before="0" w:after="0" w:line="252" w:lineRule="auto"/>
+              <w:jc w:val="left"/>
+            </w:pPr>
             <w:r>
+              <w:rPr>
+                <w:color w:val="000000"/>
+                <w:sz w:val="20"/>
+              </w:rPr>
               <w:t>Modularity, traceability, testability and maintainability</w:t>
             </w:r>
           </w:p>
@@ -622,23 +1044,44 @@
       <w:tr>
         <w:trPr>
           <w:jc w:val="center"/>
+          <w:cantSplit/>
         </w:trPr>
         <w:tc>
           <w:tcPr>
-            <w:tcW w:w="5040" w:type="dxa"/>
+            <w:tcW w:w="2448" w:type="dxa"/>
+            <w:vAlign w:val="center"/>
           </w:tcPr>
           <w:p>
+            <w:pPr>
+              <w:keepNext w:val="0"/>
+              <w:spacing w:before="0" w:after="0" w:line="252" w:lineRule="auto"/>
+              <w:jc w:val="left"/>
+            </w:pPr>
             <w:r>
+              <w:rPr>
+                <w:color w:val="000000"/>
+                <w:sz w:val="20"/>
+              </w:rPr>
               <w:t>Faculty Evaluator</w:t>
             </w:r>
           </w:p>
         </w:tc>
         <w:tc>
           <w:tcPr>
-            <w:tcW w:w="5040" w:type="dxa"/>
+            <w:tcW w:w="7632" w:type="dxa"/>
+            <w:vAlign w:val="center"/>
           </w:tcPr>
           <w:p>
+            <w:pPr>
+              <w:keepNext w:val="0"/>
+              <w:spacing w:before="0" w:after="0" w:line="252" w:lineRule="auto"/>
+              <w:jc w:val="left"/>
+            </w:pPr>
             <w:r>
+              <w:rPr>
+                <w:color w:val="000000"/>
+                <w:sz w:val="20"/>
+              </w:rPr>
               <w:t>Conformance to SRS/SAD/STP and demonstrable Agile increments</w:t>
             </w:r>
           </w:p>
@@ -650,6 +1093,10 @@
         <w:pStyle w:val="Heading2"/>
       </w:pPr>
       <w:r>
+        <w:rPr>
+          <w:color w:val="000000"/>
+          <w:u w:val="none"/>
+        </w:rPr>
         <w:t>3.3 Component (UML) Diagram</w:t>
       </w:r>
     </w:p>
@@ -714,6 +1161,10 @@
         <w:pStyle w:val="Heading2"/>
       </w:pPr>
       <w:r>
+        <w:rPr>
+          <w:color w:val="000000"/>
+          <w:u w:val="none"/>
+        </w:rPr>
         <w:t>3.4 Component Descriptions</w:t>
       </w:r>
     </w:p>
@@ -722,26 +1173,50 @@
         <w:tblStyle w:val="TableGrid"/>
         <w:tblW w:w="0" w:type="auto"/>
         <w:jc w:val="center"/>
+        <w:tblLayout w:type="fixed"/>
         <w:tblLook w:val="04A0" w:firstRow="1" w:lastRow="0" w:firstColumn="1" w:lastColumn="0" w:noHBand="0" w:noVBand="1"/>
+        <w:tblBorders>
+          <w:top w:val="single" w:sz="4" w:color="D9D9D9"/>
+          <w:left w:val="single" w:sz="4" w:color="D9D9D9"/>
+          <w:bottom w:val="single" w:sz="4" w:color="D9D9D9"/>
+          <w:right w:val="single" w:sz="4" w:color="D9D9D9"/>
+          <w:insideH w:val="single" w:sz="4" w:color="D9D9D9"/>
+          <w:insideV w:val="single" w:sz="4" w:color="D9D9D9"/>
+        </w:tblBorders>
+        <w:tblCellMar>
+          <w:top w:w="70" w:type="dxa"/>
+          <w:bottom w:w="70" w:type="dxa"/>
+          <w:left w:w="70" w:type="dxa"/>
+          <w:right w:w="70" w:type="dxa"/>
+        </w:tblCellMar>
       </w:tblPr>
       <w:tblGrid>
-        <w:gridCol w:w="5040"/>
-        <w:gridCol w:w="5040"/>
+        <w:gridCol w:w="2592"/>
+        <w:gridCol w:w="7488"/>
       </w:tblGrid>
       <w:tr>
         <w:trPr>
           <w:tblHeader/>
           <w:jc w:val="center"/>
+          <w:cantSplit/>
         </w:trPr>
         <w:tc>
           <w:tcPr>
-            <w:tcW w:w="5040" w:type="dxa"/>
+            <w:tcW w:w="2592" w:type="dxa"/>
             <w:vAlign w:val="center"/>
+            <w:shd w:fill="F1F1F1"/>
           </w:tcPr>
           <w:p>
+            <w:pPr>
+              <w:keepNext/>
+              <w:spacing w:before="0" w:after="0" w:line="252" w:lineRule="auto"/>
+              <w:jc w:val="left"/>
+            </w:pPr>
             <w:r>
               <w:rPr>
                 <w:b/>
+                <w:color w:val="000000"/>
+                <w:sz w:val="20"/>
               </w:rPr>
               <w:t>Component</w:t>
             </w:r>
@@ -749,13 +1224,21 @@
         </w:tc>
         <w:tc>
           <w:tcPr>
-            <w:tcW w:w="5040" w:type="dxa"/>
+            <w:tcW w:w="7488" w:type="dxa"/>
             <w:vAlign w:val="center"/>
+            <w:shd w:fill="F1F1F1"/>
           </w:tcPr>
           <w:p>
+            <w:pPr>
+              <w:keepNext/>
+              <w:spacing w:before="0" w:after="0" w:line="252" w:lineRule="auto"/>
+              <w:jc w:val="left"/>
+            </w:pPr>
             <w:r>
               <w:rPr>
                 <w:b/>
+                <w:color w:val="000000"/>
+                <w:sz w:val="20"/>
               </w:rPr>
               <w:t>Responsibilities</w:t>
             </w:r>
@@ -765,23 +1248,44 @@
       <w:tr>
         <w:trPr>
           <w:jc w:val="center"/>
+          <w:cantSplit/>
         </w:trPr>
         <w:tc>
           <w:tcPr>
-            <w:tcW w:w="5040" w:type="dxa"/>
+            <w:tcW w:w="2592" w:type="dxa"/>
+            <w:vAlign w:val="center"/>
           </w:tcPr>
           <w:p>
+            <w:pPr>
+              <w:keepNext w:val="0"/>
+              <w:spacing w:before="0" w:after="0" w:line="252" w:lineRule="auto"/>
+              <w:jc w:val="left"/>
+            </w:pPr>
             <w:r>
+              <w:rPr>
+                <w:color w:val="000000"/>
+                <w:sz w:val="20"/>
+              </w:rPr>
               <w:t>React Client</w:t>
             </w:r>
           </w:p>
         </w:tc>
         <w:tc>
           <w:tcPr>
-            <w:tcW w:w="5040" w:type="dxa"/>
+            <w:tcW w:w="7488" w:type="dxa"/>
+            <w:vAlign w:val="center"/>
           </w:tcPr>
           <w:p>
+            <w:pPr>
+              <w:keepNext w:val="0"/>
+              <w:spacing w:before="0" w:after="0" w:line="252" w:lineRule="auto"/>
+              <w:jc w:val="left"/>
+            </w:pPr>
             <w:r>
+              <w:rPr>
+                <w:color w:val="000000"/>
+                <w:sz w:val="20"/>
+              </w:rPr>
               <w:t>Role-specific UI, forms, navigation, timer display and REST API calls.</w:t>
             </w:r>
           </w:p>
@@ -790,23 +1294,44 @@
       <w:tr>
         <w:trPr>
           <w:jc w:val="center"/>
+          <w:cantSplit/>
         </w:trPr>
         <w:tc>
           <w:tcPr>
-            <w:tcW w:w="5040" w:type="dxa"/>
+            <w:tcW w:w="2592" w:type="dxa"/>
+            <w:vAlign w:val="center"/>
           </w:tcPr>
           <w:p>
+            <w:pPr>
+              <w:keepNext w:val="0"/>
+              <w:spacing w:before="0" w:after="0" w:line="252" w:lineRule="auto"/>
+              <w:jc w:val="left"/>
+            </w:pPr>
             <w:r>
+              <w:rPr>
+                <w:color w:val="000000"/>
+                <w:sz w:val="20"/>
+              </w:rPr>
               <w:t>Express API</w:t>
             </w:r>
           </w:p>
         </w:tc>
         <w:tc>
           <w:tcPr>
-            <w:tcW w:w="5040" w:type="dxa"/>
+            <w:tcW w:w="7488" w:type="dxa"/>
+            <w:vAlign w:val="center"/>
           </w:tcPr>
           <w:p>
+            <w:pPr>
+              <w:keepNext w:val="0"/>
+              <w:spacing w:before="0" w:after="0" w:line="252" w:lineRule="auto"/>
+              <w:jc w:val="left"/>
+            </w:pPr>
             <w:r>
+              <w:rPr>
+                <w:color w:val="000000"/>
+                <w:sz w:val="20"/>
+              </w:rPr>
               <w:t>HTTP routing, validation, orchestration and standardized responses.</w:t>
             </w:r>
           </w:p>
@@ -815,23 +1340,44 @@
       <w:tr>
         <w:trPr>
           <w:jc w:val="center"/>
+          <w:cantSplit/>
         </w:trPr>
         <w:tc>
           <w:tcPr>
-            <w:tcW w:w="5040" w:type="dxa"/>
+            <w:tcW w:w="2592" w:type="dxa"/>
+            <w:vAlign w:val="center"/>
           </w:tcPr>
           <w:p>
+            <w:pPr>
+              <w:keepNext w:val="0"/>
+              <w:spacing w:before="0" w:after="0" w:line="252" w:lineRule="auto"/>
+              <w:jc w:val="left"/>
+            </w:pPr>
             <w:r>
+              <w:rPr>
+                <w:color w:val="000000"/>
+                <w:sz w:val="20"/>
+              </w:rPr>
               <w:t>Auth &amp; RBAC Middleware</w:t>
             </w:r>
           </w:p>
         </w:tc>
         <w:tc>
           <w:tcPr>
-            <w:tcW w:w="5040" w:type="dxa"/>
+            <w:tcW w:w="7488" w:type="dxa"/>
+            <w:vAlign w:val="center"/>
           </w:tcPr>
           <w:p>
+            <w:pPr>
+              <w:keepNext w:val="0"/>
+              <w:spacing w:before="0" w:after="0" w:line="252" w:lineRule="auto"/>
+              <w:jc w:val="left"/>
+            </w:pPr>
             <w:r>
+              <w:rPr>
+                <w:color w:val="000000"/>
+                <w:sz w:val="20"/>
+              </w:rPr>
               <w:t>Authentication checks, role checks and ownership enforcement.</w:t>
             </w:r>
           </w:p>
@@ -840,23 +1386,44 @@
       <w:tr>
         <w:trPr>
           <w:jc w:val="center"/>
+          <w:cantSplit/>
         </w:trPr>
         <w:tc>
           <w:tcPr>
-            <w:tcW w:w="5040" w:type="dxa"/>
+            <w:tcW w:w="2592" w:type="dxa"/>
+            <w:vAlign w:val="center"/>
           </w:tcPr>
           <w:p>
+            <w:pPr>
+              <w:keepNext w:val="0"/>
+              <w:spacing w:before="0" w:after="0" w:line="252" w:lineRule="auto"/>
+              <w:jc w:val="left"/>
+            </w:pPr>
             <w:r>
+              <w:rPr>
+                <w:color w:val="000000"/>
+                <w:sz w:val="20"/>
+              </w:rPr>
               <w:t>Exam / Question Module</w:t>
             </w:r>
           </w:p>
         </w:tc>
         <w:tc>
           <w:tcPr>
-            <w:tcW w:w="5040" w:type="dxa"/>
+            <w:tcW w:w="7488" w:type="dxa"/>
+            <w:vAlign w:val="center"/>
           </w:tcPr>
           <w:p>
+            <w:pPr>
+              <w:keepNext w:val="0"/>
+              <w:spacing w:before="0" w:after="0" w:line="252" w:lineRule="auto"/>
+              <w:jc w:val="left"/>
+            </w:pPr>
             <w:r>
+              <w:rPr>
+                <w:color w:val="000000"/>
+                <w:sz w:val="20"/>
+              </w:rPr>
               <w:t>Draft exam CRUD, question/option management, publication validation.</w:t>
             </w:r>
           </w:p>
@@ -865,23 +1432,44 @@
       <w:tr>
         <w:trPr>
           <w:jc w:val="center"/>
+          <w:cantSplit/>
         </w:trPr>
         <w:tc>
           <w:tcPr>
-            <w:tcW w:w="5040" w:type="dxa"/>
+            <w:tcW w:w="2592" w:type="dxa"/>
+            <w:vAlign w:val="center"/>
           </w:tcPr>
           <w:p>
+            <w:pPr>
+              <w:keepNext w:val="0"/>
+              <w:spacing w:before="0" w:after="0" w:line="252" w:lineRule="auto"/>
+              <w:jc w:val="left"/>
+            </w:pPr>
             <w:r>
+              <w:rPr>
+                <w:color w:val="000000"/>
+                <w:sz w:val="20"/>
+              </w:rPr>
               <w:t>Attempt Module</w:t>
             </w:r>
           </w:p>
         </w:tc>
         <w:tc>
           <w:tcPr>
-            <w:tcW w:w="5040" w:type="dxa"/>
+            <w:tcW w:w="7488" w:type="dxa"/>
+            <w:vAlign w:val="center"/>
           </w:tcPr>
           <w:p>
+            <w:pPr>
+              <w:keepNext w:val="0"/>
+              <w:spacing w:before="0" w:after="0" w:line="252" w:lineRule="auto"/>
+              <w:jc w:val="left"/>
+            </w:pPr>
             <w:r>
+              <w:rPr>
+                <w:color w:val="000000"/>
+                <w:sz w:val="20"/>
+              </w:rPr>
               <w:t>Attempt creation, response persistence, timing and submission state.</w:t>
             </w:r>
           </w:p>
@@ -890,23 +1478,44 @@
       <w:tr>
         <w:trPr>
           <w:jc w:val="center"/>
+          <w:cantSplit/>
         </w:trPr>
         <w:tc>
           <w:tcPr>
-            <w:tcW w:w="5040" w:type="dxa"/>
+            <w:tcW w:w="2592" w:type="dxa"/>
+            <w:vAlign w:val="center"/>
           </w:tcPr>
           <w:p>
+            <w:pPr>
+              <w:keepNext w:val="0"/>
+              <w:spacing w:before="0" w:after="0" w:line="252" w:lineRule="auto"/>
+              <w:jc w:val="left"/>
+            </w:pPr>
             <w:r>
+              <w:rPr>
+                <w:color w:val="000000"/>
+                <w:sz w:val="20"/>
+              </w:rPr>
               <w:t>Evaluation / Results Module</w:t>
             </w:r>
           </w:p>
         </w:tc>
         <w:tc>
           <w:tcPr>
-            <w:tcW w:w="5040" w:type="dxa"/>
+            <w:tcW w:w="7488" w:type="dxa"/>
+            <w:vAlign w:val="center"/>
           </w:tcPr>
           <w:p>
+            <w:pPr>
+              <w:keepNext w:val="0"/>
+              <w:spacing w:before="0" w:after="0" w:line="252" w:lineRule="auto"/>
+              <w:jc w:val="left"/>
+            </w:pPr>
             <w:r>
+              <w:rPr>
+                <w:color w:val="000000"/>
+                <w:sz w:val="20"/>
+              </w:rPr>
               <w:t>Score calculation, result persistence and authorized result retrieval.</w:t>
             </w:r>
           </w:p>
@@ -915,23 +1524,44 @@
       <w:tr>
         <w:trPr>
           <w:jc w:val="center"/>
+          <w:cantSplit/>
         </w:trPr>
         <w:tc>
           <w:tcPr>
-            <w:tcW w:w="5040" w:type="dxa"/>
+            <w:tcW w:w="2592" w:type="dxa"/>
+            <w:vAlign w:val="center"/>
           </w:tcPr>
           <w:p>
+            <w:pPr>
+              <w:keepNext w:val="0"/>
+              <w:spacing w:before="0" w:after="0" w:line="252" w:lineRule="auto"/>
+              <w:jc w:val="left"/>
+            </w:pPr>
             <w:r>
+              <w:rPr>
+                <w:color w:val="000000"/>
+                <w:sz w:val="20"/>
+              </w:rPr>
               <w:t>Mongoose ODM</w:t>
             </w:r>
           </w:p>
         </w:tc>
         <w:tc>
           <w:tcPr>
-            <w:tcW w:w="5040" w:type="dxa"/>
+            <w:tcW w:w="7488" w:type="dxa"/>
+            <w:vAlign w:val="center"/>
           </w:tcPr>
           <w:p>
+            <w:pPr>
+              <w:keepNext w:val="0"/>
+              <w:spacing w:before="0" w:after="0" w:line="252" w:lineRule="auto"/>
+              <w:jc w:val="left"/>
+            </w:pPr>
             <w:r>
+              <w:rPr>
+                <w:color w:val="000000"/>
+                <w:sz w:val="20"/>
+              </w:rPr>
               <w:t>Schema/model definitions and persistence abstraction.</w:t>
             </w:r>
           </w:p>
@@ -940,13 +1570,24 @@
       <w:tr>
         <w:trPr>
           <w:jc w:val="center"/>
+          <w:cantSplit/>
         </w:trPr>
         <w:tc>
           <w:tcPr>
-            <w:tcW w:w="5040" w:type="dxa"/>
+            <w:tcW w:w="2592" w:type="dxa"/>
+            <w:vAlign w:val="center"/>
           </w:tcPr>
           <w:p>
+            <w:pPr>
+              <w:keepNext w:val="0"/>
+              <w:spacing w:before="0" w:after="0" w:line="252" w:lineRule="auto"/>
+              <w:jc w:val="left"/>
+            </w:pPr>
             <w:r>
+              <w:rPr>
+                <w:color w:val="000000"/>
+                <w:sz w:val="20"/>
+              </w:rPr>
               <w:lastRenderedPageBreak/>
               <w:t>MongoDB</w:t>
             </w:r>
@@ -954,10 +1595,20 @@
         </w:tc>
         <w:tc>
           <w:tcPr>
-            <w:tcW w:w="5040" w:type="dxa"/>
+            <w:tcW w:w="7488" w:type="dxa"/>
+            <w:vAlign w:val="center"/>
           </w:tcPr>
           <w:p>
+            <w:pPr>
+              <w:keepNext w:val="0"/>
+              <w:spacing w:before="0" w:after="0" w:line="252" w:lineRule="auto"/>
+              <w:jc w:val="left"/>
+            </w:pPr>
             <w:r>
+              <w:rPr>
+                <w:color w:val="000000"/>
+                <w:sz w:val="20"/>
+              </w:rPr>
               <w:t>Persistent storage for users, exams, questions, attempts and results.</w:t>
             </w:r>
           </w:p>
@@ -969,6 +1620,10 @@
         <w:pStyle w:val="Heading2"/>
       </w:pPr>
       <w:r>
+        <w:rPr>
+          <w:color w:val="000000"/>
+          <w:u w:val="none"/>
+        </w:rPr>
         <w:t>3.5 Chosen Architecture Pattern and Rationale</w:t>
       </w:r>
     </w:p>
@@ -982,6 +1637,10 @@
         <w:pStyle w:val="Heading2"/>
       </w:pPr>
       <w:r>
+        <w:rPr>
+          <w:color w:val="000000"/>
+          <w:u w:val="none"/>
+        </w:rPr>
         <w:t>3.6 Technology Stack &amp; Data Stores</w:t>
       </w:r>
     </w:p>
@@ -990,26 +1649,50 @@
         <w:tblStyle w:val="TableGrid"/>
         <w:tblW w:w="0" w:type="auto"/>
         <w:jc w:val="center"/>
+        <w:tblLayout w:type="fixed"/>
         <w:tblLook w:val="04A0" w:firstRow="1" w:lastRow="0" w:firstColumn="1" w:lastColumn="0" w:noHBand="0" w:noVBand="1"/>
+        <w:tblBorders>
+          <w:top w:val="single" w:sz="4" w:color="D9D9D9"/>
+          <w:left w:val="single" w:sz="4" w:color="D9D9D9"/>
+          <w:bottom w:val="single" w:sz="4" w:color="D9D9D9"/>
+          <w:right w:val="single" w:sz="4" w:color="D9D9D9"/>
+          <w:insideH w:val="single" w:sz="4" w:color="D9D9D9"/>
+          <w:insideV w:val="single" w:sz="4" w:color="D9D9D9"/>
+        </w:tblBorders>
+        <w:tblCellMar>
+          <w:top w:w="70" w:type="dxa"/>
+          <w:bottom w:w="70" w:type="dxa"/>
+          <w:left w:w="70" w:type="dxa"/>
+          <w:right w:w="70" w:type="dxa"/>
+        </w:tblCellMar>
       </w:tblPr>
       <w:tblGrid>
-        <w:gridCol w:w="5040"/>
-        <w:gridCol w:w="5040"/>
+        <w:gridCol w:w="2592"/>
+        <w:gridCol w:w="7488"/>
       </w:tblGrid>
       <w:tr>
         <w:trPr>
           <w:tblHeader/>
           <w:jc w:val="center"/>
+          <w:cantSplit/>
         </w:trPr>
         <w:tc>
           <w:tcPr>
-            <w:tcW w:w="5040" w:type="dxa"/>
+            <w:tcW w:w="2592" w:type="dxa"/>
             <w:vAlign w:val="center"/>
+            <w:shd w:fill="F1F1F1"/>
           </w:tcPr>
           <w:p>
+            <w:pPr>
+              <w:keepNext/>
+              <w:spacing w:before="0" w:after="0" w:line="252" w:lineRule="auto"/>
+              <w:jc w:val="left"/>
+            </w:pPr>
             <w:r>
               <w:rPr>
                 <w:b/>
+                <w:color w:val="000000"/>
+                <w:sz w:val="20"/>
               </w:rPr>
               <w:t>Area</w:t>
             </w:r>
@@ -1017,13 +1700,21 @@
         </w:tc>
         <w:tc>
           <w:tcPr>
-            <w:tcW w:w="5040" w:type="dxa"/>
+            <w:tcW w:w="7488" w:type="dxa"/>
             <w:vAlign w:val="center"/>
+            <w:shd w:fill="F1F1F1"/>
           </w:tcPr>
           <w:p>
+            <w:pPr>
+              <w:keepNext/>
+              <w:spacing w:before="0" w:after="0" w:line="252" w:lineRule="auto"/>
+              <w:jc w:val="left"/>
+            </w:pPr>
             <w:r>
               <w:rPr>
                 <w:b/>
+                <w:color w:val="000000"/>
+                <w:sz w:val="20"/>
               </w:rPr>
               <w:t>Technology</w:t>
             </w:r>
@@ -1033,23 +1724,44 @@
       <w:tr>
         <w:trPr>
           <w:jc w:val="center"/>
+          <w:cantSplit/>
         </w:trPr>
         <w:tc>
           <w:tcPr>
-            <w:tcW w:w="5040" w:type="dxa"/>
+            <w:tcW w:w="2592" w:type="dxa"/>
+            <w:vAlign w:val="center"/>
           </w:tcPr>
           <w:p>
+            <w:pPr>
+              <w:keepNext w:val="0"/>
+              <w:spacing w:before="0" w:after="0" w:line="252" w:lineRule="auto"/>
+              <w:jc w:val="left"/>
+            </w:pPr>
             <w:r>
+              <w:rPr>
+                <w:color w:val="000000"/>
+                <w:sz w:val="20"/>
+              </w:rPr>
               <w:t>Frontend</w:t>
             </w:r>
           </w:p>
         </w:tc>
         <w:tc>
           <w:tcPr>
-            <w:tcW w:w="5040" w:type="dxa"/>
+            <w:tcW w:w="7488" w:type="dxa"/>
+            <w:vAlign w:val="center"/>
           </w:tcPr>
           <w:p>
+            <w:pPr>
+              <w:keepNext w:val="0"/>
+              <w:spacing w:before="0" w:after="0" w:line="252" w:lineRule="auto"/>
+              <w:jc w:val="left"/>
+            </w:pPr>
             <w:r>
+              <w:rPr>
+                <w:color w:val="000000"/>
+                <w:sz w:val="20"/>
+              </w:rPr>
               <w:t>React.js, HTML/CSS, Bootstrap</w:t>
             </w:r>
           </w:p>
@@ -1058,23 +1770,44 @@
       <w:tr>
         <w:trPr>
           <w:jc w:val="center"/>
+          <w:cantSplit/>
         </w:trPr>
         <w:tc>
           <w:tcPr>
-            <w:tcW w:w="5040" w:type="dxa"/>
+            <w:tcW w:w="2592" w:type="dxa"/>
+            <w:vAlign w:val="center"/>
           </w:tcPr>
           <w:p>
+            <w:pPr>
+              <w:keepNext w:val="0"/>
+              <w:spacing w:before="0" w:after="0" w:line="252" w:lineRule="auto"/>
+              <w:jc w:val="left"/>
+            </w:pPr>
             <w:r>
+              <w:rPr>
+                <w:color w:val="000000"/>
+                <w:sz w:val="20"/>
+              </w:rPr>
               <w:t>Backend</w:t>
             </w:r>
           </w:p>
         </w:tc>
         <w:tc>
           <w:tcPr>
-            <w:tcW w:w="5040" w:type="dxa"/>
+            <w:tcW w:w="7488" w:type="dxa"/>
+            <w:vAlign w:val="center"/>
           </w:tcPr>
           <w:p>
+            <w:pPr>
+              <w:keepNext w:val="0"/>
+              <w:spacing w:before="0" w:after="0" w:line="252" w:lineRule="auto"/>
+              <w:jc w:val="left"/>
+            </w:pPr>
             <w:r>
+              <w:rPr>
+                <w:color w:val="000000"/>
+                <w:sz w:val="20"/>
+              </w:rPr>
               <w:t>Node.js, Express.js</w:t>
             </w:r>
           </w:p>
@@ -1083,23 +1816,44 @@
       <w:tr>
         <w:trPr>
           <w:jc w:val="center"/>
+          <w:cantSplit/>
         </w:trPr>
         <w:tc>
           <w:tcPr>
-            <w:tcW w:w="5040" w:type="dxa"/>
+            <w:tcW w:w="2592" w:type="dxa"/>
+            <w:vAlign w:val="center"/>
           </w:tcPr>
           <w:p>
+            <w:pPr>
+              <w:keepNext w:val="0"/>
+              <w:spacing w:before="0" w:after="0" w:line="252" w:lineRule="auto"/>
+              <w:jc w:val="left"/>
+            </w:pPr>
             <w:r>
+              <w:rPr>
+                <w:color w:val="000000"/>
+                <w:sz w:val="20"/>
+              </w:rPr>
               <w:t>Database</w:t>
             </w:r>
           </w:p>
         </w:tc>
         <w:tc>
           <w:tcPr>
-            <w:tcW w:w="5040" w:type="dxa"/>
+            <w:tcW w:w="7488" w:type="dxa"/>
+            <w:vAlign w:val="center"/>
           </w:tcPr>
           <w:p>
+            <w:pPr>
+              <w:keepNext w:val="0"/>
+              <w:spacing w:before="0" w:after="0" w:line="252" w:lineRule="auto"/>
+              <w:jc w:val="left"/>
+            </w:pPr>
             <w:r>
+              <w:rPr>
+                <w:color w:val="000000"/>
+                <w:sz w:val="20"/>
+              </w:rPr>
               <w:t>MongoDB</w:t>
             </w:r>
           </w:p>
@@ -1108,23 +1862,44 @@
       <w:tr>
         <w:trPr>
           <w:jc w:val="center"/>
+          <w:cantSplit/>
         </w:trPr>
         <w:tc>
           <w:tcPr>
-            <w:tcW w:w="5040" w:type="dxa"/>
+            <w:tcW w:w="2592" w:type="dxa"/>
+            <w:vAlign w:val="center"/>
           </w:tcPr>
           <w:p>
+            <w:pPr>
+              <w:keepNext w:val="0"/>
+              <w:spacing w:before="0" w:after="0" w:line="252" w:lineRule="auto"/>
+              <w:jc w:val="left"/>
+            </w:pPr>
             <w:r>
+              <w:rPr>
+                <w:color w:val="000000"/>
+                <w:sz w:val="20"/>
+              </w:rPr>
               <w:t>ODM</w:t>
             </w:r>
           </w:p>
         </w:tc>
         <w:tc>
           <w:tcPr>
-            <w:tcW w:w="5040" w:type="dxa"/>
+            <w:tcW w:w="7488" w:type="dxa"/>
+            <w:vAlign w:val="center"/>
           </w:tcPr>
           <w:p>
+            <w:pPr>
+              <w:keepNext w:val="0"/>
+              <w:spacing w:before="0" w:after="0" w:line="252" w:lineRule="auto"/>
+              <w:jc w:val="left"/>
+            </w:pPr>
             <w:r>
+              <w:rPr>
+                <w:color w:val="000000"/>
+                <w:sz w:val="20"/>
+              </w:rPr>
               <w:t>Mongoose</w:t>
             </w:r>
           </w:p>
@@ -1133,23 +1908,44 @@
       <w:tr>
         <w:trPr>
           <w:jc w:val="center"/>
+          <w:cantSplit/>
         </w:trPr>
         <w:tc>
           <w:tcPr>
-            <w:tcW w:w="5040" w:type="dxa"/>
+            <w:tcW w:w="2592" w:type="dxa"/>
+            <w:vAlign w:val="center"/>
           </w:tcPr>
           <w:p>
+            <w:pPr>
+              <w:keepNext w:val="0"/>
+              <w:spacing w:before="0" w:after="0" w:line="252" w:lineRule="auto"/>
+              <w:jc w:val="left"/>
+            </w:pPr>
             <w:r>
+              <w:rPr>
+                <w:color w:val="000000"/>
+                <w:sz w:val="20"/>
+              </w:rPr>
               <w:t>Password security</w:t>
             </w:r>
           </w:p>
         </w:tc>
         <w:tc>
           <w:tcPr>
-            <w:tcW w:w="5040" w:type="dxa"/>
+            <w:tcW w:w="7488" w:type="dxa"/>
+            <w:vAlign w:val="center"/>
           </w:tcPr>
           <w:p>
+            <w:pPr>
+              <w:keepNext w:val="0"/>
+              <w:spacing w:before="0" w:after="0" w:line="252" w:lineRule="auto"/>
+              <w:jc w:val="left"/>
+            </w:pPr>
             <w:r>
+              <w:rPr>
+                <w:color w:val="000000"/>
+                <w:sz w:val="20"/>
+              </w:rPr>
               <w:t>bcrypt</w:t>
             </w:r>
           </w:p>
@@ -1158,23 +1954,44 @@
       <w:tr>
         <w:trPr>
           <w:jc w:val="center"/>
+          <w:cantSplit/>
         </w:trPr>
         <w:tc>
           <w:tcPr>
-            <w:tcW w:w="5040" w:type="dxa"/>
+            <w:tcW w:w="2592" w:type="dxa"/>
+            <w:vAlign w:val="center"/>
           </w:tcPr>
           <w:p>
+            <w:pPr>
+              <w:keepNext w:val="0"/>
+              <w:spacing w:before="0" w:after="0" w:line="252" w:lineRule="auto"/>
+              <w:jc w:val="left"/>
+            </w:pPr>
             <w:r>
+              <w:rPr>
+                <w:color w:val="000000"/>
+                <w:sz w:val="20"/>
+              </w:rPr>
               <w:t>Testing</w:t>
             </w:r>
           </w:p>
         </w:tc>
         <w:tc>
           <w:tcPr>
-            <w:tcW w:w="5040" w:type="dxa"/>
+            <w:tcW w:w="7488" w:type="dxa"/>
+            <w:vAlign w:val="center"/>
           </w:tcPr>
           <w:p>
+            <w:pPr>
+              <w:keepNext w:val="0"/>
+              <w:spacing w:before="0" w:after="0" w:line="252" w:lineRule="auto"/>
+              <w:jc w:val="left"/>
+            </w:pPr>
             <w:r>
+              <w:rPr>
+                <w:color w:val="000000"/>
+                <w:sz w:val="20"/>
+              </w:rPr>
               <w:t>Jest, Supertest, React Testing Library</w:t>
             </w:r>
           </w:p>
@@ -1183,24 +2000,45 @@
       <w:tr>
         <w:trPr>
           <w:jc w:val="center"/>
+          <w:cantSplit/>
         </w:trPr>
         <w:tc>
           <w:tcPr>
-            <w:tcW w:w="5040" w:type="dxa"/>
+            <w:tcW w:w="2592" w:type="dxa"/>
+            <w:vAlign w:val="center"/>
           </w:tcPr>
           <w:p>
+            <w:pPr>
+              <w:keepNext w:val="0"/>
+              <w:spacing w:before="0" w:after="0" w:line="252" w:lineRule="auto"/>
+              <w:jc w:val="left"/>
+            </w:pPr>
             <w:r>
+              <w:rPr>
+                <w:color w:val="000000"/>
+                <w:sz w:val="20"/>
+              </w:rPr>
               <w:t>CI/CD / Quality</w:t>
             </w:r>
           </w:p>
         </w:tc>
         <w:tc>
           <w:tcPr>
-            <w:tcW w:w="5040" w:type="dxa"/>
+            <w:tcW w:w="7488" w:type="dxa"/>
+            <w:vAlign w:val="center"/>
           </w:tcPr>
           <w:p>
+            <w:pPr>
+              <w:keepNext w:val="0"/>
+              <w:spacing w:before="0" w:after="0" w:line="252" w:lineRule="auto"/>
+              <w:jc w:val="left"/>
+            </w:pPr>
             <w:r>
-              <w:t>GitHub Actions or Jenkins, Docker, SonarQube</w:t>
+              <w:rPr>
+                <w:color w:val="000000"/>
+                <w:sz w:val="20"/>
+              </w:rPr>
+              <w:t>GitHub Actions and Jenkins, Docker, SonarQube</w:t>
             </w:r>
           </w:p>
         </w:tc>
@@ -1208,23 +2046,44 @@
       <w:tr>
         <w:trPr>
           <w:jc w:val="center"/>
+          <w:cantSplit/>
         </w:trPr>
         <w:tc>
           <w:tcPr>
-            <w:tcW w:w="5040" w:type="dxa"/>
+            <w:tcW w:w="2592" w:type="dxa"/>
+            <w:vAlign w:val="center"/>
           </w:tcPr>
           <w:p>
+            <w:pPr>
+              <w:keepNext w:val="0"/>
+              <w:spacing w:before="0" w:after="0" w:line="252" w:lineRule="auto"/>
+              <w:jc w:val="left"/>
+            </w:pPr>
             <w:r>
+              <w:rPr>
+                <w:color w:val="000000"/>
+                <w:sz w:val="20"/>
+              </w:rPr>
               <w:t>Documentation/Diagrams</w:t>
             </w:r>
           </w:p>
         </w:tc>
         <w:tc>
           <w:tcPr>
-            <w:tcW w:w="5040" w:type="dxa"/>
+            <w:tcW w:w="7488" w:type="dxa"/>
+            <w:vAlign w:val="center"/>
           </w:tcPr>
           <w:p>
+            <w:pPr>
+              <w:keepNext w:val="0"/>
+              <w:spacing w:before="0" w:after="0" w:line="252" w:lineRule="auto"/>
+              <w:jc w:val="left"/>
+            </w:pPr>
             <w:r>
+              <w:rPr>
+                <w:color w:val="000000"/>
+                <w:sz w:val="20"/>
+              </w:rPr>
               <w:t>Word/Markdown, draw.io/Graphviz</w:t>
             </w:r>
           </w:p>
@@ -1236,6 +2095,10 @@
         <w:pStyle w:val="Heading2"/>
       </w:pPr>
       <w:r>
+        <w:rPr>
+          <w:color w:val="000000"/>
+          <w:u w:val="none"/>
+        </w:rPr>
         <w:t>3.7 Risks &amp; Mitigations</w:t>
       </w:r>
     </w:p>
@@ -1244,26 +2107,50 @@
         <w:tblStyle w:val="TableGrid"/>
         <w:tblW w:w="0" w:type="auto"/>
         <w:jc w:val="center"/>
+        <w:tblLayout w:type="fixed"/>
         <w:tblLook w:val="04A0" w:firstRow="1" w:lastRow="0" w:firstColumn="1" w:lastColumn="0" w:noHBand="0" w:noVBand="1"/>
+        <w:tblBorders>
+          <w:top w:val="single" w:sz="4" w:color="D9D9D9"/>
+          <w:left w:val="single" w:sz="4" w:color="D9D9D9"/>
+          <w:bottom w:val="single" w:sz="4" w:color="D9D9D9"/>
+          <w:right w:val="single" w:sz="4" w:color="D9D9D9"/>
+          <w:insideH w:val="single" w:sz="4" w:color="D9D9D9"/>
+          <w:insideV w:val="single" w:sz="4" w:color="D9D9D9"/>
+        </w:tblBorders>
+        <w:tblCellMar>
+          <w:top w:w="70" w:type="dxa"/>
+          <w:bottom w:w="70" w:type="dxa"/>
+          <w:left w:w="70" w:type="dxa"/>
+          <w:right w:w="70" w:type="dxa"/>
+        </w:tblCellMar>
       </w:tblPr>
       <w:tblGrid>
-        <w:gridCol w:w="5040"/>
-        <w:gridCol w:w="5040"/>
+        <w:gridCol w:w="3024"/>
+        <w:gridCol w:w="7056"/>
       </w:tblGrid>
       <w:tr>
         <w:trPr>
           <w:tblHeader/>
           <w:jc w:val="center"/>
+          <w:cantSplit/>
         </w:trPr>
         <w:tc>
           <w:tcPr>
-            <w:tcW w:w="5040" w:type="dxa"/>
+            <w:tcW w:w="3024" w:type="dxa"/>
             <w:vAlign w:val="center"/>
+            <w:shd w:fill="F1F1F1"/>
           </w:tcPr>
           <w:p>
+            <w:pPr>
+              <w:keepNext/>
+              <w:spacing w:before="0" w:after="0" w:line="252" w:lineRule="auto"/>
+              <w:jc w:val="left"/>
+            </w:pPr>
             <w:r>
               <w:rPr>
                 <w:b/>
+                <w:color w:val="000000"/>
+                <w:sz w:val="20"/>
               </w:rPr>
               <w:t>Risk</w:t>
             </w:r>
@@ -1271,13 +2158,21 @@
         </w:tc>
         <w:tc>
           <w:tcPr>
-            <w:tcW w:w="5040" w:type="dxa"/>
+            <w:tcW w:w="7056" w:type="dxa"/>
             <w:vAlign w:val="center"/>
+            <w:shd w:fill="F1F1F1"/>
           </w:tcPr>
           <w:p>
+            <w:pPr>
+              <w:keepNext/>
+              <w:spacing w:before="0" w:after="0" w:line="252" w:lineRule="auto"/>
+              <w:jc w:val="left"/>
+            </w:pPr>
             <w:r>
               <w:rPr>
                 <w:b/>
+                <w:color w:val="000000"/>
+                <w:sz w:val="20"/>
               </w:rPr>
               <w:t>Mitigation</w:t>
             </w:r>
@@ -1287,23 +2182,44 @@
       <w:tr>
         <w:trPr>
           <w:jc w:val="center"/>
+          <w:cantSplit/>
         </w:trPr>
         <w:tc>
           <w:tcPr>
-            <w:tcW w:w="5040" w:type="dxa"/>
+            <w:tcW w:w="3024" w:type="dxa"/>
+            <w:vAlign w:val="center"/>
           </w:tcPr>
           <w:p>
+            <w:pPr>
+              <w:keepNext w:val="0"/>
+              <w:spacing w:before="0" w:after="0" w:line="252" w:lineRule="auto"/>
+              <w:jc w:val="left"/>
+            </w:pPr>
             <w:r>
+              <w:rPr>
+                <w:color w:val="000000"/>
+                <w:sz w:val="20"/>
+              </w:rPr>
               <w:t>Client timer manipulation</w:t>
             </w:r>
           </w:p>
         </w:tc>
         <w:tc>
           <w:tcPr>
-            <w:tcW w:w="5040" w:type="dxa"/>
+            <w:tcW w:w="7056" w:type="dxa"/>
+            <w:vAlign w:val="center"/>
           </w:tcPr>
           <w:p>
+            <w:pPr>
+              <w:keepNext w:val="0"/>
+              <w:spacing w:before="0" w:after="0" w:line="252" w:lineRule="auto"/>
+              <w:jc w:val="left"/>
+            </w:pPr>
             <w:r>
+              <w:rPr>
+                <w:color w:val="000000"/>
+                <w:sz w:val="20"/>
+              </w:rPr>
               <w:t>Server stores start/deadline and validates submission timing.</w:t>
             </w:r>
           </w:p>
@@ -1312,23 +2228,44 @@
       <w:tr>
         <w:trPr>
           <w:jc w:val="center"/>
+          <w:cantSplit/>
         </w:trPr>
         <w:tc>
           <w:tcPr>
-            <w:tcW w:w="5040" w:type="dxa"/>
+            <w:tcW w:w="3024" w:type="dxa"/>
+            <w:vAlign w:val="center"/>
           </w:tcPr>
           <w:p>
+            <w:pPr>
+              <w:keepNext w:val="0"/>
+              <w:spacing w:before="0" w:after="0" w:line="252" w:lineRule="auto"/>
+              <w:jc w:val="left"/>
+            </w:pPr>
             <w:r>
+              <w:rPr>
+                <w:color w:val="000000"/>
+                <w:sz w:val="20"/>
+              </w:rPr>
               <w:t>Unauthorized cross-user access</w:t>
             </w:r>
           </w:p>
         </w:tc>
         <w:tc>
           <w:tcPr>
-            <w:tcW w:w="5040" w:type="dxa"/>
+            <w:tcW w:w="7056" w:type="dxa"/>
+            <w:vAlign w:val="center"/>
           </w:tcPr>
           <w:p>
+            <w:pPr>
+              <w:keepNext w:val="0"/>
+              <w:spacing w:before="0" w:after="0" w:line="252" w:lineRule="auto"/>
+              <w:jc w:val="left"/>
+            </w:pPr>
             <w:r>
+              <w:rPr>
+                <w:color w:val="000000"/>
+                <w:sz w:val="20"/>
+              </w:rPr>
               <w:t>Backend RBAC and ownership checks on every protected resource route.</w:t>
             </w:r>
           </w:p>
@@ -1337,23 +2274,44 @@
       <w:tr>
         <w:trPr>
           <w:jc w:val="center"/>
+          <w:cantSplit/>
         </w:trPr>
         <w:tc>
           <w:tcPr>
-            <w:tcW w:w="5040" w:type="dxa"/>
+            <w:tcW w:w="3024" w:type="dxa"/>
+            <w:vAlign w:val="center"/>
           </w:tcPr>
           <w:p>
+            <w:pPr>
+              <w:keepNext w:val="0"/>
+              <w:spacing w:before="0" w:after="0" w:line="252" w:lineRule="auto"/>
+              <w:jc w:val="left"/>
+            </w:pPr>
             <w:r>
+              <w:rPr>
+                <w:color w:val="000000"/>
+                <w:sz w:val="20"/>
+              </w:rPr>
               <w:t>Correct-answer leakage</w:t>
             </w:r>
           </w:p>
         </w:tc>
         <w:tc>
           <w:tcPr>
-            <w:tcW w:w="5040" w:type="dxa"/>
+            <w:tcW w:w="7056" w:type="dxa"/>
+            <w:vAlign w:val="center"/>
           </w:tcPr>
           <w:p>
+            <w:pPr>
+              <w:keepNext w:val="0"/>
+              <w:spacing w:before="0" w:after="0" w:line="252" w:lineRule="auto"/>
+              <w:jc w:val="left"/>
+            </w:pPr>
             <w:r>
+              <w:rPr>
+                <w:color w:val="000000"/>
+                <w:sz w:val="20"/>
+              </w:rPr>
               <w:t>Student-facing attempt responses exclude correct-answer fields.</w:t>
             </w:r>
           </w:p>
@@ -1362,23 +2320,44 @@
       <w:tr>
         <w:trPr>
           <w:jc w:val="center"/>
+          <w:cantSplit/>
         </w:trPr>
         <w:tc>
           <w:tcPr>
-            <w:tcW w:w="5040" w:type="dxa"/>
+            <w:tcW w:w="3024" w:type="dxa"/>
+            <w:vAlign w:val="center"/>
           </w:tcPr>
           <w:p>
+            <w:pPr>
+              <w:keepNext w:val="0"/>
+              <w:spacing w:before="0" w:after="0" w:line="252" w:lineRule="auto"/>
+              <w:jc w:val="left"/>
+            </w:pPr>
             <w:r>
+              <w:rPr>
+                <w:color w:val="000000"/>
+                <w:sz w:val="20"/>
+              </w:rPr>
               <w:t>Frontend/backend contract mismatch</w:t>
             </w:r>
           </w:p>
         </w:tc>
         <w:tc>
           <w:tcPr>
-            <w:tcW w:w="5040" w:type="dxa"/>
+            <w:tcW w:w="7056" w:type="dxa"/>
+            <w:vAlign w:val="center"/>
           </w:tcPr>
           <w:p>
+            <w:pPr>
+              <w:keepNext w:val="0"/>
+              <w:spacing w:before="0" w:after="0" w:line="252" w:lineRule="auto"/>
+              <w:jc w:val="left"/>
+            </w:pPr>
             <w:r>
+              <w:rPr>
+                <w:color w:val="000000"/>
+                <w:sz w:val="20"/>
+              </w:rPr>
               <w:t>Define and test REST endpoints incrementally; use Supertest for API integration.</w:t>
             </w:r>
           </w:p>
@@ -1387,23 +2366,44 @@
       <w:tr>
         <w:trPr>
           <w:jc w:val="center"/>
+          <w:cantSplit/>
         </w:trPr>
         <w:tc>
           <w:tcPr>
-            <w:tcW w:w="5040" w:type="dxa"/>
+            <w:tcW w:w="3024" w:type="dxa"/>
+            <w:vAlign w:val="center"/>
           </w:tcPr>
           <w:p>
+            <w:pPr>
+              <w:keepNext w:val="0"/>
+              <w:spacing w:before="0" w:after="0" w:line="252" w:lineRule="auto"/>
+              <w:jc w:val="left"/>
+            </w:pPr>
             <w:r>
+              <w:rPr>
+                <w:color w:val="000000"/>
+                <w:sz w:val="20"/>
+              </w:rPr>
               <w:t>Scope growth</w:t>
             </w:r>
           </w:p>
         </w:tc>
         <w:tc>
           <w:tcPr>
-            <w:tcW w:w="5040" w:type="dxa"/>
+            <w:tcW w:w="7056" w:type="dxa"/>
+            <w:vAlign w:val="center"/>
           </w:tcPr>
           <w:p>
+            <w:pPr>
+              <w:keepNext w:val="0"/>
+              <w:spacing w:before="0" w:after="0" w:line="252" w:lineRule="auto"/>
+              <w:jc w:val="left"/>
+            </w:pPr>
             <w:r>
+              <w:rPr>
+                <w:color w:val="000000"/>
+                <w:sz w:val="20"/>
+              </w:rPr>
               <w:t>Keep optional features outside Release 1 and document deviations.</w:t>
             </w:r>
           </w:p>
@@ -1412,24 +2412,45 @@
       <w:tr>
         <w:trPr>
           <w:jc w:val="center"/>
+          <w:cantSplit/>
         </w:trPr>
         <w:tc>
           <w:tcPr>
-            <w:tcW w:w="5040" w:type="dxa"/>
+            <w:tcW w:w="3024" w:type="dxa"/>
+            <w:vAlign w:val="center"/>
           </w:tcPr>
           <w:p>
+            <w:pPr>
+              <w:keepNext w:val="0"/>
+              <w:spacing w:before="0" w:after="0" w:line="252" w:lineRule="auto"/>
+              <w:jc w:val="left"/>
+            </w:pPr>
             <w:r>
+              <w:rPr>
+                <w:color w:val="000000"/>
+                <w:sz w:val="20"/>
+              </w:rPr>
               <w:t>Merge/integration conflicts</w:t>
             </w:r>
           </w:p>
         </w:tc>
         <w:tc>
           <w:tcPr>
-            <w:tcW w:w="5040" w:type="dxa"/>
+            <w:tcW w:w="7056" w:type="dxa"/>
+            <w:vAlign w:val="center"/>
           </w:tcPr>
           <w:p>
+            <w:pPr>
+              <w:keepNext w:val="0"/>
+              <w:spacing w:before="0" w:after="0" w:line="252" w:lineRule="auto"/>
+              <w:jc w:val="left"/>
+            </w:pPr>
             <w:r>
-              <w:t>Small Jira/GitHub backlog items, short-lived branches and frequent integration.</w:t>
+              <w:rPr>
+                <w:color w:val="000000"/>
+                <w:sz w:val="20"/>
+              </w:rPr>
+              <w:t>Small GitHub backlog items, short-lived branches and frequent integration.</w:t>
             </w:r>
           </w:p>
         </w:tc>
@@ -1440,6 +2461,10 @@
         <w:pStyle w:val="Heading2"/>
       </w:pPr>
       <w:r>
+        <w:rPr>
+          <w:color w:val="000000"/>
+          <w:u w:val="none"/>
+        </w:rPr>
         <w:t>3.8 Traceability to Requirements</w:t>
       </w:r>
     </w:p>
@@ -1448,26 +2473,50 @@
         <w:tblStyle w:val="TableGrid"/>
         <w:tblW w:w="0" w:type="auto"/>
         <w:jc w:val="center"/>
+        <w:tblLayout w:type="fixed"/>
         <w:tblLook w:val="04A0" w:firstRow="1" w:lastRow="0" w:firstColumn="1" w:lastColumn="0" w:noHBand="0" w:noVBand="1"/>
+        <w:tblBorders>
+          <w:top w:val="single" w:sz="4" w:color="D9D9D9"/>
+          <w:left w:val="single" w:sz="4" w:color="D9D9D9"/>
+          <w:bottom w:val="single" w:sz="4" w:color="D9D9D9"/>
+          <w:right w:val="single" w:sz="4" w:color="D9D9D9"/>
+          <w:insideH w:val="single" w:sz="4" w:color="D9D9D9"/>
+          <w:insideV w:val="single" w:sz="4" w:color="D9D9D9"/>
+        </w:tblBorders>
+        <w:tblCellMar>
+          <w:top w:w="70" w:type="dxa"/>
+          <w:bottom w:w="70" w:type="dxa"/>
+          <w:left w:w="70" w:type="dxa"/>
+          <w:right w:w="70" w:type="dxa"/>
+        </w:tblCellMar>
       </w:tblPr>
       <w:tblGrid>
-        <w:gridCol w:w="5040"/>
-        <w:gridCol w:w="5040"/>
+        <w:gridCol w:w="3168"/>
+        <w:gridCol w:w="6912"/>
       </w:tblGrid>
       <w:tr>
         <w:trPr>
           <w:tblHeader/>
           <w:jc w:val="center"/>
+          <w:cantSplit/>
         </w:trPr>
         <w:tc>
           <w:tcPr>
-            <w:tcW w:w="5040" w:type="dxa"/>
+            <w:tcW w:w="3168" w:type="dxa"/>
             <w:vAlign w:val="center"/>
+            <w:shd w:fill="F1F1F1"/>
           </w:tcPr>
           <w:p>
+            <w:pPr>
+              <w:keepNext/>
+              <w:spacing w:before="0" w:after="0" w:line="252" w:lineRule="auto"/>
+              <w:jc w:val="left"/>
+            </w:pPr>
             <w:r>
               <w:rPr>
                 <w:b/>
+                <w:color w:val="000000"/>
+                <w:sz w:val="20"/>
               </w:rPr>
               <w:t>Requirement Group</w:t>
             </w:r>
@@ -1475,13 +2524,21 @@
         </w:tc>
         <w:tc>
           <w:tcPr>
-            <w:tcW w:w="5040" w:type="dxa"/>
+            <w:tcW w:w="6912" w:type="dxa"/>
             <w:vAlign w:val="center"/>
+            <w:shd w:fill="F1F1F1"/>
           </w:tcPr>
           <w:p>
+            <w:pPr>
+              <w:keepNext/>
+              <w:spacing w:before="0" w:after="0" w:line="252" w:lineRule="auto"/>
+              <w:jc w:val="left"/>
+            </w:pPr>
             <w:r>
               <w:rPr>
                 <w:b/>
+                <w:color w:val="000000"/>
+                <w:sz w:val="20"/>
               </w:rPr>
               <w:t>Architecture / Component Mapping</w:t>
             </w:r>
@@ -1491,23 +2548,44 @@
       <w:tr>
         <w:trPr>
           <w:jc w:val="center"/>
+          <w:cantSplit/>
         </w:trPr>
         <w:tc>
           <w:tcPr>
-            <w:tcW w:w="5040" w:type="dxa"/>
+            <w:tcW w:w="3168" w:type="dxa"/>
+            <w:vAlign w:val="center"/>
           </w:tcPr>
           <w:p>
+            <w:pPr>
+              <w:keepNext w:val="0"/>
+              <w:spacing w:before="0" w:after="0" w:line="252" w:lineRule="auto"/>
+              <w:jc w:val="left"/>
+            </w:pPr>
             <w:r>
+              <w:rPr>
+                <w:color w:val="000000"/>
+                <w:sz w:val="20"/>
+              </w:rPr>
               <w:t>AUTH-FR-01..03, OEP-SR-001..03</w:t>
             </w:r>
           </w:p>
         </w:tc>
         <w:tc>
           <w:tcPr>
-            <w:tcW w:w="5040" w:type="dxa"/>
+            <w:tcW w:w="6912" w:type="dxa"/>
+            <w:vAlign w:val="center"/>
           </w:tcPr>
           <w:p>
+            <w:pPr>
+              <w:keepNext w:val="0"/>
+              <w:spacing w:before="0" w:after="0" w:line="252" w:lineRule="auto"/>
+              <w:jc w:val="left"/>
+            </w:pPr>
             <w:r>
+              <w:rPr>
+                <w:color w:val="000000"/>
+                <w:sz w:val="20"/>
+              </w:rPr>
               <w:t>React Login + Express Auth/RBAC Middleware + User model</w:t>
             </w:r>
           </w:p>
@@ -1516,23 +2594,44 @@
       <w:tr>
         <w:trPr>
           <w:jc w:val="center"/>
+          <w:cantSplit/>
         </w:trPr>
         <w:tc>
           <w:tcPr>
-            <w:tcW w:w="5040" w:type="dxa"/>
+            <w:tcW w:w="3168" w:type="dxa"/>
+            <w:vAlign w:val="center"/>
           </w:tcPr>
           <w:p>
+            <w:pPr>
+              <w:keepNext w:val="0"/>
+              <w:spacing w:before="0" w:after="0" w:line="252" w:lineRule="auto"/>
+              <w:jc w:val="left"/>
+            </w:pPr>
             <w:r>
+              <w:rPr>
+                <w:color w:val="000000"/>
+                <w:sz w:val="20"/>
+              </w:rPr>
               <w:t>EXAM-FR-01..04, QUES-FR-01..03</w:t>
             </w:r>
           </w:p>
         </w:tc>
         <w:tc>
           <w:tcPr>
-            <w:tcW w:w="5040" w:type="dxa"/>
+            <w:tcW w:w="6912" w:type="dxa"/>
+            <w:vAlign w:val="center"/>
           </w:tcPr>
           <w:p>
+            <w:pPr>
+              <w:keepNext w:val="0"/>
+              <w:spacing w:before="0" w:after="0" w:line="252" w:lineRule="auto"/>
+              <w:jc w:val="left"/>
+            </w:pPr>
             <w:r>
+              <w:rPr>
+                <w:color w:val="000000"/>
+                <w:sz w:val="20"/>
+              </w:rPr>
               <w:t>Exam/Question Module + MongoDB models</w:t>
             </w:r>
           </w:p>
@@ -1541,23 +2640,44 @@
       <w:tr>
         <w:trPr>
           <w:jc w:val="center"/>
+          <w:cantSplit/>
         </w:trPr>
         <w:tc>
           <w:tcPr>
-            <w:tcW w:w="5040" w:type="dxa"/>
+            <w:tcW w:w="3168" w:type="dxa"/>
+            <w:vAlign w:val="center"/>
           </w:tcPr>
           <w:p>
+            <w:pPr>
+              <w:keepNext w:val="0"/>
+              <w:spacing w:before="0" w:after="0" w:line="252" w:lineRule="auto"/>
+              <w:jc w:val="left"/>
+            </w:pPr>
             <w:r>
+              <w:rPr>
+                <w:color w:val="000000"/>
+                <w:sz w:val="20"/>
+              </w:rPr>
               <w:t>ATT-FR-01..06</w:t>
             </w:r>
           </w:p>
         </w:tc>
         <w:tc>
           <w:tcPr>
-            <w:tcW w:w="5040" w:type="dxa"/>
+            <w:tcW w:w="6912" w:type="dxa"/>
+            <w:vAlign w:val="center"/>
           </w:tcPr>
           <w:p>
+            <w:pPr>
+              <w:keepNext w:val="0"/>
+              <w:spacing w:before="0" w:after="0" w:line="252" w:lineRule="auto"/>
+              <w:jc w:val="left"/>
+            </w:pPr>
             <w:r>
+              <w:rPr>
+                <w:color w:val="000000"/>
+                <w:sz w:val="20"/>
+              </w:rPr>
               <w:t>Attempt Module + React Exam Attempt UI</w:t>
             </w:r>
           </w:p>
@@ -1566,23 +2686,44 @@
       <w:tr>
         <w:trPr>
           <w:jc w:val="center"/>
+          <w:cantSplit/>
         </w:trPr>
         <w:tc>
           <w:tcPr>
-            <w:tcW w:w="5040" w:type="dxa"/>
+            <w:tcW w:w="3168" w:type="dxa"/>
+            <w:vAlign w:val="center"/>
           </w:tcPr>
           <w:p>
+            <w:pPr>
+              <w:keepNext w:val="0"/>
+              <w:spacing w:before="0" w:after="0" w:line="252" w:lineRule="auto"/>
+              <w:jc w:val="left"/>
+            </w:pPr>
             <w:r>
+              <w:rPr>
+                <w:color w:val="000000"/>
+                <w:sz w:val="20"/>
+              </w:rPr>
               <w:t>EVAL-FR-01..02</w:t>
             </w:r>
           </w:p>
         </w:tc>
         <w:tc>
           <w:tcPr>
-            <w:tcW w:w="5040" w:type="dxa"/>
+            <w:tcW w:w="6912" w:type="dxa"/>
+            <w:vAlign w:val="center"/>
           </w:tcPr>
           <w:p>
+            <w:pPr>
+              <w:keepNext w:val="0"/>
+              <w:spacing w:before="0" w:after="0" w:line="252" w:lineRule="auto"/>
+              <w:jc w:val="left"/>
+            </w:pPr>
             <w:r>
+              <w:rPr>
+                <w:color w:val="000000"/>
+                <w:sz w:val="20"/>
+              </w:rPr>
               <w:t>Evaluation Service + Attempt/Question data</w:t>
             </w:r>
           </w:p>
@@ -1591,23 +2732,44 @@
       <w:tr>
         <w:trPr>
           <w:jc w:val="center"/>
+          <w:cantSplit/>
         </w:trPr>
         <w:tc>
           <w:tcPr>
-            <w:tcW w:w="5040" w:type="dxa"/>
+            <w:tcW w:w="3168" w:type="dxa"/>
+            <w:vAlign w:val="center"/>
           </w:tcPr>
           <w:p>
+            <w:pPr>
+              <w:keepNext w:val="0"/>
+              <w:spacing w:before="0" w:after="0" w:line="252" w:lineRule="auto"/>
+              <w:jc w:val="left"/>
+            </w:pPr>
             <w:r>
+              <w:rPr>
+                <w:color w:val="000000"/>
+                <w:sz w:val="20"/>
+              </w:rPr>
               <w:t>RES-FR-01..02</w:t>
             </w:r>
           </w:p>
         </w:tc>
         <w:tc>
           <w:tcPr>
-            <w:tcW w:w="5040" w:type="dxa"/>
+            <w:tcW w:w="6912" w:type="dxa"/>
+            <w:vAlign w:val="center"/>
           </w:tcPr>
           <w:p>
+            <w:pPr>
+              <w:keepNext w:val="0"/>
+              <w:spacing w:before="0" w:after="0" w:line="252" w:lineRule="auto"/>
+              <w:jc w:val="left"/>
+            </w:pPr>
             <w:r>
+              <w:rPr>
+                <w:color w:val="000000"/>
+                <w:sz w:val="20"/>
+              </w:rPr>
               <w:t>Results routes/service + ownership checks</w:t>
             </w:r>
           </w:p>
@@ -1616,23 +2778,44 @@
       <w:tr>
         <w:trPr>
           <w:jc w:val="center"/>
+          <w:cantSplit/>
         </w:trPr>
         <w:tc>
           <w:tcPr>
-            <w:tcW w:w="5040" w:type="dxa"/>
+            <w:tcW w:w="3168" w:type="dxa"/>
+            <w:vAlign w:val="center"/>
           </w:tcPr>
           <w:p>
+            <w:pPr>
+              <w:keepNext w:val="0"/>
+              <w:spacing w:before="0" w:after="0" w:line="252" w:lineRule="auto"/>
+              <w:jc w:val="left"/>
+            </w:pPr>
             <w:r>
+              <w:rPr>
+                <w:color w:val="000000"/>
+                <w:sz w:val="20"/>
+              </w:rPr>
               <w:t>OEP-NF-001..005</w:t>
             </w:r>
           </w:p>
         </w:tc>
         <w:tc>
           <w:tcPr>
-            <w:tcW w:w="5040" w:type="dxa"/>
+            <w:tcW w:w="6912" w:type="dxa"/>
+            <w:vAlign w:val="center"/>
           </w:tcPr>
           <w:p>
+            <w:pPr>
+              <w:keepNext w:val="0"/>
+              <w:spacing w:before="0" w:after="0" w:line="252" w:lineRule="auto"/>
+              <w:jc w:val="left"/>
+            </w:pPr>
             <w:r>
+              <w:rPr>
+                <w:color w:val="000000"/>
+                <w:sz w:val="20"/>
+              </w:rPr>
               <w:t>Cross-cutting API, error handling, testing and compatibility mechanisms</w:t>
             </w:r>
           </w:p>
@@ -1644,6 +2827,10 @@
         <w:pStyle w:val="Heading2"/>
       </w:pPr>
       <w:r>
+        <w:rPr>
+          <w:color w:val="000000"/>
+          <w:u w:val="none"/>
+        </w:rPr>
         <w:t>3.9 Security Architecture</w:t>
       </w:r>
     </w:p>
@@ -1653,10 +2840,19 @@
       </w:r>
     </w:p>
     <w:p>
+      <w:r>
+        <w:t>Use one server-managed session mechanism with HttpOnly cookies, Secure over HTTPS, a documented SameSite policy and CSRF protection. Logout invalidates the server session. Each request checks current stored active status/role, resource ownership and lifecycle. Anonymous/inactive access fails; Admin has account-management permissions only. Preserve historical references after role/status changes and exclude answer keys/correctness flags from Student payloads. The agreement maps these controls to TC-RBAC-01 through TC-RBAC-26; execution remains pending.</w:t>
+      </w:r>
+    </w:p>
+    <w:p>
       <w:pPr>
         <w:pStyle w:val="Heading1"/>
       </w:pPr>
       <w:r>
+        <w:rPr>
+          <w:color w:val="000000"/>
+          <w:u w:val="none"/>
+        </w:rPr>
         <w:lastRenderedPageBreak/>
         <w:t>4. Design</w:t>
       </w:r>
@@ -1666,6 +2862,10 @@
         <w:pStyle w:val="Heading2"/>
       </w:pPr>
       <w:r>
+        <w:rPr>
+          <w:color w:val="000000"/>
+          <w:u w:val="none"/>
+        </w:rPr>
         <w:t>4.1 Design Overview</w:t>
       </w:r>
     </w:p>
@@ -1679,6 +2879,10 @@
         <w:pStyle w:val="Heading2"/>
       </w:pPr>
       <w:r>
+        <w:rPr>
+          <w:color w:val="000000"/>
+          <w:u w:val="none"/>
+        </w:rPr>
         <w:t>4.2 UML Sequence Diagrams</w:t>
       </w:r>
     </w:p>
@@ -1687,6 +2891,10 @@
         <w:pStyle w:val="Heading3"/>
       </w:pPr>
       <w:r>
+        <w:rPr>
+          <w:color w:val="000000"/>
+          <w:u w:val="none"/>
+        </w:rPr>
         <w:t>4.2.1 Instructor Creates and Publishes an Exam</w:t>
       </w:r>
     </w:p>
@@ -1751,6 +2959,10 @@
         <w:pStyle w:val="Heading3"/>
       </w:pPr>
       <w:r>
+        <w:rPr>
+          <w:color w:val="000000"/>
+          <w:u w:val="none"/>
+        </w:rPr>
         <w:t>4.2.2 Student Starts and Submits an Attempt</w:t>
       </w:r>
     </w:p>
@@ -1815,6 +3027,10 @@
         <w:pStyle w:val="Heading2"/>
       </w:pPr>
       <w:r>
+        <w:rPr>
+          <w:color w:val="000000"/>
+          <w:u w:val="none"/>
+        </w:rPr>
         <w:t>4.3 API Design</w:t>
       </w:r>
     </w:p>
@@ -1823,29 +3039,53 @@
         <w:tblStyle w:val="TableGrid"/>
         <w:tblW w:w="0" w:type="auto"/>
         <w:jc w:val="center"/>
+        <w:tblLayout w:type="fixed"/>
         <w:tblLook w:val="04A0" w:firstRow="1" w:lastRow="0" w:firstColumn="1" w:lastColumn="0" w:noHBand="0" w:noVBand="1"/>
+        <w:tblBorders>
+          <w:top w:val="single" w:sz="4" w:color="D9D9D9"/>
+          <w:left w:val="single" w:sz="4" w:color="D9D9D9"/>
+          <w:bottom w:val="single" w:sz="4" w:color="D9D9D9"/>
+          <w:right w:val="single" w:sz="4" w:color="D9D9D9"/>
+          <w:insideH w:val="single" w:sz="4" w:color="D9D9D9"/>
+          <w:insideV w:val="single" w:sz="4" w:color="D9D9D9"/>
+        </w:tblBorders>
+        <w:tblCellMar>
+          <w:top w:w="70" w:type="dxa"/>
+          <w:bottom w:w="70" w:type="dxa"/>
+          <w:left w:w="70" w:type="dxa"/>
+          <w:right w:w="70" w:type="dxa"/>
+        </w:tblCellMar>
       </w:tblPr>
       <w:tblGrid>
-        <w:gridCol w:w="1349"/>
-        <w:gridCol w:w="2862"/>
-        <w:gridCol w:w="1771"/>
-        <w:gridCol w:w="2584"/>
-        <w:gridCol w:w="1730"/>
+        <w:gridCol w:w="720"/>
+        <w:gridCol w:w="2304"/>
+        <w:gridCol w:w="2160"/>
+        <w:gridCol w:w="3240"/>
+        <w:gridCol w:w="1656"/>
       </w:tblGrid>
       <w:tr>
         <w:trPr>
           <w:tblHeader/>
           <w:jc w:val="center"/>
+          <w:cantSplit/>
         </w:trPr>
         <w:tc>
           <w:tcPr>
-            <w:tcW w:w="2016" w:type="dxa"/>
+            <w:tcW w:w="720" w:type="dxa"/>
             <w:vAlign w:val="center"/>
+            <w:shd w:fill="F1F1F1"/>
           </w:tcPr>
           <w:p>
+            <w:pPr>
+              <w:keepNext/>
+              <w:spacing w:before="0" w:after="0" w:line="252" w:lineRule="auto"/>
+              <w:jc w:val="left"/>
+            </w:pPr>
             <w:r>
               <w:rPr>
                 <w:b/>
+                <w:color w:val="000000"/>
+                <w:sz w:val="20"/>
               </w:rPr>
               <w:t>Method</w:t>
             </w:r>
@@ -1853,13 +3093,21 @@
         </w:tc>
         <w:tc>
           <w:tcPr>
-            <w:tcW w:w="2016" w:type="dxa"/>
+            <w:tcW w:w="2304" w:type="dxa"/>
             <w:vAlign w:val="center"/>
+            <w:shd w:fill="F1F1F1"/>
           </w:tcPr>
           <w:p>
+            <w:pPr>
+              <w:keepNext/>
+              <w:spacing w:before="0" w:after="0" w:line="252" w:lineRule="auto"/>
+              <w:jc w:val="left"/>
+            </w:pPr>
             <w:r>
               <w:rPr>
                 <w:b/>
+                <w:color w:val="000000"/>
+                <w:sz w:val="20"/>
               </w:rPr>
               <w:t>Endpoint</w:t>
             </w:r>
@@ -1867,13 +3115,21 @@
         </w:tc>
         <w:tc>
           <w:tcPr>
-            <w:tcW w:w="2016" w:type="dxa"/>
+            <w:tcW w:w="2160" w:type="dxa"/>
             <w:vAlign w:val="center"/>
+            <w:shd w:fill="F1F1F1"/>
           </w:tcPr>
           <w:p>
+            <w:pPr>
+              <w:keepNext/>
+              <w:spacing w:before="0" w:after="0" w:line="252" w:lineRule="auto"/>
+              <w:jc w:val="left"/>
+            </w:pPr>
             <w:r>
               <w:rPr>
                 <w:b/>
+                <w:color w:val="000000"/>
+                <w:sz w:val="20"/>
               </w:rPr>
               <w:t>Request</w:t>
             </w:r>
@@ -1881,13 +3137,21 @@
         </w:tc>
         <w:tc>
           <w:tcPr>
-            <w:tcW w:w="2016" w:type="dxa"/>
+            <w:tcW w:w="3240" w:type="dxa"/>
             <w:vAlign w:val="center"/>
+            <w:shd w:fill="F1F1F1"/>
           </w:tcPr>
           <w:p>
+            <w:pPr>
+              <w:keepNext/>
+              <w:spacing w:before="0" w:after="0" w:line="252" w:lineRule="auto"/>
+              <w:jc w:val="left"/>
+            </w:pPr>
             <w:r>
               <w:rPr>
                 <w:b/>
+                <w:color w:val="000000"/>
+                <w:sz w:val="20"/>
               </w:rPr>
               <w:t>Response / Errors</w:t>
             </w:r>
@@ -1895,13 +3159,21 @@
         </w:tc>
         <w:tc>
           <w:tcPr>
-            <w:tcW w:w="2016" w:type="dxa"/>
+            <w:tcW w:w="1656" w:type="dxa"/>
             <w:vAlign w:val="center"/>
+            <w:shd w:fill="F1F1F1"/>
           </w:tcPr>
           <w:p>
+            <w:pPr>
+              <w:keepNext/>
+              <w:spacing w:before="0" w:after="0" w:line="252" w:lineRule="auto"/>
+              <w:jc w:val="left"/>
+            </w:pPr>
             <w:r>
               <w:rPr>
                 <w:b/>
+                <w:color w:val="000000"/>
+                <w:sz w:val="20"/>
               </w:rPr>
               <w:t>Requirements</w:t>
             </w:r>
@@ -1911,53 +3183,104 @@
       <w:tr>
         <w:trPr>
           <w:jc w:val="center"/>
+          <w:cantSplit/>
         </w:trPr>
         <w:tc>
           <w:tcPr>
-            <w:tcW w:w="2016" w:type="dxa"/>
+            <w:tcW w:w="720" w:type="dxa"/>
+            <w:vAlign w:val="center"/>
           </w:tcPr>
           <w:p>
+            <w:pPr>
+              <w:keepNext w:val="0"/>
+              <w:spacing w:before="0" w:after="0" w:line="252" w:lineRule="auto"/>
+              <w:jc w:val="left"/>
+            </w:pPr>
             <w:r>
+              <w:rPr>
+                <w:color w:val="000000"/>
+                <w:sz w:val="20"/>
+              </w:rPr>
               <w:t>POST</w:t>
             </w:r>
           </w:p>
         </w:tc>
         <w:tc>
           <w:tcPr>
-            <w:tcW w:w="2016" w:type="dxa"/>
+            <w:tcW w:w="2304" w:type="dxa"/>
+            <w:vAlign w:val="center"/>
           </w:tcPr>
           <w:p>
+            <w:pPr>
+              <w:keepNext w:val="0"/>
+              <w:spacing w:before="0" w:after="0" w:line="252" w:lineRule="auto"/>
+              <w:jc w:val="left"/>
+            </w:pPr>
             <w:r>
+              <w:rPr>
+                <w:color w:val="000000"/>
+                <w:sz w:val="20"/>
+              </w:rPr>
               <w:t>/api/auth/login</w:t>
             </w:r>
           </w:p>
         </w:tc>
         <w:tc>
           <w:tcPr>
-            <w:tcW w:w="2016" w:type="dxa"/>
+            <w:tcW w:w="2160" w:type="dxa"/>
+            <w:vAlign w:val="center"/>
           </w:tcPr>
           <w:p>
+            <w:pPr>
+              <w:keepNext w:val="0"/>
+              <w:spacing w:before="0" w:after="0" w:line="252" w:lineRule="auto"/>
+              <w:jc w:val="left"/>
+            </w:pPr>
             <w:r>
+              <w:rPr>
+                <w:color w:val="000000"/>
+                <w:sz w:val="20"/>
+              </w:rPr>
               <w:t>{email, password}</w:t>
             </w:r>
           </w:p>
         </w:tc>
         <w:tc>
           <w:tcPr>
-            <w:tcW w:w="2016" w:type="dxa"/>
+            <w:tcW w:w="3240" w:type="dxa"/>
+            <w:vAlign w:val="center"/>
           </w:tcPr>
           <w:p>
+            <w:pPr>
+              <w:keepNext w:val="0"/>
+              <w:spacing w:before="0" w:after="0" w:line="252" w:lineRule="auto"/>
+              <w:jc w:val="left"/>
+            </w:pPr>
             <w:r>
+              <w:rPr>
+                <w:color w:val="000000"/>
+                <w:sz w:val="20"/>
+              </w:rPr>
               <w:t>200 {user}; 401 invalid credentials</w:t>
             </w:r>
           </w:p>
         </w:tc>
         <w:tc>
           <w:tcPr>
-            <w:tcW w:w="2016" w:type="dxa"/>
+            <w:tcW w:w="1656" w:type="dxa"/>
+            <w:vAlign w:val="center"/>
           </w:tcPr>
           <w:p>
+            <w:pPr>
+              <w:keepNext w:val="0"/>
+              <w:spacing w:before="0" w:after="0" w:line="252" w:lineRule="auto"/>
+              <w:jc w:val="left"/>
+            </w:pPr>
             <w:r>
+              <w:rPr>
+                <w:color w:val="000000"/>
+                <w:sz w:val="20"/>
+              </w:rPr>
               <w:t>AUTH-FR-01</w:t>
             </w:r>
           </w:p>
@@ -1966,53 +3289,104 @@
       <w:tr>
         <w:trPr>
           <w:jc w:val="center"/>
+          <w:cantSplit/>
         </w:trPr>
         <w:tc>
           <w:tcPr>
-            <w:tcW w:w="2016" w:type="dxa"/>
+            <w:tcW w:w="720" w:type="dxa"/>
+            <w:vAlign w:val="center"/>
           </w:tcPr>
           <w:p>
+            <w:pPr>
+              <w:keepNext w:val="0"/>
+              <w:spacing w:before="0" w:after="0" w:line="252" w:lineRule="auto"/>
+              <w:jc w:val="left"/>
+            </w:pPr>
             <w:r>
+              <w:rPr>
+                <w:color w:val="000000"/>
+                <w:sz w:val="20"/>
+              </w:rPr>
               <w:t>POST</w:t>
             </w:r>
           </w:p>
         </w:tc>
         <w:tc>
           <w:tcPr>
-            <w:tcW w:w="2016" w:type="dxa"/>
+            <w:tcW w:w="2304" w:type="dxa"/>
+            <w:vAlign w:val="center"/>
           </w:tcPr>
           <w:p>
+            <w:pPr>
+              <w:keepNext w:val="0"/>
+              <w:spacing w:before="0" w:after="0" w:line="252" w:lineRule="auto"/>
+              <w:jc w:val="left"/>
+            </w:pPr>
             <w:r>
+              <w:rPr>
+                <w:color w:val="000000"/>
+                <w:sz w:val="20"/>
+              </w:rPr>
               <w:t>/api/auth/logout</w:t>
             </w:r>
           </w:p>
         </w:tc>
         <w:tc>
           <w:tcPr>
-            <w:tcW w:w="2016" w:type="dxa"/>
+            <w:tcW w:w="2160" w:type="dxa"/>
+            <w:vAlign w:val="center"/>
           </w:tcPr>
           <w:p>
+            <w:pPr>
+              <w:keepNext w:val="0"/>
+              <w:spacing w:before="0" w:after="0" w:line="252" w:lineRule="auto"/>
+              <w:jc w:val="left"/>
+            </w:pPr>
             <w:r>
+              <w:rPr>
+                <w:color w:val="000000"/>
+                <w:sz w:val="20"/>
+              </w:rPr>
               <w:t>none / auth context</w:t>
             </w:r>
           </w:p>
         </w:tc>
         <w:tc>
           <w:tcPr>
-            <w:tcW w:w="2016" w:type="dxa"/>
+            <w:tcW w:w="3240" w:type="dxa"/>
+            <w:vAlign w:val="center"/>
           </w:tcPr>
           <w:p>
+            <w:pPr>
+              <w:keepNext w:val="0"/>
+              <w:spacing w:before="0" w:after="0" w:line="252" w:lineRule="auto"/>
+              <w:jc w:val="left"/>
+            </w:pPr>
             <w:r>
+              <w:rPr>
+                <w:color w:val="000000"/>
+                <w:sz w:val="20"/>
+              </w:rPr>
               <w:t>200 success</w:t>
             </w:r>
           </w:p>
         </w:tc>
         <w:tc>
           <w:tcPr>
-            <w:tcW w:w="2016" w:type="dxa"/>
+            <w:tcW w:w="1656" w:type="dxa"/>
+            <w:vAlign w:val="center"/>
           </w:tcPr>
           <w:p>
+            <w:pPr>
+              <w:keepNext w:val="0"/>
+              <w:spacing w:before="0" w:after="0" w:line="252" w:lineRule="auto"/>
+              <w:jc w:val="left"/>
+            </w:pPr>
             <w:r>
+              <w:rPr>
+                <w:color w:val="000000"/>
+                <w:sz w:val="20"/>
+              </w:rPr>
               <w:t>AUTH-FR-02</w:t>
             </w:r>
           </w:p>
@@ -2021,53 +3395,104 @@
       <w:tr>
         <w:trPr>
           <w:jc w:val="center"/>
+          <w:cantSplit/>
         </w:trPr>
         <w:tc>
           <w:tcPr>
-            <w:tcW w:w="2016" w:type="dxa"/>
+            <w:tcW w:w="720" w:type="dxa"/>
+            <w:vAlign w:val="center"/>
           </w:tcPr>
           <w:p>
+            <w:pPr>
+              <w:keepNext w:val="0"/>
+              <w:spacing w:before="0" w:after="0" w:line="252" w:lineRule="auto"/>
+              <w:jc w:val="left"/>
+            </w:pPr>
             <w:r>
+              <w:rPr>
+                <w:color w:val="000000"/>
+                <w:sz w:val="20"/>
+              </w:rPr>
               <w:t>POST</w:t>
             </w:r>
           </w:p>
         </w:tc>
         <w:tc>
           <w:tcPr>
-            <w:tcW w:w="2016" w:type="dxa"/>
+            <w:tcW w:w="2304" w:type="dxa"/>
+            <w:vAlign w:val="center"/>
           </w:tcPr>
           <w:p>
+            <w:pPr>
+              <w:keepNext w:val="0"/>
+              <w:spacing w:before="0" w:after="0" w:line="252" w:lineRule="auto"/>
+              <w:jc w:val="left"/>
+            </w:pPr>
             <w:r>
+              <w:rPr>
+                <w:color w:val="000000"/>
+                <w:sz w:val="20"/>
+              </w:rPr>
               <w:t>/api/exams</w:t>
             </w:r>
           </w:p>
         </w:tc>
         <w:tc>
           <w:tcPr>
-            <w:tcW w:w="2016" w:type="dxa"/>
+            <w:tcW w:w="2160" w:type="dxa"/>
+            <w:vAlign w:val="center"/>
           </w:tcPr>
           <w:p>
+            <w:pPr>
+              <w:keepNext w:val="0"/>
+              <w:spacing w:before="0" w:after="0" w:line="252" w:lineRule="auto"/>
+              <w:jc w:val="left"/>
+            </w:pPr>
             <w:r>
+              <w:rPr>
+                <w:color w:val="000000"/>
+                <w:sz w:val="20"/>
+              </w:rPr>
               <w:t>{title, description, startTime, duration}</w:t>
             </w:r>
           </w:p>
         </w:tc>
         <w:tc>
           <w:tcPr>
-            <w:tcW w:w="2016" w:type="dxa"/>
+            <w:tcW w:w="3240" w:type="dxa"/>
+            <w:vAlign w:val="center"/>
           </w:tcPr>
           <w:p>
+            <w:pPr>
+              <w:keepNext w:val="0"/>
+              <w:spacing w:before="0" w:after="0" w:line="252" w:lineRule="auto"/>
+              <w:jc w:val="left"/>
+            </w:pPr>
             <w:r>
+              <w:rPr>
+                <w:color w:val="000000"/>
+                <w:sz w:val="20"/>
+              </w:rPr>
               <w:t>201 {exam}; 400/403 on invalid/unauthorized</w:t>
             </w:r>
           </w:p>
         </w:tc>
         <w:tc>
           <w:tcPr>
-            <w:tcW w:w="2016" w:type="dxa"/>
+            <w:tcW w:w="1656" w:type="dxa"/>
+            <w:vAlign w:val="center"/>
           </w:tcPr>
           <w:p>
+            <w:pPr>
+              <w:keepNext w:val="0"/>
+              <w:spacing w:before="0" w:after="0" w:line="252" w:lineRule="auto"/>
+              <w:jc w:val="left"/>
+            </w:pPr>
             <w:r>
+              <w:rPr>
+                <w:color w:val="000000"/>
+                <w:sz w:val="20"/>
+              </w:rPr>
               <w:t>EXAM-FR-01</w:t>
             </w:r>
           </w:p>
@@ -2076,53 +3501,104 @@
       <w:tr>
         <w:trPr>
           <w:jc w:val="center"/>
+          <w:cantSplit/>
         </w:trPr>
         <w:tc>
           <w:tcPr>
-            <w:tcW w:w="2016" w:type="dxa"/>
+            <w:tcW w:w="720" w:type="dxa"/>
+            <w:vAlign w:val="center"/>
           </w:tcPr>
           <w:p>
+            <w:pPr>
+              <w:keepNext w:val="0"/>
+              <w:spacing w:before="0" w:after="0" w:line="252" w:lineRule="auto"/>
+              <w:jc w:val="left"/>
+            </w:pPr>
             <w:r>
+              <w:rPr>
+                <w:color w:val="000000"/>
+                <w:sz w:val="20"/>
+              </w:rPr>
               <w:t>PUT</w:t>
             </w:r>
           </w:p>
         </w:tc>
         <w:tc>
           <w:tcPr>
-            <w:tcW w:w="2016" w:type="dxa"/>
+            <w:tcW w:w="2304" w:type="dxa"/>
+            <w:vAlign w:val="center"/>
           </w:tcPr>
           <w:p>
+            <w:pPr>
+              <w:keepNext w:val="0"/>
+              <w:spacing w:before="0" w:after="0" w:line="252" w:lineRule="auto"/>
+              <w:jc w:val="left"/>
+            </w:pPr>
             <w:r>
+              <w:rPr>
+                <w:color w:val="000000"/>
+                <w:sz w:val="20"/>
+              </w:rPr>
               <w:t>/api/exams/:id</w:t>
             </w:r>
           </w:p>
         </w:tc>
         <w:tc>
           <w:tcPr>
-            <w:tcW w:w="2016" w:type="dxa"/>
+            <w:tcW w:w="2160" w:type="dxa"/>
+            <w:vAlign w:val="center"/>
           </w:tcPr>
           <w:p>
+            <w:pPr>
+              <w:keepNext w:val="0"/>
+              <w:spacing w:before="0" w:after="0" w:line="252" w:lineRule="auto"/>
+              <w:jc w:val="left"/>
+            </w:pPr>
             <w:r>
+              <w:rPr>
+                <w:color w:val="000000"/>
+                <w:sz w:val="20"/>
+              </w:rPr>
               <w:t>editable draft fields</w:t>
             </w:r>
           </w:p>
         </w:tc>
         <w:tc>
           <w:tcPr>
-            <w:tcW w:w="2016" w:type="dxa"/>
+            <w:tcW w:w="3240" w:type="dxa"/>
+            <w:vAlign w:val="center"/>
           </w:tcPr>
           <w:p>
+            <w:pPr>
+              <w:keepNext w:val="0"/>
+              <w:spacing w:before="0" w:after="0" w:line="252" w:lineRule="auto"/>
+              <w:jc w:val="left"/>
+            </w:pPr>
             <w:r>
+              <w:rPr>
+                <w:color w:val="000000"/>
+                <w:sz w:val="20"/>
+              </w:rPr>
               <w:t>200 {exam}; 403/409 if non-owner/non-draft</w:t>
             </w:r>
           </w:p>
         </w:tc>
         <w:tc>
           <w:tcPr>
-            <w:tcW w:w="2016" w:type="dxa"/>
+            <w:tcW w:w="1656" w:type="dxa"/>
+            <w:vAlign w:val="center"/>
           </w:tcPr>
           <w:p>
+            <w:pPr>
+              <w:keepNext w:val="0"/>
+              <w:spacing w:before="0" w:after="0" w:line="252" w:lineRule="auto"/>
+              <w:jc w:val="left"/>
+            </w:pPr>
             <w:r>
+              <w:rPr>
+                <w:color w:val="000000"/>
+                <w:sz w:val="20"/>
+              </w:rPr>
               <w:t>EXAM-FR-02</w:t>
             </w:r>
           </w:p>
@@ -2131,53 +3607,104 @@
       <w:tr>
         <w:trPr>
           <w:jc w:val="center"/>
+          <w:cantSplit/>
         </w:trPr>
         <w:tc>
           <w:tcPr>
-            <w:tcW w:w="2016" w:type="dxa"/>
+            <w:tcW w:w="720" w:type="dxa"/>
+            <w:vAlign w:val="center"/>
           </w:tcPr>
           <w:p>
+            <w:pPr>
+              <w:keepNext w:val="0"/>
+              <w:spacing w:before="0" w:after="0" w:line="252" w:lineRule="auto"/>
+              <w:jc w:val="left"/>
+            </w:pPr>
             <w:r>
+              <w:rPr>
+                <w:color w:val="000000"/>
+                <w:sz w:val="20"/>
+              </w:rPr>
               <w:t>POST</w:t>
             </w:r>
           </w:p>
         </w:tc>
         <w:tc>
           <w:tcPr>
-            <w:tcW w:w="2016" w:type="dxa"/>
+            <w:tcW w:w="2304" w:type="dxa"/>
+            <w:vAlign w:val="center"/>
           </w:tcPr>
           <w:p>
+            <w:pPr>
+              <w:keepNext w:val="0"/>
+              <w:spacing w:before="0" w:after="0" w:line="252" w:lineRule="auto"/>
+              <w:jc w:val="left"/>
+            </w:pPr>
             <w:r>
+              <w:rPr>
+                <w:color w:val="000000"/>
+                <w:sz w:val="20"/>
+              </w:rPr>
               <w:t>/api/exams/:id/publish</w:t>
             </w:r>
           </w:p>
         </w:tc>
         <w:tc>
           <w:tcPr>
-            <w:tcW w:w="2016" w:type="dxa"/>
+            <w:tcW w:w="2160" w:type="dxa"/>
+            <w:vAlign w:val="center"/>
           </w:tcPr>
           <w:p>
+            <w:pPr>
+              <w:keepNext w:val="0"/>
+              <w:spacing w:before="0" w:after="0" w:line="252" w:lineRule="auto"/>
+              <w:jc w:val="left"/>
+            </w:pPr>
             <w:r>
+              <w:rPr>
+                <w:color w:val="000000"/>
+                <w:sz w:val="20"/>
+              </w:rPr>
               <w:t>none</w:t>
             </w:r>
           </w:p>
         </w:tc>
         <w:tc>
           <w:tcPr>
-            <w:tcW w:w="2016" w:type="dxa"/>
+            <w:tcW w:w="3240" w:type="dxa"/>
+            <w:vAlign w:val="center"/>
           </w:tcPr>
           <w:p>
+            <w:pPr>
+              <w:keepNext w:val="0"/>
+              <w:spacing w:before="0" w:after="0" w:line="252" w:lineRule="auto"/>
+              <w:jc w:val="left"/>
+            </w:pPr>
             <w:r>
+              <w:rPr>
+                <w:color w:val="000000"/>
+                <w:sz w:val="20"/>
+              </w:rPr>
               <w:t>200 published exam; 400 if invalid</w:t>
             </w:r>
           </w:p>
         </w:tc>
         <w:tc>
           <w:tcPr>
-            <w:tcW w:w="2016" w:type="dxa"/>
+            <w:tcW w:w="1656" w:type="dxa"/>
+            <w:vAlign w:val="center"/>
           </w:tcPr>
           <w:p>
+            <w:pPr>
+              <w:keepNext w:val="0"/>
+              <w:spacing w:before="0" w:after="0" w:line="252" w:lineRule="auto"/>
+              <w:jc w:val="left"/>
+            </w:pPr>
             <w:r>
+              <w:rPr>
+                <w:color w:val="000000"/>
+                <w:sz w:val="20"/>
+              </w:rPr>
               <w:t>EXAM-FR-04</w:t>
             </w:r>
           </w:p>
@@ -2186,53 +3713,104 @@
       <w:tr>
         <w:trPr>
           <w:jc w:val="center"/>
+          <w:cantSplit/>
         </w:trPr>
         <w:tc>
           <w:tcPr>
-            <w:tcW w:w="2016" w:type="dxa"/>
+            <w:tcW w:w="720" w:type="dxa"/>
+            <w:vAlign w:val="center"/>
           </w:tcPr>
           <w:p>
+            <w:pPr>
+              <w:keepNext w:val="0"/>
+              <w:spacing w:before="0" w:after="0" w:line="252" w:lineRule="auto"/>
+              <w:jc w:val="left"/>
+            </w:pPr>
             <w:r>
+              <w:rPr>
+                <w:color w:val="000000"/>
+                <w:sz w:val="20"/>
+              </w:rPr>
               <w:t>POST</w:t>
             </w:r>
           </w:p>
         </w:tc>
         <w:tc>
           <w:tcPr>
-            <w:tcW w:w="2016" w:type="dxa"/>
+            <w:tcW w:w="2304" w:type="dxa"/>
+            <w:vAlign w:val="center"/>
           </w:tcPr>
           <w:p>
+            <w:pPr>
+              <w:keepNext w:val="0"/>
+              <w:spacing w:before="0" w:after="0" w:line="252" w:lineRule="auto"/>
+              <w:jc w:val="left"/>
+            </w:pPr>
             <w:r>
+              <w:rPr>
+                <w:color w:val="000000"/>
+                <w:sz w:val="20"/>
+              </w:rPr>
               <w:t>/api/exams/:examId/questions</w:t>
             </w:r>
           </w:p>
         </w:tc>
         <w:tc>
           <w:tcPr>
-            <w:tcW w:w="2016" w:type="dxa"/>
+            <w:tcW w:w="2160" w:type="dxa"/>
+            <w:vAlign w:val="center"/>
           </w:tcPr>
           <w:p>
+            <w:pPr>
+              <w:keepNext w:val="0"/>
+              <w:spacing w:before="0" w:after="0" w:line="252" w:lineRule="auto"/>
+              <w:jc w:val="left"/>
+            </w:pPr>
             <w:r>
-              <w:t>{questionText, options, correctOption, marks}</w:t>
+              <w:rPr>
+                <w:color w:val="000000"/>
+                <w:sz w:val="20"/>
+              </w:rPr>
+              <w:t>{questionText, options, correctOption}; fixed +1/0 scoring</w:t>
             </w:r>
           </w:p>
         </w:tc>
         <w:tc>
           <w:tcPr>
-            <w:tcW w:w="2016" w:type="dxa"/>
+            <w:tcW w:w="3240" w:type="dxa"/>
+            <w:vAlign w:val="center"/>
           </w:tcPr>
           <w:p>
+            <w:pPr>
+              <w:keepNext w:val="0"/>
+              <w:spacing w:before="0" w:after="0" w:line="252" w:lineRule="auto"/>
+              <w:jc w:val="left"/>
+            </w:pPr>
             <w:r>
+              <w:rPr>
+                <w:color w:val="000000"/>
+                <w:sz w:val="20"/>
+              </w:rPr>
               <w:t>201 {question}; 400/403 on failure</w:t>
             </w:r>
           </w:p>
         </w:tc>
         <w:tc>
           <w:tcPr>
-            <w:tcW w:w="2016" w:type="dxa"/>
+            <w:tcW w:w="1656" w:type="dxa"/>
+            <w:vAlign w:val="center"/>
           </w:tcPr>
           <w:p>
+            <w:pPr>
+              <w:keepNext w:val="0"/>
+              <w:spacing w:before="0" w:after="0" w:line="252" w:lineRule="auto"/>
+              <w:jc w:val="left"/>
+            </w:pPr>
             <w:r>
+              <w:rPr>
+                <w:color w:val="000000"/>
+                <w:sz w:val="20"/>
+              </w:rPr>
               <w:t>QUES-FR-01</w:t>
             </w:r>
           </w:p>
@@ -2241,53 +3819,104 @@
       <w:tr>
         <w:trPr>
           <w:jc w:val="center"/>
+          <w:cantSplit/>
         </w:trPr>
         <w:tc>
           <w:tcPr>
-            <w:tcW w:w="2016" w:type="dxa"/>
+            <w:tcW w:w="720" w:type="dxa"/>
+            <w:vAlign w:val="center"/>
           </w:tcPr>
           <w:p>
+            <w:pPr>
+              <w:keepNext w:val="0"/>
+              <w:spacing w:before="0" w:after="0" w:line="252" w:lineRule="auto"/>
+              <w:jc w:val="left"/>
+            </w:pPr>
             <w:r>
+              <w:rPr>
+                <w:color w:val="000000"/>
+                <w:sz w:val="20"/>
+              </w:rPr>
               <w:t>POST</w:t>
             </w:r>
           </w:p>
         </w:tc>
         <w:tc>
           <w:tcPr>
-            <w:tcW w:w="2016" w:type="dxa"/>
+            <w:tcW w:w="2304" w:type="dxa"/>
+            <w:vAlign w:val="center"/>
           </w:tcPr>
           <w:p>
+            <w:pPr>
+              <w:keepNext w:val="0"/>
+              <w:spacing w:before="0" w:after="0" w:line="252" w:lineRule="auto"/>
+              <w:jc w:val="left"/>
+            </w:pPr>
             <w:r>
+              <w:rPr>
+                <w:color w:val="000000"/>
+                <w:sz w:val="20"/>
+              </w:rPr>
               <w:t>/api/exams/:examId/attempts</w:t>
             </w:r>
           </w:p>
         </w:tc>
         <w:tc>
           <w:tcPr>
-            <w:tcW w:w="2016" w:type="dxa"/>
+            <w:tcW w:w="2160" w:type="dxa"/>
+            <w:vAlign w:val="center"/>
           </w:tcPr>
           <w:p>
+            <w:pPr>
+              <w:keepNext w:val="0"/>
+              <w:spacing w:before="0" w:after="0" w:line="252" w:lineRule="auto"/>
+              <w:jc w:val="left"/>
+            </w:pPr>
             <w:r>
+              <w:rPr>
+                <w:color w:val="000000"/>
+                <w:sz w:val="20"/>
+              </w:rPr>
               <w:t>none</w:t>
             </w:r>
           </w:p>
         </w:tc>
         <w:tc>
           <w:tcPr>
-            <w:tcW w:w="2016" w:type="dxa"/>
+            <w:tcW w:w="3240" w:type="dxa"/>
+            <w:vAlign w:val="center"/>
           </w:tcPr>
           <w:p>
+            <w:pPr>
+              <w:keepNext w:val="0"/>
+              <w:spacing w:before="0" w:after="0" w:line="252" w:lineRule="auto"/>
+              <w:jc w:val="left"/>
+            </w:pPr>
             <w:r>
+              <w:rPr>
+                <w:color w:val="000000"/>
+                <w:sz w:val="20"/>
+              </w:rPr>
               <w:t>201 {attempt, questionsWithoutAnswers}</w:t>
             </w:r>
           </w:p>
         </w:tc>
         <w:tc>
           <w:tcPr>
-            <w:tcW w:w="2016" w:type="dxa"/>
+            <w:tcW w:w="1656" w:type="dxa"/>
+            <w:vAlign w:val="center"/>
           </w:tcPr>
           <w:p>
+            <w:pPr>
+              <w:keepNext w:val="0"/>
+              <w:spacing w:before="0" w:after="0" w:line="252" w:lineRule="auto"/>
+              <w:jc w:val="left"/>
+            </w:pPr>
             <w:r>
+              <w:rPr>
+                <w:color w:val="000000"/>
+                <w:sz w:val="20"/>
+              </w:rPr>
               <w:t>ATT-FR-02</w:t>
             </w:r>
           </w:p>
@@ -2296,53 +3925,104 @@
       <w:tr>
         <w:trPr>
           <w:jc w:val="center"/>
+          <w:cantSplit/>
         </w:trPr>
         <w:tc>
           <w:tcPr>
-            <w:tcW w:w="2016" w:type="dxa"/>
+            <w:tcW w:w="720" w:type="dxa"/>
+            <w:vAlign w:val="center"/>
           </w:tcPr>
           <w:p>
+            <w:pPr>
+              <w:keepNext w:val="0"/>
+              <w:spacing w:before="0" w:after="0" w:line="252" w:lineRule="auto"/>
+              <w:jc w:val="left"/>
+            </w:pPr>
             <w:r>
+              <w:rPr>
+                <w:color w:val="000000"/>
+                <w:sz w:val="20"/>
+              </w:rPr>
               <w:t>PUT</w:t>
             </w:r>
           </w:p>
         </w:tc>
         <w:tc>
           <w:tcPr>
-            <w:tcW w:w="2016" w:type="dxa"/>
+            <w:tcW w:w="2304" w:type="dxa"/>
+            <w:vAlign w:val="center"/>
           </w:tcPr>
           <w:p>
+            <w:pPr>
+              <w:keepNext w:val="0"/>
+              <w:spacing w:before="0" w:after="0" w:line="252" w:lineRule="auto"/>
+              <w:jc w:val="left"/>
+            </w:pPr>
             <w:r>
+              <w:rPr>
+                <w:color w:val="000000"/>
+                <w:sz w:val="20"/>
+              </w:rPr>
               <w:t>/api/attempts/:id/responses</w:t>
             </w:r>
           </w:p>
         </w:tc>
         <w:tc>
           <w:tcPr>
-            <w:tcW w:w="2016" w:type="dxa"/>
+            <w:tcW w:w="2160" w:type="dxa"/>
+            <w:vAlign w:val="center"/>
           </w:tcPr>
           <w:p>
+            <w:pPr>
+              <w:keepNext w:val="0"/>
+              <w:spacing w:before="0" w:after="0" w:line="252" w:lineRule="auto"/>
+              <w:jc w:val="left"/>
+            </w:pPr>
             <w:r>
+              <w:rPr>
+                <w:color w:val="000000"/>
+                <w:sz w:val="20"/>
+              </w:rPr>
               <w:t>{questionId, selectedOption}</w:t>
             </w:r>
           </w:p>
         </w:tc>
         <w:tc>
           <w:tcPr>
-            <w:tcW w:w="2016" w:type="dxa"/>
+            <w:tcW w:w="3240" w:type="dxa"/>
+            <w:vAlign w:val="center"/>
           </w:tcPr>
           <w:p>
+            <w:pPr>
+              <w:keepNext w:val="0"/>
+              <w:spacing w:before="0" w:after="0" w:line="252" w:lineRule="auto"/>
+              <w:jc w:val="left"/>
+            </w:pPr>
             <w:r>
+              <w:rPr>
+                <w:color w:val="000000"/>
+                <w:sz w:val="20"/>
+              </w:rPr>
               <w:t>200 saved response</w:t>
             </w:r>
           </w:p>
         </w:tc>
         <w:tc>
           <w:tcPr>
-            <w:tcW w:w="2016" w:type="dxa"/>
+            <w:tcW w:w="1656" w:type="dxa"/>
+            <w:vAlign w:val="center"/>
           </w:tcPr>
           <w:p>
+            <w:pPr>
+              <w:keepNext w:val="0"/>
+              <w:spacing w:before="0" w:after="0" w:line="252" w:lineRule="auto"/>
+              <w:jc w:val="left"/>
+            </w:pPr>
             <w:r>
+              <w:rPr>
+                <w:color w:val="000000"/>
+                <w:sz w:val="20"/>
+              </w:rPr>
               <w:t>ATT-FR-03</w:t>
             </w:r>
           </w:p>
@@ -2351,53 +4031,104 @@
       <w:tr>
         <w:trPr>
           <w:jc w:val="center"/>
+          <w:cantSplit/>
         </w:trPr>
         <w:tc>
           <w:tcPr>
-            <w:tcW w:w="2016" w:type="dxa"/>
+            <w:tcW w:w="720" w:type="dxa"/>
+            <w:vAlign w:val="center"/>
           </w:tcPr>
           <w:p>
+            <w:pPr>
+              <w:keepNext w:val="0"/>
+              <w:spacing w:before="0" w:after="0" w:line="252" w:lineRule="auto"/>
+              <w:jc w:val="left"/>
+            </w:pPr>
             <w:r>
+              <w:rPr>
+                <w:color w:val="000000"/>
+                <w:sz w:val="20"/>
+              </w:rPr>
               <w:t>POST</w:t>
             </w:r>
           </w:p>
         </w:tc>
         <w:tc>
           <w:tcPr>
-            <w:tcW w:w="2016" w:type="dxa"/>
+            <w:tcW w:w="2304" w:type="dxa"/>
+            <w:vAlign w:val="center"/>
           </w:tcPr>
           <w:p>
+            <w:pPr>
+              <w:keepNext w:val="0"/>
+              <w:spacing w:before="0" w:after="0" w:line="252" w:lineRule="auto"/>
+              <w:jc w:val="left"/>
+            </w:pPr>
             <w:r>
+              <w:rPr>
+                <w:color w:val="000000"/>
+                <w:sz w:val="20"/>
+              </w:rPr>
               <w:t>/api/attempts/:id/submit</w:t>
             </w:r>
           </w:p>
         </w:tc>
         <w:tc>
           <w:tcPr>
-            <w:tcW w:w="2016" w:type="dxa"/>
+            <w:tcW w:w="2160" w:type="dxa"/>
+            <w:vAlign w:val="center"/>
           </w:tcPr>
           <w:p>
+            <w:pPr>
+              <w:keepNext w:val="0"/>
+              <w:spacing w:before="0" w:after="0" w:line="252" w:lineRule="auto"/>
+              <w:jc w:val="left"/>
+            </w:pPr>
             <w:r>
+              <w:rPr>
+                <w:color w:val="000000"/>
+                <w:sz w:val="20"/>
+              </w:rPr>
               <w:t>none</w:t>
             </w:r>
           </w:p>
         </w:tc>
         <w:tc>
           <w:tcPr>
-            <w:tcW w:w="2016" w:type="dxa"/>
+            <w:tcW w:w="3240" w:type="dxa"/>
+            <w:vAlign w:val="center"/>
           </w:tcPr>
           <w:p>
+            <w:pPr>
+              <w:keepNext w:val="0"/>
+              <w:spacing w:before="0" w:after="0" w:line="252" w:lineRule="auto"/>
+              <w:jc w:val="left"/>
+            </w:pPr>
             <w:r>
-              <w:t>200 {score/result}; 409 if already expired/submitted</w:t>
+              <w:rPr>
+                <w:color w:val="000000"/>
+                <w:sz w:val="20"/>
+              </w:rPr>
+              <w:t>200 persisted submitted/result-or-pending outcome; repeated/racing finalization is idempotent</w:t>
             </w:r>
           </w:p>
         </w:tc>
         <w:tc>
           <w:tcPr>
-            <w:tcW w:w="2016" w:type="dxa"/>
+            <w:tcW w:w="1656" w:type="dxa"/>
+            <w:vAlign w:val="center"/>
           </w:tcPr>
           <w:p>
+            <w:pPr>
+              <w:keepNext w:val="0"/>
+              <w:spacing w:before="0" w:after="0" w:line="252" w:lineRule="auto"/>
+              <w:jc w:val="left"/>
+            </w:pPr>
             <w:r>
+              <w:rPr>
+                <w:color w:val="000000"/>
+                <w:sz w:val="20"/>
+              </w:rPr>
               <w:t>ATT-FR-05/06, EVAL-FR-01/02</w:t>
             </w:r>
           </w:p>
@@ -2406,53 +4137,104 @@
       <w:tr>
         <w:trPr>
           <w:jc w:val="center"/>
+          <w:cantSplit/>
         </w:trPr>
         <w:tc>
           <w:tcPr>
-            <w:tcW w:w="2016" w:type="dxa"/>
+            <w:tcW w:w="720" w:type="dxa"/>
+            <w:vAlign w:val="center"/>
           </w:tcPr>
           <w:p>
+            <w:pPr>
+              <w:keepNext w:val="0"/>
+              <w:spacing w:before="0" w:after="0" w:line="252" w:lineRule="auto"/>
+              <w:jc w:val="left"/>
+            </w:pPr>
             <w:r>
+              <w:rPr>
+                <w:color w:val="000000"/>
+                <w:sz w:val="20"/>
+              </w:rPr>
               <w:t>GET</w:t>
             </w:r>
           </w:p>
         </w:tc>
         <w:tc>
           <w:tcPr>
-            <w:tcW w:w="2016" w:type="dxa"/>
+            <w:tcW w:w="2304" w:type="dxa"/>
+            <w:vAlign w:val="center"/>
           </w:tcPr>
           <w:p>
+            <w:pPr>
+              <w:keepNext w:val="0"/>
+              <w:spacing w:before="0" w:after="0" w:line="252" w:lineRule="auto"/>
+              <w:jc w:val="left"/>
+            </w:pPr>
             <w:r>
+              <w:rPr>
+                <w:color w:val="000000"/>
+                <w:sz w:val="20"/>
+              </w:rPr>
               <w:t>/api/results/me</w:t>
             </w:r>
           </w:p>
         </w:tc>
         <w:tc>
           <w:tcPr>
-            <w:tcW w:w="2016" w:type="dxa"/>
+            <w:tcW w:w="2160" w:type="dxa"/>
+            <w:vAlign w:val="center"/>
           </w:tcPr>
           <w:p>
+            <w:pPr>
+              <w:keepNext w:val="0"/>
+              <w:spacing w:before="0" w:after="0" w:line="252" w:lineRule="auto"/>
+              <w:jc w:val="left"/>
+            </w:pPr>
             <w:r>
+              <w:rPr>
+                <w:color w:val="000000"/>
+                <w:sz w:val="20"/>
+              </w:rPr>
               <w:t>none</w:t>
             </w:r>
           </w:p>
         </w:tc>
         <w:tc>
           <w:tcPr>
-            <w:tcW w:w="2016" w:type="dxa"/>
+            <w:tcW w:w="3240" w:type="dxa"/>
+            <w:vAlign w:val="center"/>
           </w:tcPr>
           <w:p>
+            <w:pPr>
+              <w:keepNext w:val="0"/>
+              <w:spacing w:before="0" w:after="0" w:line="252" w:lineRule="auto"/>
+              <w:jc w:val="left"/>
+            </w:pPr>
             <w:r>
+              <w:rPr>
+                <w:color w:val="000000"/>
+                <w:sz w:val="20"/>
+              </w:rPr>
               <w:t>200 own result list</w:t>
             </w:r>
           </w:p>
         </w:tc>
         <w:tc>
           <w:tcPr>
-            <w:tcW w:w="2016" w:type="dxa"/>
+            <w:tcW w:w="1656" w:type="dxa"/>
+            <w:vAlign w:val="center"/>
           </w:tcPr>
           <w:p>
+            <w:pPr>
+              <w:keepNext w:val="0"/>
+              <w:spacing w:before="0" w:after="0" w:line="252" w:lineRule="auto"/>
+              <w:jc w:val="left"/>
+            </w:pPr>
             <w:r>
+              <w:rPr>
+                <w:color w:val="000000"/>
+                <w:sz w:val="20"/>
+              </w:rPr>
               <w:t>RES-FR-01</w:t>
             </w:r>
           </w:p>
@@ -2461,53 +4243,104 @@
       <w:tr>
         <w:trPr>
           <w:jc w:val="center"/>
+          <w:cantSplit/>
         </w:trPr>
         <w:tc>
           <w:tcPr>
-            <w:tcW w:w="2016" w:type="dxa"/>
+            <w:tcW w:w="720" w:type="dxa"/>
+            <w:vAlign w:val="center"/>
           </w:tcPr>
           <w:p>
+            <w:pPr>
+              <w:keepNext w:val="0"/>
+              <w:spacing w:before="0" w:after="0" w:line="252" w:lineRule="auto"/>
+              <w:jc w:val="left"/>
+            </w:pPr>
             <w:r>
+              <w:rPr>
+                <w:color w:val="000000"/>
+                <w:sz w:val="20"/>
+              </w:rPr>
               <w:t>GET</w:t>
             </w:r>
           </w:p>
         </w:tc>
         <w:tc>
           <w:tcPr>
-            <w:tcW w:w="2016" w:type="dxa"/>
+            <w:tcW w:w="2304" w:type="dxa"/>
+            <w:vAlign w:val="center"/>
           </w:tcPr>
           <w:p>
+            <w:pPr>
+              <w:keepNext w:val="0"/>
+              <w:spacing w:before="0" w:after="0" w:line="252" w:lineRule="auto"/>
+              <w:jc w:val="left"/>
+            </w:pPr>
             <w:r>
+              <w:rPr>
+                <w:color w:val="000000"/>
+                <w:sz w:val="20"/>
+              </w:rPr>
               <w:t>/api/exams/:examId/results</w:t>
             </w:r>
           </w:p>
         </w:tc>
         <w:tc>
           <w:tcPr>
-            <w:tcW w:w="2016" w:type="dxa"/>
+            <w:tcW w:w="2160" w:type="dxa"/>
+            <w:vAlign w:val="center"/>
           </w:tcPr>
           <w:p>
+            <w:pPr>
+              <w:keepNext w:val="0"/>
+              <w:spacing w:before="0" w:after="0" w:line="252" w:lineRule="auto"/>
+              <w:jc w:val="left"/>
+            </w:pPr>
             <w:r>
+              <w:rPr>
+                <w:color w:val="000000"/>
+                <w:sz w:val="20"/>
+              </w:rPr>
               <w:t>none</w:t>
             </w:r>
           </w:p>
         </w:tc>
         <w:tc>
           <w:tcPr>
-            <w:tcW w:w="2016" w:type="dxa"/>
+            <w:tcW w:w="3240" w:type="dxa"/>
+            <w:vAlign w:val="center"/>
           </w:tcPr>
           <w:p>
+            <w:pPr>
+              <w:keepNext w:val="0"/>
+              <w:spacing w:before="0" w:after="0" w:line="252" w:lineRule="auto"/>
+              <w:jc w:val="left"/>
+            </w:pPr>
             <w:r>
+              <w:rPr>
+                <w:color w:val="000000"/>
+                <w:sz w:val="20"/>
+              </w:rPr>
               <w:t>200 owned-exam results; 403 otherwise</w:t>
             </w:r>
           </w:p>
         </w:tc>
         <w:tc>
           <w:tcPr>
-            <w:tcW w:w="2016" w:type="dxa"/>
+            <w:tcW w:w="1656" w:type="dxa"/>
+            <w:vAlign w:val="center"/>
           </w:tcPr>
           <w:p>
+            <w:pPr>
+              <w:keepNext w:val="0"/>
+              <w:spacing w:before="0" w:after="0" w:line="252" w:lineRule="auto"/>
+              <w:jc w:val="left"/>
+            </w:pPr>
             <w:r>
+              <w:rPr>
+                <w:color w:val="000000"/>
+                <w:sz w:val="20"/>
+              </w:rPr>
               <w:t>RES-FR-02</w:t>
             </w:r>
           </w:p>
@@ -2519,6 +4352,10 @@
         <w:pStyle w:val="Heading2"/>
       </w:pPr>
       <w:r>
+        <w:rPr>
+          <w:color w:val="000000"/>
+          <w:u w:val="none"/>
+        </w:rPr>
         <w:lastRenderedPageBreak/>
         <w:t>4.4 Error Handling, Logging &amp; Monitoring</w:t>
       </w:r>
@@ -2568,6 +4405,10 @@
         <w:pStyle w:val="Heading2"/>
       </w:pPr>
       <w:r>
+        <w:rPr>
+          <w:color w:val="000000"/>
+          <w:u w:val="none"/>
+        </w:rPr>
         <w:t>4.5 UX Design</w:t>
       </w:r>
     </w:p>
@@ -2616,6 +4457,10 @@
         <w:pStyle w:val="Heading2"/>
       </w:pPr>
       <w:r>
+        <w:rPr>
+          <w:color w:val="000000"/>
+          <w:u w:val="none"/>
+        </w:rPr>
         <w:t>4.6 Open Issues &amp; Next Steps</w:t>
       </w:r>
     </w:p>
@@ -2624,7 +4469,7 @@
         <w:pStyle w:val="ListBullet"/>
       </w:pPr>
       <w:r>
-        <w:t>Finalize authentication transport/session mechanism during Sprint 1.</w:t>
+        <w:t>Implement the required server-managed session mechanism in Sprint 1; record session store, cookie/CSRF settings and local CORS origins in #23/#24 PRs.</w:t>
       </w:r>
     </w:p>
     <w:p>
@@ -2644,6 +4489,11 @@
       </w:r>
     </w:p>
     <w:p>
+      <w:r>
+        <w:t>Keep fixed +1/0 scoring, one resumable attempt, immutable publication and server-driven browser-closed expiry consistent with the SRS and existing issues. Persist submission before evaluation; retry evaluation without reopening answers. Exact interfaces remain implementation handoffs, not completed code.</w:t>
+      </w:r>
+    </w:p>
+    <w:p>
       <w:pPr>
         <w:pStyle w:val="ListBullet"/>
       </w:pPr>
@@ -2656,6 +4506,10 @@
         <w:pStyle w:val="Heading1"/>
       </w:pPr>
       <w:r>
+        <w:rPr>
+          <w:color w:val="000000"/>
+          <w:u w:val="none"/>
+        </w:rPr>
         <w:t>5. Appendices</w:t>
       </w:r>
     </w:p>
@@ -3298,7 +5152,7 @@
       <w:rFonts w:asciiTheme="majorHAnsi" w:eastAsiaTheme="majorEastAsia" w:hAnsiTheme="majorHAnsi" w:cstheme="majorBidi"/>
       <w:b/>
       <w:bCs/>
-      <w:color w:val="365F91" w:themeColor="accent1" w:themeShade="BF"/>
+      <w:color w:val="000000"/>
       <w:sz w:val="28"/>
       <w:szCs w:val="28"/>
     </w:rPr>
@@ -3322,7 +5176,7 @@
       <w:rFonts w:asciiTheme="majorHAnsi" w:eastAsiaTheme="majorEastAsia" w:hAnsiTheme="majorHAnsi" w:cstheme="majorBidi"/>
       <w:b/>
       <w:bCs/>
-      <w:color w:val="4F81BD" w:themeColor="accent1"/>
+      <w:color w:val="000000"/>
       <w:sz w:val="26"/>
       <w:szCs w:val="26"/>
     </w:rPr>
@@ -3346,7 +5200,7 @@
       <w:rFonts w:asciiTheme="majorHAnsi" w:eastAsiaTheme="majorEastAsia" w:hAnsiTheme="majorHAnsi" w:cstheme="majorBidi"/>
       <w:b/>
       <w:bCs/>
-      <w:color w:val="4F81BD" w:themeColor="accent1"/>
+      <w:color w:val="000000"/>
     </w:rPr>
   </w:style>
   <w:style w:type="paragraph" w:styleId="Heading4">
@@ -3371,7 +5225,7 @@
       <w:bCs/>
       <w:i/>
       <w:iCs/>
-      <w:color w:val="4F81BD" w:themeColor="accent1"/>
+      <w:color w:val="000000"/>
     </w:rPr>
   </w:style>
   <w:style w:type="paragraph" w:styleId="Heading5">
@@ -3392,7 +5246,7 @@
     </w:pPr>
     <w:rPr>
       <w:rFonts w:asciiTheme="majorHAnsi" w:eastAsiaTheme="majorEastAsia" w:hAnsiTheme="majorHAnsi" w:cstheme="majorBidi"/>
-      <w:color w:val="243F60" w:themeColor="accent1" w:themeShade="7F"/>
+      <w:color w:val="000000"/>
     </w:rPr>
   </w:style>
   <w:style w:type="paragraph" w:styleId="Heading6">
@@ -3415,7 +5269,7 @@
       <w:rFonts w:asciiTheme="majorHAnsi" w:eastAsiaTheme="majorEastAsia" w:hAnsiTheme="majorHAnsi" w:cstheme="majorBidi"/>
       <w:i/>
       <w:iCs/>
-      <w:color w:val="243F60" w:themeColor="accent1" w:themeShade="7F"/>
+      <w:color w:val="000000"/>
     </w:rPr>
   </w:style>
   <w:style w:type="paragraph" w:styleId="Heading7">
@@ -3438,7 +5292,7 @@
       <w:rFonts w:asciiTheme="majorHAnsi" w:eastAsiaTheme="majorEastAsia" w:hAnsiTheme="majorHAnsi" w:cstheme="majorBidi"/>
       <w:i/>
       <w:iCs/>
-      <w:color w:val="404040" w:themeColor="text1" w:themeTint="BF"/>
+      <w:color w:val="000000"/>
     </w:rPr>
   </w:style>
   <w:style w:type="paragraph" w:styleId="Heading8">
@@ -3459,7 +5313,7 @@
     </w:pPr>
     <w:rPr>
       <w:rFonts w:asciiTheme="majorHAnsi" w:eastAsiaTheme="majorEastAsia" w:hAnsiTheme="majorHAnsi" w:cstheme="majorBidi"/>
-      <w:color w:val="4F81BD" w:themeColor="accent1"/>
+      <w:color w:val="000000"/>
       <w:szCs w:val="20"/>
     </w:rPr>
   </w:style>
@@ -3483,7 +5337,7 @@
       <w:rFonts w:asciiTheme="majorHAnsi" w:eastAsiaTheme="majorEastAsia" w:hAnsiTheme="majorHAnsi" w:cstheme="majorBidi"/>
       <w:i/>
       <w:iCs/>
-      <w:color w:val="404040" w:themeColor="text1" w:themeTint="BF"/>
+      <w:color w:val="000000"/>
       <w:szCs w:val="20"/>
     </w:rPr>
   </w:style>
@@ -3576,7 +5430,7 @@
       <w:rFonts w:asciiTheme="majorHAnsi" w:eastAsiaTheme="majorEastAsia" w:hAnsiTheme="majorHAnsi" w:cstheme="majorBidi"/>
       <w:b/>
       <w:bCs/>
-      <w:color w:val="365F91" w:themeColor="accent1" w:themeShade="BF"/>
+      <w:color w:val="000000"/>
       <w:sz w:val="28"/>
       <w:szCs w:val="28"/>
     </w:rPr>
@@ -3591,7 +5445,7 @@
       <w:rFonts w:asciiTheme="majorHAnsi" w:eastAsiaTheme="majorEastAsia" w:hAnsiTheme="majorHAnsi" w:cstheme="majorBidi"/>
       <w:b/>
       <w:bCs/>
-      <w:color w:val="4F81BD" w:themeColor="accent1"/>
+      <w:color w:val="000000"/>
       <w:sz w:val="26"/>
       <w:szCs w:val="26"/>
     </w:rPr>
@@ -3606,7 +5460,7 @@
       <w:rFonts w:asciiTheme="majorHAnsi" w:eastAsiaTheme="majorEastAsia" w:hAnsiTheme="majorHAnsi" w:cstheme="majorBidi"/>
       <w:b/>
       <w:bCs/>
-      <w:color w:val="4F81BD" w:themeColor="accent1"/>
+      <w:color w:val="000000"/>
     </w:rPr>
   </w:style>
   <w:style w:type="paragraph" w:styleId="Title">
@@ -3626,7 +5480,7 @@
     </w:pPr>
     <w:rPr>
       <w:rFonts w:asciiTheme="majorHAnsi" w:eastAsiaTheme="majorEastAsia" w:hAnsiTheme="majorHAnsi" w:cstheme="majorBidi"/>
-      <w:color w:val="17365D" w:themeColor="text2" w:themeShade="BF"/>
+      <w:color w:val="000000"/>
       <w:spacing w:val="5"/>
       <w:kern w:val="28"/>
       <w:sz w:val="52"/>
@@ -3981,7 +5835,7 @@
       <w:bCs/>
       <w:i/>
       <w:iCs/>
-      <w:color w:val="4F81BD" w:themeColor="accent1"/>
+      <w:color w:val="000000"/>
     </w:rPr>
   </w:style>
   <w:style w:type="character" w:customStyle="1" w:styleId="Heading5Char">
@@ -3993,7 +5847,7 @@
     <w:rsid w:val="00FC693F"/>
     <w:rPr>
       <w:rFonts w:asciiTheme="majorHAnsi" w:eastAsiaTheme="majorEastAsia" w:hAnsiTheme="majorHAnsi" w:cstheme="majorBidi"/>
-      <w:color w:val="243F60" w:themeColor="accent1" w:themeShade="7F"/>
+      <w:color w:val="000000"/>
     </w:rPr>
   </w:style>
   <w:style w:type="character" w:customStyle="1" w:styleId="Heading6Char">
@@ -4007,7 +5861,7 @@
       <w:rFonts w:asciiTheme="majorHAnsi" w:eastAsiaTheme="majorEastAsia" w:hAnsiTheme="majorHAnsi" w:cstheme="majorBidi"/>
       <w:i/>
       <w:iCs/>
-      <w:color w:val="243F60" w:themeColor="accent1" w:themeShade="7F"/>
+      <w:color w:val="000000"/>
     </w:rPr>
   </w:style>
   <w:style w:type="character" w:customStyle="1" w:styleId="Heading7Char">
@@ -4021,7 +5875,7 @@
       <w:rFonts w:asciiTheme="majorHAnsi" w:eastAsiaTheme="majorEastAsia" w:hAnsiTheme="majorHAnsi" w:cstheme="majorBidi"/>
       <w:i/>
       <w:iCs/>
-      <w:color w:val="404040" w:themeColor="text1" w:themeTint="BF"/>
+      <w:color w:val="000000"/>
     </w:rPr>
   </w:style>
   <w:style w:type="character" w:customStyle="1" w:styleId="Heading8Char">
@@ -4033,7 +5887,7 @@
     <w:rsid w:val="00FC693F"/>
     <w:rPr>
       <w:rFonts w:asciiTheme="majorHAnsi" w:eastAsiaTheme="majorEastAsia" w:hAnsiTheme="majorHAnsi" w:cstheme="majorBidi"/>
-      <w:color w:val="4F81BD" w:themeColor="accent1"/>
+      <w:color w:val="000000"/>
       <w:sz w:val="20"/>
       <w:szCs w:val="20"/>
     </w:rPr>
@@ -4049,7 +5903,7 @@
       <w:rFonts w:asciiTheme="majorHAnsi" w:eastAsiaTheme="majorEastAsia" w:hAnsiTheme="majorHAnsi" w:cstheme="majorBidi"/>
       <w:i/>
       <w:iCs/>
-      <w:color w:val="404040" w:themeColor="text1" w:themeTint="BF"/>
+      <w:color w:val="000000"/>
       <w:sz w:val="20"/>
       <w:szCs w:val="20"/>
     </w:rPr>

</xml_diff>

<commit_message>
docs: align shared review documents with GitHub Actions plan
</commit_message>
<xml_diff>
--- a/docs/part-1/Online_Exam_Portal_SAD.docx
+++ b/docs/part-1/Online_Exam_Portal_SAD.docx
@@ -22,68 +22,57 @@
         <w:rPr>
           <w:b/>
         </w:rPr>
-        <w:t xml:space="preserve">Project: </w:t>
-      </w:r>
-      <w:r>
-        <w:t>Online Exam Portal</w:t>
-      </w:r>
-      <w:r>
+        <w:t>Project: Online Exam Portal</w:t>
+        <w:br/>
+        <w:t>Version: 1.1</w:t>
+        <w:br/>
+        <w:t>Authors: Tanusha Prakash, Guntupalli Manaswi, Vidimalla Guru Teja</w:t>
+        <w:br/>
+        <w:t>Date: 19 October 2026</w:t>
+        <w:br/>
+        <w:t>Status: Pending team review</w:t>
         <w:br/>
       </w:r>
+      <w:r/>
+      <w:r/>
       <w:r>
         <w:rPr>
           <w:b/>
         </w:rPr>
-        <w:t xml:space="preserve">Version: </w:t>
       </w:r>
-      <w:r>
-        <w:t>1.0</w:t>
-      </w:r>
-      <w:r>
-        <w:br/>
-      </w:r>
+      <w:r/>
+      <w:r/>
       <w:r>
         <w:rPr>
           <w:b/>
         </w:rPr>
-        <w:t xml:space="preserve">Authors: </w:t>
       </w:r>
-      <w:r>
-        <w:t>Tanusha, Manaswi, Gururaj</w:t>
-      </w:r>
-      <w:r>
-        <w:br/>
-      </w:r>
+      <w:r/>
+      <w:r/>
       <w:r>
         <w:rPr>
           <w:b/>
         </w:rPr>
-        <w:t xml:space="preserve">Date: </w:t>
       </w:r>
-      <w:r>
-        <w:t>09 October 2026</w:t>
-      </w:r>
-      <w:r>
-        <w:br/>
-      </w:r>
+      <w:r/>
+      <w:r/>
       <w:r>
         <w:rPr>
           <w:b/>
         </w:rPr>
-        <w:t xml:space="preserve">Status: </w:t>
       </w:r>
-      <w:r>
-        <w:t>Initial Baseline</w:t>
-      </w:r>
-      <w:r>
-        <w:br/>
-      </w:r>
+      <w:r/>
+      <w:r/>
     </w:p>
     <w:p>
       <w:pPr>
         <w:pStyle w:val="Heading1"/>
       </w:pPr>
       <w:r>
+        <w:rPr>
+          <w:color w:val="000000"/>
+          <w:u w:val="none"/>
+        </w:rPr>
         <w:t>Revision History</w:t>
       </w:r>
     </w:p>
@@ -92,42 +81,74 @@
         <w:tblStyle w:val="TableGrid"/>
         <w:tblW w:w="0" w:type="auto"/>
         <w:jc w:val="center"/>
+        <w:tblLayout w:type="fixed"/>
         <w:tblLook w:val="04A0" w:firstRow="1" w:lastRow="0" w:firstColumn="1" w:lastColumn="0" w:noHBand="0" w:noVBand="1"/>
+        <w:tblBorders>
+          <w:top w:val="single" w:sz="4" w:color="D9D9D9"/>
+          <w:left w:val="single" w:sz="4" w:color="D9D9D9"/>
+          <w:bottom w:val="single" w:sz="4" w:color="D9D9D9"/>
+          <w:right w:val="single" w:sz="4" w:color="D9D9D9"/>
+          <w:insideH w:val="single" w:sz="4" w:color="D9D9D9"/>
+          <w:insideV w:val="single" w:sz="4" w:color="D9D9D9"/>
+        </w:tblBorders>
+        <w:tblCellMar>
+          <w:top w:w="70" w:type="dxa"/>
+          <w:bottom w:w="70" w:type="dxa"/>
+          <w:left w:w="70" w:type="dxa"/>
+          <w:right w:w="70" w:type="dxa"/>
+        </w:tblCellMar>
       </w:tblPr>
       <w:tblGrid>
-        <w:gridCol w:w="2520"/>
-        <w:gridCol w:w="2520"/>
-        <w:gridCol w:w="2520"/>
-        <w:gridCol w:w="2520"/>
+        <w:gridCol w:w="864"/>
+        <w:gridCol w:w="1656"/>
+        <w:gridCol w:w="2304"/>
+        <w:gridCol w:w="5256"/>
       </w:tblGrid>
       <w:tr>
         <w:trPr>
           <w:tblHeader/>
           <w:jc w:val="center"/>
+          <w:cantSplit/>
         </w:trPr>
         <w:tc>
           <w:tcPr>
-            <w:tcW w:w="2520" w:type="dxa"/>
+            <w:tcW w:w="864" w:type="dxa"/>
             <w:vAlign w:val="center"/>
+            <w:shd w:fill="F1F1F1"/>
           </w:tcPr>
           <w:p>
+            <w:pPr>
+              <w:keepNext/>
+              <w:spacing w:before="0" w:after="0" w:line="252" w:lineRule="auto"/>
+              <w:jc w:val="left"/>
+            </w:pPr>
             <w:r>
               <w:rPr>
                 <w:b/>
+                <w:color w:val="000000"/>
+                <w:sz w:val="20"/>
               </w:rPr>
-              <w:t>Version</w:t>
+              <w:t>Ver</w:t>
             </w:r>
           </w:p>
         </w:tc>
         <w:tc>
           <w:tcPr>
-            <w:tcW w:w="2520" w:type="dxa"/>
+            <w:tcW w:w="1656" w:type="dxa"/>
             <w:vAlign w:val="center"/>
+            <w:shd w:fill="F1F1F1"/>
           </w:tcPr>
           <w:p>
+            <w:pPr>
+              <w:keepNext/>
+              <w:spacing w:before="0" w:after="0" w:line="252" w:lineRule="auto"/>
+              <w:jc w:val="left"/>
+            </w:pPr>
             <w:r>
               <w:rPr>
                 <w:b/>
+                <w:color w:val="000000"/>
+                <w:sz w:val="20"/>
               </w:rPr>
               <w:t>Date</w:t>
             </w:r>
@@ -135,13 +156,21 @@
         </w:tc>
         <w:tc>
           <w:tcPr>
-            <w:tcW w:w="2520" w:type="dxa"/>
+            <w:tcW w:w="2304" w:type="dxa"/>
             <w:vAlign w:val="center"/>
+            <w:shd w:fill="F1F1F1"/>
           </w:tcPr>
           <w:p>
+            <w:pPr>
+              <w:keepNext/>
+              <w:spacing w:before="0" w:after="0" w:line="252" w:lineRule="auto"/>
+              <w:jc w:val="left"/>
+            </w:pPr>
             <w:r>
               <w:rPr>
                 <w:b/>
+                <w:color w:val="000000"/>
+                <w:sz w:val="20"/>
               </w:rPr>
               <w:t>Author</w:t>
             </w:r>
@@ -149,13 +178,21 @@
         </w:tc>
         <w:tc>
           <w:tcPr>
-            <w:tcW w:w="2520" w:type="dxa"/>
+            <w:tcW w:w="5256" w:type="dxa"/>
             <w:vAlign w:val="center"/>
+            <w:shd w:fill="F1F1F1"/>
           </w:tcPr>
           <w:p>
+            <w:pPr>
+              <w:keepNext/>
+              <w:spacing w:before="0" w:after="0" w:line="252" w:lineRule="auto"/>
+              <w:jc w:val="left"/>
+            </w:pPr>
             <w:r>
               <w:rPr>
                 <w:b/>
+                <w:color w:val="000000"/>
+                <w:sz w:val="20"/>
               </w:rPr>
               <w:t>Change Summary</w:t>
             </w:r>
@@ -165,44 +202,170 @@
       <w:tr>
         <w:trPr>
           <w:jc w:val="center"/>
+          <w:cantSplit/>
         </w:trPr>
         <w:tc>
           <w:tcPr>
-            <w:tcW w:w="2520" w:type="dxa"/>
+            <w:tcW w:w="864" w:type="dxa"/>
+            <w:vAlign w:val="center"/>
           </w:tcPr>
           <w:p>
+            <w:pPr>
+              <w:keepNext w:val="0"/>
+              <w:spacing w:before="0" w:after="0" w:line="252" w:lineRule="auto"/>
+              <w:jc w:val="left"/>
+            </w:pPr>
             <w:r>
+              <w:rPr>
+                <w:color w:val="000000"/>
+                <w:sz w:val="20"/>
+              </w:rPr>
               <w:t>1.0</w:t>
             </w:r>
           </w:p>
         </w:tc>
         <w:tc>
           <w:tcPr>
-            <w:tcW w:w="2520" w:type="dxa"/>
+            <w:tcW w:w="1656" w:type="dxa"/>
+            <w:vAlign w:val="center"/>
           </w:tcPr>
           <w:p>
+            <w:pPr>
+              <w:keepNext w:val="0"/>
+              <w:spacing w:before="0" w:after="0" w:line="252" w:lineRule="auto"/>
+              <w:jc w:val="left"/>
+            </w:pPr>
             <w:r>
+              <w:rPr>
+                <w:color w:val="000000"/>
+                <w:sz w:val="20"/>
+              </w:rPr>
               <w:t>09 October 2026</w:t>
             </w:r>
           </w:p>
         </w:tc>
         <w:tc>
           <w:tcPr>
-            <w:tcW w:w="2520" w:type="dxa"/>
+            <w:tcW w:w="2304" w:type="dxa"/>
+            <w:vAlign w:val="center"/>
           </w:tcPr>
           <w:p>
+            <w:pPr>
+              <w:keepNext w:val="0"/>
+              <w:spacing w:before="0" w:after="0" w:line="252" w:lineRule="auto"/>
+              <w:jc w:val="left"/>
+            </w:pPr>
             <w:r>
-              <w:t>Tanusha, Manasvi, Gururaj</w:t>
+              <w:rPr>
+                <w:color w:val="000000"/>
+                <w:sz w:val="20"/>
+              </w:rPr>
+              <w:t>Tanusha, Manaswi, Vidimalla Guru Teja</w:t>
             </w:r>
           </w:p>
         </w:tc>
         <w:tc>
           <w:tcPr>
-            <w:tcW w:w="2520" w:type="dxa"/>
+            <w:tcW w:w="5256" w:type="dxa"/>
+            <w:vAlign w:val="center"/>
           </w:tcPr>
           <w:p>
+            <w:pPr>
+              <w:keepNext w:val="0"/>
+              <w:spacing w:before="0" w:after="0" w:line="252" w:lineRule="auto"/>
+              <w:jc w:val="left"/>
+            </w:pPr>
             <w:r>
+              <w:rPr>
+                <w:color w:val="000000"/>
+                <w:sz w:val="20"/>
+              </w:rPr>
               <w:t>Initial architecture and design baseline</w:t>
+            </w:r>
+          </w:p>
+        </w:tc>
+      </w:tr>
+      <w:tr>
+        <w:trPr>
+          <w:cantSplit/>
+        </w:trPr>
+        <w:tc>
+          <w:tcPr>
+            <w:tcW w:type="dxa" w:w="864"/>
+            <w:vAlign w:val="center"/>
+          </w:tcPr>
+          <w:p>
+            <w:pPr>
+              <w:keepNext w:val="0"/>
+              <w:spacing w:before="0" w:after="0" w:line="252" w:lineRule="auto"/>
+              <w:jc w:val="left"/>
+            </w:pPr>
+            <w:r>
+              <w:rPr>
+                <w:color w:val="000000"/>
+                <w:sz w:val="20"/>
+              </w:rPr>
+              <w:t>1.1</w:t>
+            </w:r>
+          </w:p>
+        </w:tc>
+        <w:tc>
+          <w:tcPr>
+            <w:tcW w:type="dxa" w:w="1656"/>
+            <w:vAlign w:val="center"/>
+          </w:tcPr>
+          <w:p>
+            <w:pPr>
+              <w:keepNext w:val="0"/>
+              <w:spacing w:before="0" w:after="0" w:line="252" w:lineRule="auto"/>
+              <w:jc w:val="left"/>
+            </w:pPr>
+            <w:r>
+              <w:rPr>
+                <w:color w:val="000000"/>
+                <w:sz w:val="20"/>
+              </w:rPr>
+              <w:t>19 October 2026</w:t>
+            </w:r>
+          </w:p>
+        </w:tc>
+        <w:tc>
+          <w:tcPr>
+            <w:tcW w:type="dxa" w:w="2304"/>
+            <w:vAlign w:val="center"/>
+          </w:tcPr>
+          <w:p>
+            <w:pPr>
+              <w:keepNext w:val="0"/>
+              <w:spacing w:before="0" w:after="0" w:line="252" w:lineRule="auto"/>
+              <w:jc w:val="left"/>
+            </w:pPr>
+            <w:r>
+              <w:rPr>
+                <w:color w:val="000000"/>
+                <w:sz w:val="20"/>
+              </w:rPr>
+              <w:t>Manaswi (Codex assisted)</w:t>
+            </w:r>
+          </w:p>
+        </w:tc>
+        <w:tc>
+          <w:tcPr>
+            <w:tcW w:type="dxa" w:w="5256"/>
+            <w:vAlign w:val="center"/>
+          </w:tcPr>
+          <w:p>
+            <w:pPr>
+              <w:keepNext w:val="0"/>
+              <w:spacing w:before="0" w:after="0" w:line="252" w:lineRule="auto"/>
+              <w:jc w:val="left"/>
+            </w:pPr>
+            <w:r>
+              <w:rPr>
+                <w:color w:val="000000"/>
+                <w:sz w:val="20"/>
+              </w:rPr>
+              <w:t>Align scope and permissions with #17/#19; correct team names</w:t>
             </w:r>
           </w:p>
         </w:tc>
@@ -213,6 +376,10 @@
         <w:pStyle w:val="Heading1"/>
       </w:pPr>
       <w:r>
+        <w:rPr>
+          <w:color w:val="000000"/>
+          <w:u w:val="none"/>
+        </w:rPr>
         <w:t>Approvals</w:t>
       </w:r>
     </w:p>
@@ -221,27 +388,51 @@
         <w:tblStyle w:val="TableGrid"/>
         <w:tblW w:w="0" w:type="auto"/>
         <w:jc w:val="center"/>
+        <w:tblLayout w:type="fixed"/>
         <w:tblLook w:val="04A0" w:firstRow="1" w:lastRow="0" w:firstColumn="1" w:lastColumn="0" w:noHBand="0" w:noVBand="1"/>
+        <w:tblBorders>
+          <w:top w:val="single" w:sz="4" w:color="D9D9D9"/>
+          <w:left w:val="single" w:sz="4" w:color="D9D9D9"/>
+          <w:bottom w:val="single" w:sz="4" w:color="D9D9D9"/>
+          <w:right w:val="single" w:sz="4" w:color="D9D9D9"/>
+          <w:insideH w:val="single" w:sz="4" w:color="D9D9D9"/>
+          <w:insideV w:val="single" w:sz="4" w:color="D9D9D9"/>
+        </w:tblBorders>
+        <w:tblCellMar>
+          <w:top w:w="70" w:type="dxa"/>
+          <w:bottom w:w="70" w:type="dxa"/>
+          <w:left w:w="70" w:type="dxa"/>
+          <w:right w:w="70" w:type="dxa"/>
+        </w:tblCellMar>
       </w:tblPr>
       <w:tblGrid>
-        <w:gridCol w:w="3360"/>
-        <w:gridCol w:w="3360"/>
-        <w:gridCol w:w="3360"/>
+        <w:gridCol w:w="3024"/>
+        <w:gridCol w:w="3312"/>
+        <w:gridCol w:w="3744"/>
       </w:tblGrid>
       <w:tr>
         <w:trPr>
           <w:tblHeader/>
           <w:jc w:val="center"/>
+          <w:cantSplit/>
         </w:trPr>
         <w:tc>
           <w:tcPr>
-            <w:tcW w:w="3360" w:type="dxa"/>
+            <w:tcW w:w="3024" w:type="dxa"/>
             <w:vAlign w:val="center"/>
+            <w:shd w:fill="F1F1F1"/>
           </w:tcPr>
           <w:p>
+            <w:pPr>
+              <w:keepNext/>
+              <w:spacing w:before="0" w:after="0" w:line="252" w:lineRule="auto"/>
+              <w:jc w:val="left"/>
+            </w:pPr>
             <w:r>
               <w:rPr>
                 <w:b/>
+                <w:color w:val="000000"/>
+                <w:sz w:val="20"/>
               </w:rPr>
               <w:t>Role</w:t>
             </w:r>
@@ -249,13 +440,21 @@
         </w:tc>
         <w:tc>
           <w:tcPr>
-            <w:tcW w:w="3360" w:type="dxa"/>
+            <w:tcW w:w="3312" w:type="dxa"/>
             <w:vAlign w:val="center"/>
+            <w:shd w:fill="F1F1F1"/>
           </w:tcPr>
           <w:p>
+            <w:pPr>
+              <w:keepNext/>
+              <w:spacing w:before="0" w:after="0" w:line="252" w:lineRule="auto"/>
+              <w:jc w:val="left"/>
+            </w:pPr>
             <w:r>
               <w:rPr>
                 <w:b/>
+                <w:color w:val="000000"/>
+                <w:sz w:val="20"/>
               </w:rPr>
               <w:t>Name</w:t>
             </w:r>
@@ -263,13 +462,21 @@
         </w:tc>
         <w:tc>
           <w:tcPr>
-            <w:tcW w:w="3360" w:type="dxa"/>
+            <w:tcW w:w="3744" w:type="dxa"/>
             <w:vAlign w:val="center"/>
+            <w:shd w:fill="F1F1F1"/>
           </w:tcPr>
           <w:p>
+            <w:pPr>
+              <w:keepNext/>
+              <w:spacing w:before="0" w:after="0" w:line="252" w:lineRule="auto"/>
+              <w:jc w:val="left"/>
+            </w:pPr>
             <w:r>
               <w:rPr>
                 <w:b/>
+                <w:color w:val="000000"/>
+                <w:sz w:val="20"/>
               </w:rPr>
               <w:t>Signature / Date</w:t>
             </w:r>
@@ -279,55 +486,105 @@
       <w:tr>
         <w:trPr>
           <w:jc w:val="center"/>
+          <w:cantSplit/>
         </w:trPr>
         <w:tc>
           <w:tcPr>
-            <w:tcW w:w="3360" w:type="dxa"/>
+            <w:tcW w:w="3024" w:type="dxa"/>
+            <w:vAlign w:val="center"/>
           </w:tcPr>
           <w:p>
+            <w:pPr>
+              <w:keepNext w:val="0"/>
+              <w:spacing w:before="0" w:after="0" w:line="252" w:lineRule="auto"/>
+              <w:jc w:val="left"/>
+            </w:pPr>
             <w:r>
+              <w:rPr>
+                <w:color w:val="000000"/>
+                <w:sz w:val="20"/>
+              </w:rPr>
               <w:t>Team Reviewer</w:t>
             </w:r>
           </w:p>
         </w:tc>
         <w:tc>
           <w:tcPr>
-            <w:tcW w:w="3360" w:type="dxa"/>
+            <w:tcW w:w="3312" w:type="dxa"/>
+            <w:vAlign w:val="center"/>
           </w:tcPr>
-          <w:p/>
+          <w:p>
+            <w:pPr>
+              <w:keepNext w:val="0"/>
+              <w:spacing w:before="0" w:after="0" w:line="252" w:lineRule="auto"/>
+              <w:jc w:val="left"/>
+            </w:pPr>
+          </w:p>
         </w:tc>
         <w:tc>
           <w:tcPr>
-            <w:tcW w:w="3360" w:type="dxa"/>
+            <w:tcW w:w="3744" w:type="dxa"/>
+            <w:vAlign w:val="center"/>
           </w:tcPr>
-          <w:p/>
+          <w:p>
+            <w:pPr>
+              <w:keepNext w:val="0"/>
+              <w:spacing w:before="0" w:after="0" w:line="252" w:lineRule="auto"/>
+              <w:jc w:val="left"/>
+            </w:pPr>
+          </w:p>
         </w:tc>
       </w:tr>
       <w:tr>
         <w:trPr>
           <w:jc w:val="center"/>
+          <w:cantSplit/>
         </w:trPr>
         <w:tc>
           <w:tcPr>
-            <w:tcW w:w="3360" w:type="dxa"/>
+            <w:tcW w:w="3024" w:type="dxa"/>
+            <w:vAlign w:val="center"/>
           </w:tcPr>
           <w:p>
+            <w:pPr>
+              <w:keepNext w:val="0"/>
+              <w:spacing w:before="0" w:after="0" w:line="252" w:lineRule="auto"/>
+              <w:jc w:val="left"/>
+            </w:pPr>
             <w:r>
+              <w:rPr>
+                <w:color w:val="000000"/>
+                <w:sz w:val="20"/>
+              </w:rPr>
               <w:t>Course Evaluator</w:t>
             </w:r>
           </w:p>
         </w:tc>
         <w:tc>
           <w:tcPr>
-            <w:tcW w:w="3360" w:type="dxa"/>
+            <w:tcW w:w="3312" w:type="dxa"/>
+            <w:vAlign w:val="center"/>
           </w:tcPr>
-          <w:p/>
+          <w:p>
+            <w:pPr>
+              <w:keepNext w:val="0"/>
+              <w:spacing w:before="0" w:after="0" w:line="252" w:lineRule="auto"/>
+              <w:jc w:val="left"/>
+            </w:pPr>
+          </w:p>
         </w:tc>
         <w:tc>
           <w:tcPr>
-            <w:tcW w:w="3360" w:type="dxa"/>
+            <w:tcW w:w="3744" w:type="dxa"/>
+            <w:vAlign w:val="center"/>
           </w:tcPr>
-          <w:p/>
+          <w:p>
+            <w:pPr>
+              <w:keepNext w:val="0"/>
+              <w:spacing w:before="0" w:after="0" w:line="252" w:lineRule="auto"/>
+              <w:jc w:val="left"/>
+            </w:pPr>
+          </w:p>
         </w:tc>
       </w:tr>
     </w:tbl>
@@ -336,6 +593,10 @@
         <w:pStyle w:val="Heading1"/>
       </w:pPr>
       <w:r>
+        <w:rPr>
+          <w:color w:val="000000"/>
+          <w:u w:val="none"/>
+        </w:rPr>
         <w:t>1. Introduction</w:t>
       </w:r>
     </w:p>
@@ -344,6 +605,10 @@
         <w:pStyle w:val="Heading2"/>
       </w:pPr>
       <w:r>
+        <w:rPr>
+          <w:color w:val="000000"/>
+          <w:u w:val="none"/>
+        </w:rPr>
         <w:t>1.1 Purpose</w:t>
       </w:r>
     </w:p>
@@ -357,6 +622,10 @@
         <w:pStyle w:val="Heading2"/>
       </w:pPr>
       <w:r>
+        <w:rPr>
+          <w:color w:val="000000"/>
+          <w:u w:val="none"/>
+        </w:rPr>
         <w:t>1.2 Scope</w:t>
       </w:r>
     </w:p>
@@ -370,6 +639,10 @@
         <w:pStyle w:val="Heading2"/>
       </w:pPr>
       <w:r>
+        <w:rPr>
+          <w:color w:val="000000"/>
+          <w:u w:val="none"/>
+        </w:rPr>
         <w:t>1.3 Audience</w:t>
       </w:r>
     </w:p>
@@ -383,6 +656,10 @@
         <w:pStyle w:val="Heading2"/>
       </w:pPr>
       <w:r>
+        <w:rPr>
+          <w:color w:val="000000"/>
+          <w:u w:val="none"/>
+        </w:rPr>
         <w:t>1.4 Definitions</w:t>
       </w:r>
     </w:p>
@@ -396,6 +673,10 @@
         <w:pStyle w:val="Heading1"/>
       </w:pPr>
       <w:r>
+        <w:rPr>
+          <w:color w:val="000000"/>
+          <w:u w:val="none"/>
+        </w:rPr>
         <w:t>2. Document Overview</w:t>
       </w:r>
     </w:p>
@@ -404,6 +685,10 @@
         <w:pStyle w:val="Heading2"/>
       </w:pPr>
       <w:r>
+        <w:rPr>
+          <w:color w:val="000000"/>
+          <w:u w:val="none"/>
+        </w:rPr>
         <w:t>2.1 How to Use This Document</w:t>
       </w:r>
     </w:p>
@@ -417,6 +702,10 @@
         <w:pStyle w:val="Heading2"/>
       </w:pPr>
       <w:r>
+        <w:rPr>
+          <w:color w:val="000000"/>
+          <w:u w:val="none"/>
+        </w:rPr>
         <w:lastRenderedPageBreak/>
         <w:t>2.2 Related Documents</w:t>
       </w:r>
@@ -427,10 +716,19 @@
       </w:r>
     </w:p>
     <w:p>
+      <w:r>
+        <w:t>The scope crosswalk, shared permission matrix and planned authorization cases are in docs/RELEASE_1_AGREEMENT.md (#17/#19), pending team review. Current GitHub #23/#24/#51 use that same role/ownership baseline.</w:t>
+      </w:r>
+    </w:p>
+    <w:p>
       <w:pPr>
         <w:pStyle w:val="Heading1"/>
       </w:pPr>
       <w:r>
+        <w:rPr>
+          <w:color w:val="000000"/>
+          <w:u w:val="none"/>
+        </w:rPr>
         <w:t>3. Architecture</w:t>
       </w:r>
     </w:p>
@@ -439,6 +737,10 @@
         <w:pStyle w:val="Heading2"/>
       </w:pPr>
       <w:r>
+        <w:rPr>
+          <w:color w:val="000000"/>
+          <w:u w:val="none"/>
+        </w:rPr>
         <w:t>3.1 Goals &amp; Constraints</w:t>
       </w:r>
     </w:p>
@@ -471,6 +773,10 @@
         <w:pStyle w:val="Heading2"/>
       </w:pPr>
       <w:r>
+        <w:rPr>
+          <w:color w:val="000000"/>
+          <w:u w:val="none"/>
+        </w:rPr>
         <w:t>3.2 Stakeholders &amp; Concerns</w:t>
       </w:r>
     </w:p>
@@ -479,26 +785,50 @@
         <w:tblStyle w:val="TableGrid"/>
         <w:tblW w:w="0" w:type="auto"/>
         <w:jc w:val="center"/>
+        <w:tblLayout w:type="fixed"/>
         <w:tblLook w:val="04A0" w:firstRow="1" w:lastRow="0" w:firstColumn="1" w:lastColumn="0" w:noHBand="0" w:noVBand="1"/>
+        <w:tblBorders>
+          <w:top w:val="single" w:sz="4" w:color="D9D9D9"/>
+          <w:left w:val="single" w:sz="4" w:color="D9D9D9"/>
+          <w:bottom w:val="single" w:sz="4" w:color="D9D9D9"/>
+          <w:right w:val="single" w:sz="4" w:color="D9D9D9"/>
+          <w:insideH w:val="single" w:sz="4" w:color="D9D9D9"/>
+          <w:insideV w:val="single" w:sz="4" w:color="D9D9D9"/>
+        </w:tblBorders>
+        <w:tblCellMar>
+          <w:top w:w="70" w:type="dxa"/>
+          <w:bottom w:w="70" w:type="dxa"/>
+          <w:left w:w="70" w:type="dxa"/>
+          <w:right w:w="70" w:type="dxa"/>
+        </w:tblCellMar>
       </w:tblPr>
       <w:tblGrid>
-        <w:gridCol w:w="5040"/>
-        <w:gridCol w:w="5040"/>
+        <w:gridCol w:w="2448"/>
+        <w:gridCol w:w="7632"/>
       </w:tblGrid>
       <w:tr>
         <w:trPr>
           <w:tblHeader/>
           <w:jc w:val="center"/>
+          <w:cantSplit/>
         </w:trPr>
         <w:tc>
           <w:tcPr>
-            <w:tcW w:w="5040" w:type="dxa"/>
+            <w:tcW w:w="2448" w:type="dxa"/>
             <w:vAlign w:val="center"/>
+            <w:shd w:fill="F1F1F1"/>
           </w:tcPr>
           <w:p>
+            <w:pPr>
+              <w:keepNext/>
+              <w:spacing w:before="0" w:after="0" w:line="252" w:lineRule="auto"/>
+              <w:jc w:val="left"/>
+            </w:pPr>
             <w:r>
               <w:rPr>
                 <w:b/>
+                <w:color w:val="000000"/>
+                <w:sz w:val="20"/>
               </w:rPr>
               <w:t>Stakeholder</w:t>
             </w:r>
@@ -506,13 +836,21 @@
         </w:tc>
         <w:tc>
           <w:tcPr>
-            <w:tcW w:w="5040" w:type="dxa"/>
+            <w:tcW w:w="7632" w:type="dxa"/>
             <w:vAlign w:val="center"/>
+            <w:shd w:fill="F1F1F1"/>
           </w:tcPr>
           <w:p>
+            <w:pPr>
+              <w:keepNext/>
+              <w:spacing w:before="0" w:after="0" w:line="252" w:lineRule="auto"/>
+              <w:jc w:val="left"/>
+            </w:pPr>
             <w:r>
               <w:rPr>
                 <w:b/>
+                <w:color w:val="000000"/>
+                <w:sz w:val="20"/>
               </w:rPr>
               <w:t>Primary Concerns</w:t>
             </w:r>
@@ -522,23 +860,44 @@
       <w:tr>
         <w:trPr>
           <w:jc w:val="center"/>
+          <w:cantSplit/>
         </w:trPr>
         <w:tc>
           <w:tcPr>
-            <w:tcW w:w="5040" w:type="dxa"/>
+            <w:tcW w:w="2448" w:type="dxa"/>
+            <w:vAlign w:val="center"/>
           </w:tcPr>
           <w:p>
+            <w:pPr>
+              <w:keepNext w:val="0"/>
+              <w:spacing w:before="0" w:after="0" w:line="252" w:lineRule="auto"/>
+              <w:jc w:val="left"/>
+            </w:pPr>
             <w:r>
+              <w:rPr>
+                <w:color w:val="000000"/>
+                <w:sz w:val="20"/>
+              </w:rPr>
               <w:t>Student</w:t>
             </w:r>
           </w:p>
         </w:tc>
         <w:tc>
           <w:tcPr>
-            <w:tcW w:w="5040" w:type="dxa"/>
+            <w:tcW w:w="7632" w:type="dxa"/>
+            <w:vAlign w:val="center"/>
           </w:tcPr>
           <w:p>
+            <w:pPr>
+              <w:keepNext w:val="0"/>
+              <w:spacing w:before="0" w:after="0" w:line="252" w:lineRule="auto"/>
+              <w:jc w:val="left"/>
+            </w:pPr>
             <w:r>
+              <w:rPr>
+                <w:color w:val="000000"/>
+                <w:sz w:val="20"/>
+              </w:rPr>
               <w:t>Reliable timed attempt, saved responses, privacy of own result</w:t>
             </w:r>
           </w:p>
@@ -547,23 +906,44 @@
       <w:tr>
         <w:trPr>
           <w:jc w:val="center"/>
+          <w:cantSplit/>
         </w:trPr>
         <w:tc>
           <w:tcPr>
-            <w:tcW w:w="5040" w:type="dxa"/>
+            <w:tcW w:w="2448" w:type="dxa"/>
+            <w:vAlign w:val="center"/>
           </w:tcPr>
           <w:p>
+            <w:pPr>
+              <w:keepNext w:val="0"/>
+              <w:spacing w:before="0" w:after="0" w:line="252" w:lineRule="auto"/>
+              <w:jc w:val="left"/>
+            </w:pPr>
             <w:r>
+              <w:rPr>
+                <w:color w:val="000000"/>
+                <w:sz w:val="20"/>
+              </w:rPr>
               <w:t>Instructor</w:t>
             </w:r>
           </w:p>
         </w:tc>
         <w:tc>
           <w:tcPr>
-            <w:tcW w:w="5040" w:type="dxa"/>
+            <w:tcW w:w="7632" w:type="dxa"/>
+            <w:vAlign w:val="center"/>
           </w:tcPr>
           <w:p>
+            <w:pPr>
+              <w:keepNext w:val="0"/>
+              <w:spacing w:before="0" w:after="0" w:line="252" w:lineRule="auto"/>
+              <w:jc w:val="left"/>
+            </w:pPr>
             <w:r>
+              <w:rPr>
+                <w:color w:val="000000"/>
+                <w:sz w:val="20"/>
+              </w:rPr>
               <w:t>Simple exam/question management, ownership protection, correct results</w:t>
             </w:r>
           </w:p>
@@ -572,23 +952,44 @@
       <w:tr>
         <w:trPr>
           <w:jc w:val="center"/>
+          <w:cantSplit/>
         </w:trPr>
         <w:tc>
           <w:tcPr>
-            <w:tcW w:w="5040" w:type="dxa"/>
+            <w:tcW w:w="2448" w:type="dxa"/>
+            <w:vAlign w:val="center"/>
           </w:tcPr>
           <w:p>
+            <w:pPr>
+              <w:keepNext w:val="0"/>
+              <w:spacing w:before="0" w:after="0" w:line="252" w:lineRule="auto"/>
+              <w:jc w:val="left"/>
+            </w:pPr>
             <w:r>
+              <w:rPr>
+                <w:color w:val="000000"/>
+                <w:sz w:val="20"/>
+              </w:rPr>
               <w:t>Admin</w:t>
             </w:r>
           </w:p>
         </w:tc>
         <w:tc>
           <w:tcPr>
-            <w:tcW w:w="5040" w:type="dxa"/>
+            <w:tcW w:w="7632" w:type="dxa"/>
+            <w:vAlign w:val="center"/>
           </w:tcPr>
           <w:p>
+            <w:pPr>
+              <w:keepNext w:val="0"/>
+              <w:spacing w:before="0" w:after="0" w:line="252" w:lineRule="auto"/>
+              <w:jc w:val="left"/>
+            </w:pPr>
             <w:r>
+              <w:rPr>
+                <w:color w:val="000000"/>
+                <w:sz w:val="20"/>
+              </w:rPr>
               <w:t>Controlled user/role management</w:t>
             </w:r>
           </w:p>
@@ -597,23 +998,44 @@
       <w:tr>
         <w:trPr>
           <w:jc w:val="center"/>
+          <w:cantSplit/>
         </w:trPr>
         <w:tc>
           <w:tcPr>
-            <w:tcW w:w="5040" w:type="dxa"/>
+            <w:tcW w:w="2448" w:type="dxa"/>
+            <w:vAlign w:val="center"/>
           </w:tcPr>
           <w:p>
+            <w:pPr>
+              <w:keepNext w:val="0"/>
+              <w:spacing w:before="0" w:after="0" w:line="252" w:lineRule="auto"/>
+              <w:jc w:val="left"/>
+            </w:pPr>
             <w:r>
+              <w:rPr>
+                <w:color w:val="000000"/>
+                <w:sz w:val="20"/>
+              </w:rPr>
               <w:t>Developers/Testers</w:t>
             </w:r>
           </w:p>
         </w:tc>
         <w:tc>
           <w:tcPr>
-            <w:tcW w:w="5040" w:type="dxa"/>
+            <w:tcW w:w="7632" w:type="dxa"/>
+            <w:vAlign w:val="center"/>
           </w:tcPr>
           <w:p>
+            <w:pPr>
+              <w:keepNext w:val="0"/>
+              <w:spacing w:before="0" w:after="0" w:line="252" w:lineRule="auto"/>
+              <w:jc w:val="left"/>
+            </w:pPr>
             <w:r>
+              <w:rPr>
+                <w:color w:val="000000"/>
+                <w:sz w:val="20"/>
+              </w:rPr>
               <w:t>Modularity, traceability, testability and maintainability</w:t>
             </w:r>
           </w:p>
@@ -622,23 +1044,44 @@
       <w:tr>
         <w:trPr>
           <w:jc w:val="center"/>
+          <w:cantSplit/>
         </w:trPr>
         <w:tc>
           <w:tcPr>
-            <w:tcW w:w="5040" w:type="dxa"/>
+            <w:tcW w:w="2448" w:type="dxa"/>
+            <w:vAlign w:val="center"/>
           </w:tcPr>
           <w:p>
+            <w:pPr>
+              <w:keepNext w:val="0"/>
+              <w:spacing w:before="0" w:after="0" w:line="252" w:lineRule="auto"/>
+              <w:jc w:val="left"/>
+            </w:pPr>
             <w:r>
+              <w:rPr>
+                <w:color w:val="000000"/>
+                <w:sz w:val="20"/>
+              </w:rPr>
               <w:t>Faculty Evaluator</w:t>
             </w:r>
           </w:p>
         </w:tc>
         <w:tc>
           <w:tcPr>
-            <w:tcW w:w="5040" w:type="dxa"/>
+            <w:tcW w:w="7632" w:type="dxa"/>
+            <w:vAlign w:val="center"/>
           </w:tcPr>
           <w:p>
+            <w:pPr>
+              <w:keepNext w:val="0"/>
+              <w:spacing w:before="0" w:after="0" w:line="252" w:lineRule="auto"/>
+              <w:jc w:val="left"/>
+            </w:pPr>
             <w:r>
+              <w:rPr>
+                <w:color w:val="000000"/>
+                <w:sz w:val="20"/>
+              </w:rPr>
               <w:t>Conformance to SRS/SAD/STP and demonstrable Agile increments</w:t>
             </w:r>
           </w:p>
@@ -650,6 +1093,10 @@
         <w:pStyle w:val="Heading2"/>
       </w:pPr>
       <w:r>
+        <w:rPr>
+          <w:color w:val="000000"/>
+          <w:u w:val="none"/>
+        </w:rPr>
         <w:t>3.3 Component (UML) Diagram</w:t>
       </w:r>
     </w:p>
@@ -714,6 +1161,10 @@
         <w:pStyle w:val="Heading2"/>
       </w:pPr>
       <w:r>
+        <w:rPr>
+          <w:color w:val="000000"/>
+          <w:u w:val="none"/>
+        </w:rPr>
         <w:t>3.4 Component Descriptions</w:t>
       </w:r>
     </w:p>
@@ -722,26 +1173,50 @@
         <w:tblStyle w:val="TableGrid"/>
         <w:tblW w:w="0" w:type="auto"/>
         <w:jc w:val="center"/>
+        <w:tblLayout w:type="fixed"/>
         <w:tblLook w:val="04A0" w:firstRow="1" w:lastRow="0" w:firstColumn="1" w:lastColumn="0" w:noHBand="0" w:noVBand="1"/>
+        <w:tblBorders>
+          <w:top w:val="single" w:sz="4" w:color="D9D9D9"/>
+          <w:left w:val="single" w:sz="4" w:color="D9D9D9"/>
+          <w:bottom w:val="single" w:sz="4" w:color="D9D9D9"/>
+          <w:right w:val="single" w:sz="4" w:color="D9D9D9"/>
+          <w:insideH w:val="single" w:sz="4" w:color="D9D9D9"/>
+          <w:insideV w:val="single" w:sz="4" w:color="D9D9D9"/>
+        </w:tblBorders>
+        <w:tblCellMar>
+          <w:top w:w="70" w:type="dxa"/>
+          <w:bottom w:w="70" w:type="dxa"/>
+          <w:left w:w="70" w:type="dxa"/>
+          <w:right w:w="70" w:type="dxa"/>
+        </w:tblCellMar>
       </w:tblPr>
       <w:tblGrid>
-        <w:gridCol w:w="5040"/>
-        <w:gridCol w:w="5040"/>
+        <w:gridCol w:w="2592"/>
+        <w:gridCol w:w="7488"/>
       </w:tblGrid>
       <w:tr>
         <w:trPr>
           <w:tblHeader/>
           <w:jc w:val="center"/>
+          <w:cantSplit/>
         </w:trPr>
         <w:tc>
           <w:tcPr>
-            <w:tcW w:w="5040" w:type="dxa"/>
+            <w:tcW w:w="2592" w:type="dxa"/>
             <w:vAlign w:val="center"/>
+            <w:shd w:fill="F1F1F1"/>
           </w:tcPr>
           <w:p>
+            <w:pPr>
+              <w:keepNext/>
+              <w:spacing w:before="0" w:after="0" w:line="252" w:lineRule="auto"/>
+              <w:jc w:val="left"/>
+            </w:pPr>
             <w:r>
               <w:rPr>
                 <w:b/>
+                <w:color w:val="000000"/>
+                <w:sz w:val="20"/>
               </w:rPr>
               <w:t>Component</w:t>
             </w:r>
@@ -749,13 +1224,21 @@
         </w:tc>
         <w:tc>
           <w:tcPr>
-            <w:tcW w:w="5040" w:type="dxa"/>
+            <w:tcW w:w="7488" w:type="dxa"/>
             <w:vAlign w:val="center"/>
+            <w:shd w:fill="F1F1F1"/>
           </w:tcPr>
           <w:p>
+            <w:pPr>
+              <w:keepNext/>
+              <w:spacing w:before="0" w:after="0" w:line="252" w:lineRule="auto"/>
+              <w:jc w:val="left"/>
+            </w:pPr>
             <w:r>
               <w:rPr>
                 <w:b/>
+                <w:color w:val="000000"/>
+                <w:sz w:val="20"/>
               </w:rPr>
               <w:t>Responsibilities</w:t>
             </w:r>
@@ -765,23 +1248,44 @@
       <w:tr>
         <w:trPr>
           <w:jc w:val="center"/>
+          <w:cantSplit/>
         </w:trPr>
         <w:tc>
           <w:tcPr>
-            <w:tcW w:w="5040" w:type="dxa"/>
+            <w:tcW w:w="2592" w:type="dxa"/>
+            <w:vAlign w:val="center"/>
           </w:tcPr>
           <w:p>
+            <w:pPr>
+              <w:keepNext w:val="0"/>
+              <w:spacing w:before="0" w:after="0" w:line="252" w:lineRule="auto"/>
+              <w:jc w:val="left"/>
+            </w:pPr>
             <w:r>
+              <w:rPr>
+                <w:color w:val="000000"/>
+                <w:sz w:val="20"/>
+              </w:rPr>
               <w:t>React Client</w:t>
             </w:r>
           </w:p>
         </w:tc>
         <w:tc>
           <w:tcPr>
-            <w:tcW w:w="5040" w:type="dxa"/>
+            <w:tcW w:w="7488" w:type="dxa"/>
+            <w:vAlign w:val="center"/>
           </w:tcPr>
           <w:p>
+            <w:pPr>
+              <w:keepNext w:val="0"/>
+              <w:spacing w:before="0" w:after="0" w:line="252" w:lineRule="auto"/>
+              <w:jc w:val="left"/>
+            </w:pPr>
             <w:r>
+              <w:rPr>
+                <w:color w:val="000000"/>
+                <w:sz w:val="20"/>
+              </w:rPr>
               <w:t>Role-specific UI, forms, navigation, timer display and REST API calls.</w:t>
             </w:r>
           </w:p>
@@ -790,23 +1294,44 @@
       <w:tr>
         <w:trPr>
           <w:jc w:val="center"/>
+          <w:cantSplit/>
         </w:trPr>
         <w:tc>
           <w:tcPr>
-            <w:tcW w:w="5040" w:type="dxa"/>
+            <w:tcW w:w="2592" w:type="dxa"/>
+            <w:vAlign w:val="center"/>
           </w:tcPr>
           <w:p>
+            <w:pPr>
+              <w:keepNext w:val="0"/>
+              <w:spacing w:before="0" w:after="0" w:line="252" w:lineRule="auto"/>
+              <w:jc w:val="left"/>
+            </w:pPr>
             <w:r>
+              <w:rPr>
+                <w:color w:val="000000"/>
+                <w:sz w:val="20"/>
+              </w:rPr>
               <w:t>Express API</w:t>
             </w:r>
           </w:p>
         </w:tc>
         <w:tc>
           <w:tcPr>
-            <w:tcW w:w="5040" w:type="dxa"/>
+            <w:tcW w:w="7488" w:type="dxa"/>
+            <w:vAlign w:val="center"/>
           </w:tcPr>
           <w:p>
+            <w:pPr>
+              <w:keepNext w:val="0"/>
+              <w:spacing w:before="0" w:after="0" w:line="252" w:lineRule="auto"/>
+              <w:jc w:val="left"/>
+            </w:pPr>
             <w:r>
+              <w:rPr>
+                <w:color w:val="000000"/>
+                <w:sz w:val="20"/>
+              </w:rPr>
               <w:t>HTTP routing, validation, orchestration and standardized responses.</w:t>
             </w:r>
           </w:p>
@@ -815,23 +1340,44 @@
       <w:tr>
         <w:trPr>
           <w:jc w:val="center"/>
+          <w:cantSplit/>
         </w:trPr>
         <w:tc>
           <w:tcPr>
-            <w:tcW w:w="5040" w:type="dxa"/>
+            <w:tcW w:w="2592" w:type="dxa"/>
+            <w:vAlign w:val="center"/>
           </w:tcPr>
           <w:p>
+            <w:pPr>
+              <w:keepNext w:val="0"/>
+              <w:spacing w:before="0" w:after="0" w:line="252" w:lineRule="auto"/>
+              <w:jc w:val="left"/>
+            </w:pPr>
             <w:r>
+              <w:rPr>
+                <w:color w:val="000000"/>
+                <w:sz w:val="20"/>
+              </w:rPr>
               <w:t>Auth &amp; RBAC Middleware</w:t>
             </w:r>
           </w:p>
         </w:tc>
         <w:tc>
           <w:tcPr>
-            <w:tcW w:w="5040" w:type="dxa"/>
+            <w:tcW w:w="7488" w:type="dxa"/>
+            <w:vAlign w:val="center"/>
           </w:tcPr>
           <w:p>
+            <w:pPr>
+              <w:keepNext w:val="0"/>
+              <w:spacing w:before="0" w:after="0" w:line="252" w:lineRule="auto"/>
+              <w:jc w:val="left"/>
+            </w:pPr>
             <w:r>
+              <w:rPr>
+                <w:color w:val="000000"/>
+                <w:sz w:val="20"/>
+              </w:rPr>
               <w:t>Authentication checks, role checks and ownership enforcement.</w:t>
             </w:r>
           </w:p>
@@ -840,23 +1386,44 @@
       <w:tr>
         <w:trPr>
           <w:jc w:val="center"/>
+          <w:cantSplit/>
         </w:trPr>
         <w:tc>
           <w:tcPr>
-            <w:tcW w:w="5040" w:type="dxa"/>
+            <w:tcW w:w="2592" w:type="dxa"/>
+            <w:vAlign w:val="center"/>
           </w:tcPr>
           <w:p>
+            <w:pPr>
+              <w:keepNext w:val="0"/>
+              <w:spacing w:before="0" w:after="0" w:line="252" w:lineRule="auto"/>
+              <w:jc w:val="left"/>
+            </w:pPr>
             <w:r>
+              <w:rPr>
+                <w:color w:val="000000"/>
+                <w:sz w:val="20"/>
+              </w:rPr>
               <w:t>Exam / Question Module</w:t>
             </w:r>
           </w:p>
         </w:tc>
         <w:tc>
           <w:tcPr>
-            <w:tcW w:w="5040" w:type="dxa"/>
+            <w:tcW w:w="7488" w:type="dxa"/>
+            <w:vAlign w:val="center"/>
           </w:tcPr>
           <w:p>
+            <w:pPr>
+              <w:keepNext w:val="0"/>
+              <w:spacing w:before="0" w:after="0" w:line="252" w:lineRule="auto"/>
+              <w:jc w:val="left"/>
+            </w:pPr>
             <w:r>
+              <w:rPr>
+                <w:color w:val="000000"/>
+                <w:sz w:val="20"/>
+              </w:rPr>
               <w:t>Draft exam CRUD, question/option management, publication validation.</w:t>
             </w:r>
           </w:p>
@@ -865,23 +1432,44 @@
       <w:tr>
         <w:trPr>
           <w:jc w:val="center"/>
+          <w:cantSplit/>
         </w:trPr>
         <w:tc>
           <w:tcPr>
-            <w:tcW w:w="5040" w:type="dxa"/>
+            <w:tcW w:w="2592" w:type="dxa"/>
+            <w:vAlign w:val="center"/>
           </w:tcPr>
           <w:p>
+            <w:pPr>
+              <w:keepNext w:val="0"/>
+              <w:spacing w:before="0" w:after="0" w:line="252" w:lineRule="auto"/>
+              <w:jc w:val="left"/>
+            </w:pPr>
             <w:r>
+              <w:rPr>
+                <w:color w:val="000000"/>
+                <w:sz w:val="20"/>
+              </w:rPr>
               <w:t>Attempt Module</w:t>
             </w:r>
           </w:p>
         </w:tc>
         <w:tc>
           <w:tcPr>
-            <w:tcW w:w="5040" w:type="dxa"/>
+            <w:tcW w:w="7488" w:type="dxa"/>
+            <w:vAlign w:val="center"/>
           </w:tcPr>
           <w:p>
+            <w:pPr>
+              <w:keepNext w:val="0"/>
+              <w:spacing w:before="0" w:after="0" w:line="252" w:lineRule="auto"/>
+              <w:jc w:val="left"/>
+            </w:pPr>
             <w:r>
+              <w:rPr>
+                <w:color w:val="000000"/>
+                <w:sz w:val="20"/>
+              </w:rPr>
               <w:t>Attempt creation, response persistence, timing and submission state.</w:t>
             </w:r>
           </w:p>
@@ -890,23 +1478,44 @@
       <w:tr>
         <w:trPr>
           <w:jc w:val="center"/>
+          <w:cantSplit/>
         </w:trPr>
         <w:tc>
           <w:tcPr>
-            <w:tcW w:w="5040" w:type="dxa"/>
+            <w:tcW w:w="2592" w:type="dxa"/>
+            <w:vAlign w:val="center"/>
           </w:tcPr>
           <w:p>
+            <w:pPr>
+              <w:keepNext w:val="0"/>
+              <w:spacing w:before="0" w:after="0" w:line="252" w:lineRule="auto"/>
+              <w:jc w:val="left"/>
+            </w:pPr>
             <w:r>
+              <w:rPr>
+                <w:color w:val="000000"/>
+                <w:sz w:val="20"/>
+              </w:rPr>
               <w:t>Evaluation / Results Module</w:t>
             </w:r>
           </w:p>
         </w:tc>
         <w:tc>
           <w:tcPr>
-            <w:tcW w:w="5040" w:type="dxa"/>
+            <w:tcW w:w="7488" w:type="dxa"/>
+            <w:vAlign w:val="center"/>
           </w:tcPr>
           <w:p>
+            <w:pPr>
+              <w:keepNext w:val="0"/>
+              <w:spacing w:before="0" w:after="0" w:line="252" w:lineRule="auto"/>
+              <w:jc w:val="left"/>
+            </w:pPr>
             <w:r>
+              <w:rPr>
+                <w:color w:val="000000"/>
+                <w:sz w:val="20"/>
+              </w:rPr>
               <w:t>Score calculation, result persistence and authorized result retrieval.</w:t>
             </w:r>
           </w:p>
@@ -915,23 +1524,44 @@
       <w:tr>
         <w:trPr>
           <w:jc w:val="center"/>
+          <w:cantSplit/>
         </w:trPr>
         <w:tc>
           <w:tcPr>
-            <w:tcW w:w="5040" w:type="dxa"/>
+            <w:tcW w:w="2592" w:type="dxa"/>
+            <w:vAlign w:val="center"/>
           </w:tcPr>
           <w:p>
+            <w:pPr>
+              <w:keepNext w:val="0"/>
+              <w:spacing w:before="0" w:after="0" w:line="252" w:lineRule="auto"/>
+              <w:jc w:val="left"/>
+            </w:pPr>
             <w:r>
+              <w:rPr>
+                <w:color w:val="000000"/>
+                <w:sz w:val="20"/>
+              </w:rPr>
               <w:t>Mongoose ODM</w:t>
             </w:r>
           </w:p>
         </w:tc>
         <w:tc>
           <w:tcPr>
-            <w:tcW w:w="5040" w:type="dxa"/>
+            <w:tcW w:w="7488" w:type="dxa"/>
+            <w:vAlign w:val="center"/>
           </w:tcPr>
           <w:p>
+            <w:pPr>
+              <w:keepNext w:val="0"/>
+              <w:spacing w:before="0" w:after="0" w:line="252" w:lineRule="auto"/>
+              <w:jc w:val="left"/>
+            </w:pPr>
             <w:r>
+              <w:rPr>
+                <w:color w:val="000000"/>
+                <w:sz w:val="20"/>
+              </w:rPr>
               <w:t>Schema/model definitions and persistence abstraction.</w:t>
             </w:r>
           </w:p>
@@ -940,13 +1570,24 @@
       <w:tr>
         <w:trPr>
           <w:jc w:val="center"/>
+          <w:cantSplit/>
         </w:trPr>
         <w:tc>
           <w:tcPr>
-            <w:tcW w:w="5040" w:type="dxa"/>
+            <w:tcW w:w="2592" w:type="dxa"/>
+            <w:vAlign w:val="center"/>
           </w:tcPr>
           <w:p>
+            <w:pPr>
+              <w:keepNext w:val="0"/>
+              <w:spacing w:before="0" w:after="0" w:line="252" w:lineRule="auto"/>
+              <w:jc w:val="left"/>
+            </w:pPr>
             <w:r>
+              <w:rPr>
+                <w:color w:val="000000"/>
+                <w:sz w:val="20"/>
+              </w:rPr>
               <w:lastRenderedPageBreak/>
               <w:t>MongoDB</w:t>
             </w:r>
@@ -954,10 +1595,20 @@
         </w:tc>
         <w:tc>
           <w:tcPr>
-            <w:tcW w:w="5040" w:type="dxa"/>
+            <w:tcW w:w="7488" w:type="dxa"/>
+            <w:vAlign w:val="center"/>
           </w:tcPr>
           <w:p>
+            <w:pPr>
+              <w:keepNext w:val="0"/>
+              <w:spacing w:before="0" w:after="0" w:line="252" w:lineRule="auto"/>
+              <w:jc w:val="left"/>
+            </w:pPr>
             <w:r>
+              <w:rPr>
+                <w:color w:val="000000"/>
+                <w:sz w:val="20"/>
+              </w:rPr>
               <w:t>Persistent storage for users, exams, questions, attempts and results.</w:t>
             </w:r>
           </w:p>
@@ -969,6 +1620,10 @@
         <w:pStyle w:val="Heading2"/>
       </w:pPr>
       <w:r>
+        <w:rPr>
+          <w:color w:val="000000"/>
+          <w:u w:val="none"/>
+        </w:rPr>
         <w:t>3.5 Chosen Architecture Pattern and Rationale</w:t>
       </w:r>
     </w:p>
@@ -982,6 +1637,10 @@
         <w:pStyle w:val="Heading2"/>
       </w:pPr>
       <w:r>
+        <w:rPr>
+          <w:color w:val="000000"/>
+          <w:u w:val="none"/>
+        </w:rPr>
         <w:t>3.6 Technology Stack &amp; Data Stores</w:t>
       </w:r>
     </w:p>
@@ -990,26 +1649,50 @@
         <w:tblStyle w:val="TableGrid"/>
         <w:tblW w:w="0" w:type="auto"/>
         <w:jc w:val="center"/>
+        <w:tblLayout w:type="fixed"/>
         <w:tblLook w:val="04A0" w:firstRow="1" w:lastRow="0" w:firstColumn="1" w:lastColumn="0" w:noHBand="0" w:noVBand="1"/>
+        <w:tblBorders>
+          <w:top w:val="single" w:sz="4" w:color="D9D9D9"/>
+          <w:left w:val="single" w:sz="4" w:color="D9D9D9"/>
+          <w:bottom w:val="single" w:sz="4" w:color="D9D9D9"/>
+          <w:right w:val="single" w:sz="4" w:color="D9D9D9"/>
+          <w:insideH w:val="single" w:sz="4" w:color="D9D9D9"/>
+          <w:insideV w:val="single" w:sz="4" w:color="D9D9D9"/>
+        </w:tblBorders>
+        <w:tblCellMar>
+          <w:top w:w="70" w:type="dxa"/>
+          <w:bottom w:w="70" w:type="dxa"/>
+          <w:left w:w="70" w:type="dxa"/>
+          <w:right w:w="70" w:type="dxa"/>
+        </w:tblCellMar>
       </w:tblPr>
       <w:tblGrid>
-        <w:gridCol w:w="5040"/>
-        <w:gridCol w:w="5040"/>
+        <w:gridCol w:w="2592"/>
+        <w:gridCol w:w="7488"/>
       </w:tblGrid>
       <w:tr>
         <w:trPr>
           <w:tblHeader/>
           <w:jc w:val="center"/>
+          <w:cantSplit/>
         </w:trPr>
         <w:tc>
           <w:tcPr>
-            <w:tcW w:w="5040" w:type="dxa"/>
+            <w:tcW w:w="2592" w:type="dxa"/>
             <w:vAlign w:val="center"/>
+            <w:shd w:fill="F1F1F1"/>
           </w:tcPr>
           <w:p>
+            <w:pPr>
+              <w:keepNext/>
+              <w:spacing w:before="0" w:after="0" w:line="252" w:lineRule="auto"/>
+              <w:jc w:val="left"/>
+            </w:pPr>
             <w:r>
               <w:rPr>
                 <w:b/>
+                <w:color w:val="000000"/>
+                <w:sz w:val="20"/>
               </w:rPr>
               <w:t>Area</w:t>
             </w:r>
@@ -1017,13 +1700,21 @@
         </w:tc>
         <w:tc>
           <w:tcPr>
-            <w:tcW w:w="5040" w:type="dxa"/>
+            <w:tcW w:w="7488" w:type="dxa"/>
             <w:vAlign w:val="center"/>
+            <w:shd w:fill="F1F1F1"/>
           </w:tcPr>
           <w:p>
+            <w:pPr>
+              <w:keepNext/>
+              <w:spacing w:before="0" w:after="0" w:line="252" w:lineRule="auto"/>
+              <w:jc w:val="left"/>
+            </w:pPr>
             <w:r>
               <w:rPr>
                 <w:b/>
+                <w:color w:val="000000"/>
+                <w:sz w:val="20"/>
               </w:rPr>
               <w:t>Technology</w:t>
             </w:r>
@@ -1033,23 +1724,44 @@
       <w:tr>
         <w:trPr>
           <w:jc w:val="center"/>
+          <w:cantSplit/>
         </w:trPr>
         <w:tc>
           <w:tcPr>
-            <w:tcW w:w="5040" w:type="dxa"/>
+            <w:tcW w:w="2592" w:type="dxa"/>
+            <w:vAlign w:val="center"/>
           </w:tcPr>
           <w:p>
+            <w:pPr>
+              <w:keepNext w:val="0"/>
+              <w:spacing w:before="0" w:after="0" w:line="252" w:lineRule="auto"/>
+              <w:jc w:val="left"/>
+            </w:pPr>
             <w:r>
+              <w:rPr>
+                <w:color w:val="000000"/>
+                <w:sz w:val="20"/>
+              </w:rPr>
               <w:t>Frontend</w:t>
             </w:r>
           </w:p>
         </w:tc>
         <w:tc>
           <w:tcPr>
-            <w:tcW w:w="5040" w:type="dxa"/>
+            <w:tcW w:w="7488" w:type="dxa"/>
+            <w:vAlign w:val="center"/>
           </w:tcPr>
           <w:p>
+            <w:pPr>
+              <w:keepNext w:val="0"/>
+              <w:spacing w:before="0" w:after="0" w:line="252" w:lineRule="auto"/>
+              <w:jc w:val="left"/>
+            </w:pPr>
             <w:r>
+              <w:rPr>
+                <w:color w:val="000000"/>
+                <w:sz w:val="20"/>
+              </w:rPr>
               <w:t>React.js, HTML/CSS, Bootstrap</w:t>
             </w:r>
           </w:p>
@@ -1058,23 +1770,44 @@
       <w:tr>
         <w:trPr>
           <w:jc w:val="center"/>
+          <w:cantSplit/>
         </w:trPr>
         <w:tc>
           <w:tcPr>
-            <w:tcW w:w="5040" w:type="dxa"/>
+            <w:tcW w:w="2592" w:type="dxa"/>
+            <w:vAlign w:val="center"/>
           </w:tcPr>
           <w:p>
+            <w:pPr>
+              <w:keepNext w:val="0"/>
+              <w:spacing w:before="0" w:after="0" w:line="252" w:lineRule="auto"/>
+              <w:jc w:val="left"/>
+            </w:pPr>
             <w:r>
+              <w:rPr>
+                <w:color w:val="000000"/>
+                <w:sz w:val="20"/>
+              </w:rPr>
               <w:t>Backend</w:t>
             </w:r>
           </w:p>
         </w:tc>
         <w:tc>
           <w:tcPr>
-            <w:tcW w:w="5040" w:type="dxa"/>
+            <w:tcW w:w="7488" w:type="dxa"/>
+            <w:vAlign w:val="center"/>
           </w:tcPr>
           <w:p>
+            <w:pPr>
+              <w:keepNext w:val="0"/>
+              <w:spacing w:before="0" w:after="0" w:line="252" w:lineRule="auto"/>
+              <w:jc w:val="left"/>
+            </w:pPr>
             <w:r>
+              <w:rPr>
+                <w:color w:val="000000"/>
+                <w:sz w:val="20"/>
+              </w:rPr>
               <w:t>Node.js, Express.js</w:t>
             </w:r>
           </w:p>
@@ -1083,23 +1816,44 @@
       <w:tr>
         <w:trPr>
           <w:jc w:val="center"/>
+          <w:cantSplit/>
         </w:trPr>
         <w:tc>
           <w:tcPr>
-            <w:tcW w:w="5040" w:type="dxa"/>
+            <w:tcW w:w="2592" w:type="dxa"/>
+            <w:vAlign w:val="center"/>
           </w:tcPr>
           <w:p>
+            <w:pPr>
+              <w:keepNext w:val="0"/>
+              <w:spacing w:before="0" w:after="0" w:line="252" w:lineRule="auto"/>
+              <w:jc w:val="left"/>
+            </w:pPr>
             <w:r>
+              <w:rPr>
+                <w:color w:val="000000"/>
+                <w:sz w:val="20"/>
+              </w:rPr>
               <w:t>Database</w:t>
             </w:r>
           </w:p>
         </w:tc>
         <w:tc>
           <w:tcPr>
-            <w:tcW w:w="5040" w:type="dxa"/>
+            <w:tcW w:w="7488" w:type="dxa"/>
+            <w:vAlign w:val="center"/>
           </w:tcPr>
           <w:p>
+            <w:pPr>
+              <w:keepNext w:val="0"/>
+              <w:spacing w:before="0" w:after="0" w:line="252" w:lineRule="auto"/>
+              <w:jc w:val="left"/>
+            </w:pPr>
             <w:r>
+              <w:rPr>
+                <w:color w:val="000000"/>
+                <w:sz w:val="20"/>
+              </w:rPr>
               <w:t>MongoDB</w:t>
             </w:r>
           </w:p>
@@ -1108,23 +1862,44 @@
       <w:tr>
         <w:trPr>
           <w:jc w:val="center"/>
+          <w:cantSplit/>
         </w:trPr>
         <w:tc>
           <w:tcPr>
-            <w:tcW w:w="5040" w:type="dxa"/>
+            <w:tcW w:w="2592" w:type="dxa"/>
+            <w:vAlign w:val="center"/>
           </w:tcPr>
           <w:p>
+            <w:pPr>
+              <w:keepNext w:val="0"/>
+              <w:spacing w:before="0" w:after="0" w:line="252" w:lineRule="auto"/>
+              <w:jc w:val="left"/>
+            </w:pPr>
             <w:r>
+              <w:rPr>
+                <w:color w:val="000000"/>
+                <w:sz w:val="20"/>
+              </w:rPr>
               <w:t>ODM</w:t>
             </w:r>
           </w:p>
         </w:tc>
         <w:tc>
           <w:tcPr>
-            <w:tcW w:w="5040" w:type="dxa"/>
+            <w:tcW w:w="7488" w:type="dxa"/>
+            <w:vAlign w:val="center"/>
           </w:tcPr>
           <w:p>
+            <w:pPr>
+              <w:keepNext w:val="0"/>
+              <w:spacing w:before="0" w:after="0" w:line="252" w:lineRule="auto"/>
+              <w:jc w:val="left"/>
+            </w:pPr>
             <w:r>
+              <w:rPr>
+                <w:color w:val="000000"/>
+                <w:sz w:val="20"/>
+              </w:rPr>
               <w:t>Mongoose</w:t>
             </w:r>
           </w:p>
@@ -1133,23 +1908,44 @@
       <w:tr>
         <w:trPr>
           <w:jc w:val="center"/>
+          <w:cantSplit/>
         </w:trPr>
         <w:tc>
           <w:tcPr>
-            <w:tcW w:w="5040" w:type="dxa"/>
+            <w:tcW w:w="2592" w:type="dxa"/>
+            <w:vAlign w:val="center"/>
           </w:tcPr>
           <w:p>
+            <w:pPr>
+              <w:keepNext w:val="0"/>
+              <w:spacing w:before="0" w:after="0" w:line="252" w:lineRule="auto"/>
+              <w:jc w:val="left"/>
+            </w:pPr>
             <w:r>
+              <w:rPr>
+                <w:color w:val="000000"/>
+                <w:sz w:val="20"/>
+              </w:rPr>
               <w:t>Password security</w:t>
             </w:r>
           </w:p>
         </w:tc>
         <w:tc>
           <w:tcPr>
-            <w:tcW w:w="5040" w:type="dxa"/>
+            <w:tcW w:w="7488" w:type="dxa"/>
+            <w:vAlign w:val="center"/>
           </w:tcPr>
           <w:p>
+            <w:pPr>
+              <w:keepNext w:val="0"/>
+              <w:spacing w:before="0" w:after="0" w:line="252" w:lineRule="auto"/>
+              <w:jc w:val="left"/>
+            </w:pPr>
             <w:r>
+              <w:rPr>
+                <w:color w:val="000000"/>
+                <w:sz w:val="20"/>
+              </w:rPr>
               <w:t>bcrypt</w:t>
             </w:r>
           </w:p>
@@ -1158,23 +1954,44 @@
       <w:tr>
         <w:trPr>
           <w:jc w:val="center"/>
+          <w:cantSplit/>
         </w:trPr>
         <w:tc>
           <w:tcPr>
-            <w:tcW w:w="5040" w:type="dxa"/>
+            <w:tcW w:w="2592" w:type="dxa"/>
+            <w:vAlign w:val="center"/>
           </w:tcPr>
           <w:p>
+            <w:pPr>
+              <w:keepNext w:val="0"/>
+              <w:spacing w:before="0" w:after="0" w:line="252" w:lineRule="auto"/>
+              <w:jc w:val="left"/>
+            </w:pPr>
             <w:r>
+              <w:rPr>
+                <w:color w:val="000000"/>
+                <w:sz w:val="20"/>
+              </w:rPr>
               <w:t>Testing</w:t>
             </w:r>
           </w:p>
         </w:tc>
         <w:tc>
           <w:tcPr>
-            <w:tcW w:w="5040" w:type="dxa"/>
+            <w:tcW w:w="7488" w:type="dxa"/>
+            <w:vAlign w:val="center"/>
           </w:tcPr>
           <w:p>
+            <w:pPr>
+              <w:keepNext w:val="0"/>
+              <w:spacing w:before="0" w:after="0" w:line="252" w:lineRule="auto"/>
+              <w:jc w:val="left"/>
+            </w:pPr>
             <w:r>
+              <w:rPr>
+                <w:color w:val="000000"/>
+                <w:sz w:val="20"/>
+              </w:rPr>
               <w:t>Jest, Supertest, React Testing Library</w:t>
             </w:r>
           </w:p>
@@ -1183,23 +2000,44 @@
       <w:tr>
         <w:trPr>
           <w:jc w:val="center"/>
+          <w:cantSplit/>
         </w:trPr>
         <w:tc>
           <w:tcPr>
-            <w:tcW w:w="5040" w:type="dxa"/>
+            <w:tcW w:w="2592" w:type="dxa"/>
+            <w:vAlign w:val="center"/>
           </w:tcPr>
           <w:p>
+            <w:pPr>
+              <w:keepNext w:val="0"/>
+              <w:spacing w:before="0" w:after="0" w:line="252" w:lineRule="auto"/>
+              <w:jc w:val="left"/>
+            </w:pPr>
             <w:r>
+              <w:rPr>
+                <w:color w:val="000000"/>
+                <w:sz w:val="20"/>
+              </w:rPr>
               <w:t>CI/CD / Quality</w:t>
             </w:r>
           </w:p>
         </w:tc>
         <w:tc>
           <w:tcPr>
-            <w:tcW w:w="5040" w:type="dxa"/>
+            <w:tcW w:w="7488" w:type="dxa"/>
+            <w:vAlign w:val="center"/>
           </w:tcPr>
           <w:p>
+            <w:pPr>
+              <w:keepNext w:val="0"/>
+              <w:spacing w:before="0" w:after="0" w:line="252" w:lineRule="auto"/>
+              <w:jc w:val="left"/>
+            </w:pPr>
             <w:r>
+              <w:rPr>
+                <w:color w:val="000000"/>
+                <w:sz w:val="20"/>
+              </w:rPr>
               <w:t>GitHub Actions, Docker, SonarQube</w:t>
             </w:r>
           </w:p>
@@ -1208,23 +2046,44 @@
       <w:tr>
         <w:trPr>
           <w:jc w:val="center"/>
+          <w:cantSplit/>
         </w:trPr>
         <w:tc>
           <w:tcPr>
-            <w:tcW w:w="5040" w:type="dxa"/>
+            <w:tcW w:w="2592" w:type="dxa"/>
+            <w:vAlign w:val="center"/>
           </w:tcPr>
           <w:p>
+            <w:pPr>
+              <w:keepNext w:val="0"/>
+              <w:spacing w:before="0" w:after="0" w:line="252" w:lineRule="auto"/>
+              <w:jc w:val="left"/>
+            </w:pPr>
             <w:r>
+              <w:rPr>
+                <w:color w:val="000000"/>
+                <w:sz w:val="20"/>
+              </w:rPr>
               <w:t>Documentation/Diagrams</w:t>
             </w:r>
           </w:p>
         </w:tc>
         <w:tc>
           <w:tcPr>
-            <w:tcW w:w="5040" w:type="dxa"/>
+            <w:tcW w:w="7488" w:type="dxa"/>
+            <w:vAlign w:val="center"/>
           </w:tcPr>
           <w:p>
+            <w:pPr>
+              <w:keepNext w:val="0"/>
+              <w:spacing w:before="0" w:after="0" w:line="252" w:lineRule="auto"/>
+              <w:jc w:val="left"/>
+            </w:pPr>
             <w:r>
+              <w:rPr>
+                <w:color w:val="000000"/>
+                <w:sz w:val="20"/>
+              </w:rPr>
               <w:t>Word/Markdown, draw.io/Graphviz</w:t>
             </w:r>
           </w:p>
@@ -1236,6 +2095,10 @@
         <w:pStyle w:val="Heading2"/>
       </w:pPr>
       <w:r>
+        <w:rPr>
+          <w:color w:val="000000"/>
+          <w:u w:val="none"/>
+        </w:rPr>
         <w:t>3.7 Risks &amp; Mitigations</w:t>
       </w:r>
     </w:p>
@@ -1244,26 +2107,50 @@
         <w:tblStyle w:val="TableGrid"/>
         <w:tblW w:w="0" w:type="auto"/>
         <w:jc w:val="center"/>
+        <w:tblLayout w:type="fixed"/>
         <w:tblLook w:val="04A0" w:firstRow="1" w:lastRow="0" w:firstColumn="1" w:lastColumn="0" w:noHBand="0" w:noVBand="1"/>
+        <w:tblBorders>
+          <w:top w:val="single" w:sz="4" w:color="D9D9D9"/>
+          <w:left w:val="single" w:sz="4" w:color="D9D9D9"/>
+          <w:bottom w:val="single" w:sz="4" w:color="D9D9D9"/>
+          <w:right w:val="single" w:sz="4" w:color="D9D9D9"/>
+          <w:insideH w:val="single" w:sz="4" w:color="D9D9D9"/>
+          <w:insideV w:val="single" w:sz="4" w:color="D9D9D9"/>
+        </w:tblBorders>
+        <w:tblCellMar>
+          <w:top w:w="70" w:type="dxa"/>
+          <w:bottom w:w="70" w:type="dxa"/>
+          <w:left w:w="70" w:type="dxa"/>
+          <w:right w:w="70" w:type="dxa"/>
+        </w:tblCellMar>
       </w:tblPr>
       <w:tblGrid>
-        <w:gridCol w:w="5040"/>
-        <w:gridCol w:w="5040"/>
+        <w:gridCol w:w="3024"/>
+        <w:gridCol w:w="7056"/>
       </w:tblGrid>
       <w:tr>
         <w:trPr>
           <w:tblHeader/>
           <w:jc w:val="center"/>
+          <w:cantSplit/>
         </w:trPr>
         <w:tc>
           <w:tcPr>
-            <w:tcW w:w="5040" w:type="dxa"/>
+            <w:tcW w:w="3024" w:type="dxa"/>
             <w:vAlign w:val="center"/>
+            <w:shd w:fill="F1F1F1"/>
           </w:tcPr>
           <w:p>
+            <w:pPr>
+              <w:keepNext/>
+              <w:spacing w:before="0" w:after="0" w:line="252" w:lineRule="auto"/>
+              <w:jc w:val="left"/>
+            </w:pPr>
             <w:r>
               <w:rPr>
                 <w:b/>
+                <w:color w:val="000000"/>
+                <w:sz w:val="20"/>
               </w:rPr>
               <w:t>Risk</w:t>
             </w:r>
@@ -1271,13 +2158,21 @@
         </w:tc>
         <w:tc>
           <w:tcPr>
-            <w:tcW w:w="5040" w:type="dxa"/>
+            <w:tcW w:w="7056" w:type="dxa"/>
             <w:vAlign w:val="center"/>
+            <w:shd w:fill="F1F1F1"/>
           </w:tcPr>
           <w:p>
+            <w:pPr>
+              <w:keepNext/>
+              <w:spacing w:before="0" w:after="0" w:line="252" w:lineRule="auto"/>
+              <w:jc w:val="left"/>
+            </w:pPr>
             <w:r>
               <w:rPr>
                 <w:b/>
+                <w:color w:val="000000"/>
+                <w:sz w:val="20"/>
               </w:rPr>
               <w:t>Mitigation</w:t>
             </w:r>
@@ -1287,23 +2182,44 @@
       <w:tr>
         <w:trPr>
           <w:jc w:val="center"/>
+          <w:cantSplit/>
         </w:trPr>
         <w:tc>
           <w:tcPr>
-            <w:tcW w:w="5040" w:type="dxa"/>
+            <w:tcW w:w="3024" w:type="dxa"/>
+            <w:vAlign w:val="center"/>
           </w:tcPr>
           <w:p>
+            <w:pPr>
+              <w:keepNext w:val="0"/>
+              <w:spacing w:before="0" w:after="0" w:line="252" w:lineRule="auto"/>
+              <w:jc w:val="left"/>
+            </w:pPr>
             <w:r>
+              <w:rPr>
+                <w:color w:val="000000"/>
+                <w:sz w:val="20"/>
+              </w:rPr>
               <w:t>Client timer manipulation</w:t>
             </w:r>
           </w:p>
         </w:tc>
         <w:tc>
           <w:tcPr>
-            <w:tcW w:w="5040" w:type="dxa"/>
+            <w:tcW w:w="7056" w:type="dxa"/>
+            <w:vAlign w:val="center"/>
           </w:tcPr>
           <w:p>
+            <w:pPr>
+              <w:keepNext w:val="0"/>
+              <w:spacing w:before="0" w:after="0" w:line="252" w:lineRule="auto"/>
+              <w:jc w:val="left"/>
+            </w:pPr>
             <w:r>
+              <w:rPr>
+                <w:color w:val="000000"/>
+                <w:sz w:val="20"/>
+              </w:rPr>
               <w:t>Server stores start/deadline and validates submission timing.</w:t>
             </w:r>
           </w:p>
@@ -1312,23 +2228,44 @@
       <w:tr>
         <w:trPr>
           <w:jc w:val="center"/>
+          <w:cantSplit/>
         </w:trPr>
         <w:tc>
           <w:tcPr>
-            <w:tcW w:w="5040" w:type="dxa"/>
+            <w:tcW w:w="3024" w:type="dxa"/>
+            <w:vAlign w:val="center"/>
           </w:tcPr>
           <w:p>
+            <w:pPr>
+              <w:keepNext w:val="0"/>
+              <w:spacing w:before="0" w:after="0" w:line="252" w:lineRule="auto"/>
+              <w:jc w:val="left"/>
+            </w:pPr>
             <w:r>
+              <w:rPr>
+                <w:color w:val="000000"/>
+                <w:sz w:val="20"/>
+              </w:rPr>
               <w:t>Unauthorized cross-user access</w:t>
             </w:r>
           </w:p>
         </w:tc>
         <w:tc>
           <w:tcPr>
-            <w:tcW w:w="5040" w:type="dxa"/>
+            <w:tcW w:w="7056" w:type="dxa"/>
+            <w:vAlign w:val="center"/>
           </w:tcPr>
           <w:p>
+            <w:pPr>
+              <w:keepNext w:val="0"/>
+              <w:spacing w:before="0" w:after="0" w:line="252" w:lineRule="auto"/>
+              <w:jc w:val="left"/>
+            </w:pPr>
             <w:r>
+              <w:rPr>
+                <w:color w:val="000000"/>
+                <w:sz w:val="20"/>
+              </w:rPr>
               <w:t>Backend RBAC and ownership checks on every protected resource route.</w:t>
             </w:r>
           </w:p>
@@ -1337,23 +2274,44 @@
       <w:tr>
         <w:trPr>
           <w:jc w:val="center"/>
+          <w:cantSplit/>
         </w:trPr>
         <w:tc>
           <w:tcPr>
-            <w:tcW w:w="5040" w:type="dxa"/>
+            <w:tcW w:w="3024" w:type="dxa"/>
+            <w:vAlign w:val="center"/>
           </w:tcPr>
           <w:p>
+            <w:pPr>
+              <w:keepNext w:val="0"/>
+              <w:spacing w:before="0" w:after="0" w:line="252" w:lineRule="auto"/>
+              <w:jc w:val="left"/>
+            </w:pPr>
             <w:r>
+              <w:rPr>
+                <w:color w:val="000000"/>
+                <w:sz w:val="20"/>
+              </w:rPr>
               <w:t>Correct-answer leakage</w:t>
             </w:r>
           </w:p>
         </w:tc>
         <w:tc>
           <w:tcPr>
-            <w:tcW w:w="5040" w:type="dxa"/>
+            <w:tcW w:w="7056" w:type="dxa"/>
+            <w:vAlign w:val="center"/>
           </w:tcPr>
           <w:p>
+            <w:pPr>
+              <w:keepNext w:val="0"/>
+              <w:spacing w:before="0" w:after="0" w:line="252" w:lineRule="auto"/>
+              <w:jc w:val="left"/>
+            </w:pPr>
             <w:r>
+              <w:rPr>
+                <w:color w:val="000000"/>
+                <w:sz w:val="20"/>
+              </w:rPr>
               <w:t>Student-facing attempt responses exclude correct-answer fields.</w:t>
             </w:r>
           </w:p>
@@ -1362,23 +2320,44 @@
       <w:tr>
         <w:trPr>
           <w:jc w:val="center"/>
+          <w:cantSplit/>
         </w:trPr>
         <w:tc>
           <w:tcPr>
-            <w:tcW w:w="5040" w:type="dxa"/>
+            <w:tcW w:w="3024" w:type="dxa"/>
+            <w:vAlign w:val="center"/>
           </w:tcPr>
           <w:p>
+            <w:pPr>
+              <w:keepNext w:val="0"/>
+              <w:spacing w:before="0" w:after="0" w:line="252" w:lineRule="auto"/>
+              <w:jc w:val="left"/>
+            </w:pPr>
             <w:r>
+              <w:rPr>
+                <w:color w:val="000000"/>
+                <w:sz w:val="20"/>
+              </w:rPr>
               <w:t>Frontend/backend contract mismatch</w:t>
             </w:r>
           </w:p>
         </w:tc>
         <w:tc>
           <w:tcPr>
-            <w:tcW w:w="5040" w:type="dxa"/>
+            <w:tcW w:w="7056" w:type="dxa"/>
+            <w:vAlign w:val="center"/>
           </w:tcPr>
           <w:p>
+            <w:pPr>
+              <w:keepNext w:val="0"/>
+              <w:spacing w:before="0" w:after="0" w:line="252" w:lineRule="auto"/>
+              <w:jc w:val="left"/>
+            </w:pPr>
             <w:r>
+              <w:rPr>
+                <w:color w:val="000000"/>
+                <w:sz w:val="20"/>
+              </w:rPr>
               <w:t>Define and test REST endpoints incrementally; use Supertest for API integration.</w:t>
             </w:r>
           </w:p>
@@ -1387,23 +2366,44 @@
       <w:tr>
         <w:trPr>
           <w:jc w:val="center"/>
+          <w:cantSplit/>
         </w:trPr>
         <w:tc>
           <w:tcPr>
-            <w:tcW w:w="5040" w:type="dxa"/>
+            <w:tcW w:w="3024" w:type="dxa"/>
+            <w:vAlign w:val="center"/>
           </w:tcPr>
           <w:p>
+            <w:pPr>
+              <w:keepNext w:val="0"/>
+              <w:spacing w:before="0" w:after="0" w:line="252" w:lineRule="auto"/>
+              <w:jc w:val="left"/>
+            </w:pPr>
             <w:r>
+              <w:rPr>
+                <w:color w:val="000000"/>
+                <w:sz w:val="20"/>
+              </w:rPr>
               <w:t>Scope growth</w:t>
             </w:r>
           </w:p>
         </w:tc>
         <w:tc>
           <w:tcPr>
-            <w:tcW w:w="5040" w:type="dxa"/>
+            <w:tcW w:w="7056" w:type="dxa"/>
+            <w:vAlign w:val="center"/>
           </w:tcPr>
           <w:p>
+            <w:pPr>
+              <w:keepNext w:val="0"/>
+              <w:spacing w:before="0" w:after="0" w:line="252" w:lineRule="auto"/>
+              <w:jc w:val="left"/>
+            </w:pPr>
             <w:r>
+              <w:rPr>
+                <w:color w:val="000000"/>
+                <w:sz w:val="20"/>
+              </w:rPr>
               <w:t>Keep optional features outside Release 1 and document deviations.</w:t>
             </w:r>
           </w:p>
@@ -1412,24 +2412,45 @@
       <w:tr>
         <w:trPr>
           <w:jc w:val="center"/>
+          <w:cantSplit/>
         </w:trPr>
         <w:tc>
           <w:tcPr>
-            <w:tcW w:w="5040" w:type="dxa"/>
+            <w:tcW w:w="3024" w:type="dxa"/>
+            <w:vAlign w:val="center"/>
           </w:tcPr>
           <w:p>
+            <w:pPr>
+              <w:keepNext w:val="0"/>
+              <w:spacing w:before="0" w:after="0" w:line="252" w:lineRule="auto"/>
+              <w:jc w:val="left"/>
+            </w:pPr>
             <w:r>
+              <w:rPr>
+                <w:color w:val="000000"/>
+                <w:sz w:val="20"/>
+              </w:rPr>
               <w:t>Merge/integration conflicts</w:t>
             </w:r>
           </w:p>
         </w:tc>
         <w:tc>
           <w:tcPr>
-            <w:tcW w:w="5040" w:type="dxa"/>
+            <w:tcW w:w="7056" w:type="dxa"/>
+            <w:vAlign w:val="center"/>
           </w:tcPr>
           <w:p>
+            <w:pPr>
+              <w:keepNext w:val="0"/>
+              <w:spacing w:before="0" w:after="0" w:line="252" w:lineRule="auto"/>
+              <w:jc w:val="left"/>
+            </w:pPr>
             <w:r>
-              <w:t>Small Jira/GitHub backlog items, short-lived branches and frequent integration.</w:t>
+              <w:rPr>
+                <w:color w:val="000000"/>
+                <w:sz w:val="20"/>
+              </w:rPr>
+              <w:t>Small GitHub backlog items, short-lived branches and frequent integration.</w:t>
             </w:r>
           </w:p>
         </w:tc>
@@ -1440,6 +2461,10 @@
         <w:pStyle w:val="Heading2"/>
       </w:pPr>
       <w:r>
+        <w:rPr>
+          <w:color w:val="000000"/>
+          <w:u w:val="none"/>
+        </w:rPr>
         <w:t>3.8 Traceability to Requirements</w:t>
       </w:r>
     </w:p>
@@ -1448,26 +2473,50 @@
         <w:tblStyle w:val="TableGrid"/>
         <w:tblW w:w="0" w:type="auto"/>
         <w:jc w:val="center"/>
+        <w:tblLayout w:type="fixed"/>
         <w:tblLook w:val="04A0" w:firstRow="1" w:lastRow="0" w:firstColumn="1" w:lastColumn="0" w:noHBand="0" w:noVBand="1"/>
+        <w:tblBorders>
+          <w:top w:val="single" w:sz="4" w:color="D9D9D9"/>
+          <w:left w:val="single" w:sz="4" w:color="D9D9D9"/>
+          <w:bottom w:val="single" w:sz="4" w:color="D9D9D9"/>
+          <w:right w:val="single" w:sz="4" w:color="D9D9D9"/>
+          <w:insideH w:val="single" w:sz="4" w:color="D9D9D9"/>
+          <w:insideV w:val="single" w:sz="4" w:color="D9D9D9"/>
+        </w:tblBorders>
+        <w:tblCellMar>
+          <w:top w:w="70" w:type="dxa"/>
+          <w:bottom w:w="70" w:type="dxa"/>
+          <w:left w:w="70" w:type="dxa"/>
+          <w:right w:w="70" w:type="dxa"/>
+        </w:tblCellMar>
       </w:tblPr>
       <w:tblGrid>
-        <w:gridCol w:w="5040"/>
-        <w:gridCol w:w="5040"/>
+        <w:gridCol w:w="3168"/>
+        <w:gridCol w:w="6912"/>
       </w:tblGrid>
       <w:tr>
         <w:trPr>
           <w:tblHeader/>
           <w:jc w:val="center"/>
+          <w:cantSplit/>
         </w:trPr>
         <w:tc>
           <w:tcPr>
-            <w:tcW w:w="5040" w:type="dxa"/>
+            <w:tcW w:w="3168" w:type="dxa"/>
             <w:vAlign w:val="center"/>
+            <w:shd w:fill="F1F1F1"/>
           </w:tcPr>
           <w:p>
+            <w:pPr>
+              <w:keepNext/>
+              <w:spacing w:before="0" w:after="0" w:line="252" w:lineRule="auto"/>
+              <w:jc w:val="left"/>
+            </w:pPr>
             <w:r>
               <w:rPr>
                 <w:b/>
+                <w:color w:val="000000"/>
+                <w:sz w:val="20"/>
               </w:rPr>
               <w:t>Requirement Group</w:t>
             </w:r>
@@ -1475,13 +2524,21 @@
         </w:tc>
         <w:tc>
           <w:tcPr>
-            <w:tcW w:w="5040" w:type="dxa"/>
+            <w:tcW w:w="6912" w:type="dxa"/>
             <w:vAlign w:val="center"/>
+            <w:shd w:fill="F1F1F1"/>
           </w:tcPr>
           <w:p>
+            <w:pPr>
+              <w:keepNext/>
+              <w:spacing w:before="0" w:after="0" w:line="252" w:lineRule="auto"/>
+              <w:jc w:val="left"/>
+            </w:pPr>
             <w:r>
               <w:rPr>
                 <w:b/>
+                <w:color w:val="000000"/>
+                <w:sz w:val="20"/>
               </w:rPr>
               <w:t>Architecture / Component Mapping</w:t>
             </w:r>
@@ -1491,23 +2548,44 @@
       <w:tr>
         <w:trPr>
           <w:jc w:val="center"/>
+          <w:cantSplit/>
         </w:trPr>
         <w:tc>
           <w:tcPr>
-            <w:tcW w:w="5040" w:type="dxa"/>
+            <w:tcW w:w="3168" w:type="dxa"/>
+            <w:vAlign w:val="center"/>
           </w:tcPr>
           <w:p>
+            <w:pPr>
+              <w:keepNext w:val="0"/>
+              <w:spacing w:before="0" w:after="0" w:line="252" w:lineRule="auto"/>
+              <w:jc w:val="left"/>
+            </w:pPr>
             <w:r>
+              <w:rPr>
+                <w:color w:val="000000"/>
+                <w:sz w:val="20"/>
+              </w:rPr>
               <w:t>AUTH-FR-01..03, OEP-SR-001..03</w:t>
             </w:r>
           </w:p>
         </w:tc>
         <w:tc>
           <w:tcPr>
-            <w:tcW w:w="5040" w:type="dxa"/>
+            <w:tcW w:w="6912" w:type="dxa"/>
+            <w:vAlign w:val="center"/>
           </w:tcPr>
           <w:p>
+            <w:pPr>
+              <w:keepNext w:val="0"/>
+              <w:spacing w:before="0" w:after="0" w:line="252" w:lineRule="auto"/>
+              <w:jc w:val="left"/>
+            </w:pPr>
             <w:r>
+              <w:rPr>
+                <w:color w:val="000000"/>
+                <w:sz w:val="20"/>
+              </w:rPr>
               <w:t>React Login + Express Auth/RBAC Middleware + User model</w:t>
             </w:r>
           </w:p>
@@ -1516,23 +2594,44 @@
       <w:tr>
         <w:trPr>
           <w:jc w:val="center"/>
+          <w:cantSplit/>
         </w:trPr>
         <w:tc>
           <w:tcPr>
-            <w:tcW w:w="5040" w:type="dxa"/>
+            <w:tcW w:w="3168" w:type="dxa"/>
+            <w:vAlign w:val="center"/>
           </w:tcPr>
           <w:p>
+            <w:pPr>
+              <w:keepNext w:val="0"/>
+              <w:spacing w:before="0" w:after="0" w:line="252" w:lineRule="auto"/>
+              <w:jc w:val="left"/>
+            </w:pPr>
             <w:r>
+              <w:rPr>
+                <w:color w:val="000000"/>
+                <w:sz w:val="20"/>
+              </w:rPr>
               <w:t>EXAM-FR-01..04, QUES-FR-01..03</w:t>
             </w:r>
           </w:p>
         </w:tc>
         <w:tc>
           <w:tcPr>
-            <w:tcW w:w="5040" w:type="dxa"/>
+            <w:tcW w:w="6912" w:type="dxa"/>
+            <w:vAlign w:val="center"/>
           </w:tcPr>
           <w:p>
+            <w:pPr>
+              <w:keepNext w:val="0"/>
+              <w:spacing w:before="0" w:after="0" w:line="252" w:lineRule="auto"/>
+              <w:jc w:val="left"/>
+            </w:pPr>
             <w:r>
+              <w:rPr>
+                <w:color w:val="000000"/>
+                <w:sz w:val="20"/>
+              </w:rPr>
               <w:t>Exam/Question Module + MongoDB models</w:t>
             </w:r>
           </w:p>
@@ -1541,23 +2640,44 @@
       <w:tr>
         <w:trPr>
           <w:jc w:val="center"/>
+          <w:cantSplit/>
         </w:trPr>
         <w:tc>
           <w:tcPr>
-            <w:tcW w:w="5040" w:type="dxa"/>
+            <w:tcW w:w="3168" w:type="dxa"/>
+            <w:vAlign w:val="center"/>
           </w:tcPr>
           <w:p>
+            <w:pPr>
+              <w:keepNext w:val="0"/>
+              <w:spacing w:before="0" w:after="0" w:line="252" w:lineRule="auto"/>
+              <w:jc w:val="left"/>
+            </w:pPr>
             <w:r>
+              <w:rPr>
+                <w:color w:val="000000"/>
+                <w:sz w:val="20"/>
+              </w:rPr>
               <w:t>ATT-FR-01..06</w:t>
             </w:r>
           </w:p>
         </w:tc>
         <w:tc>
           <w:tcPr>
-            <w:tcW w:w="5040" w:type="dxa"/>
+            <w:tcW w:w="6912" w:type="dxa"/>
+            <w:vAlign w:val="center"/>
           </w:tcPr>
           <w:p>
+            <w:pPr>
+              <w:keepNext w:val="0"/>
+              <w:spacing w:before="0" w:after="0" w:line="252" w:lineRule="auto"/>
+              <w:jc w:val="left"/>
+            </w:pPr>
             <w:r>
+              <w:rPr>
+                <w:color w:val="000000"/>
+                <w:sz w:val="20"/>
+              </w:rPr>
               <w:t>Attempt Module + React Exam Attempt UI</w:t>
             </w:r>
           </w:p>
@@ -1566,23 +2686,44 @@
       <w:tr>
         <w:trPr>
           <w:jc w:val="center"/>
+          <w:cantSplit/>
         </w:trPr>
         <w:tc>
           <w:tcPr>
-            <w:tcW w:w="5040" w:type="dxa"/>
+            <w:tcW w:w="3168" w:type="dxa"/>
+            <w:vAlign w:val="center"/>
           </w:tcPr>
           <w:p>
+            <w:pPr>
+              <w:keepNext w:val="0"/>
+              <w:spacing w:before="0" w:after="0" w:line="252" w:lineRule="auto"/>
+              <w:jc w:val="left"/>
+            </w:pPr>
             <w:r>
+              <w:rPr>
+                <w:color w:val="000000"/>
+                <w:sz w:val="20"/>
+              </w:rPr>
               <w:t>EVAL-FR-01..02</w:t>
             </w:r>
           </w:p>
         </w:tc>
         <w:tc>
           <w:tcPr>
-            <w:tcW w:w="5040" w:type="dxa"/>
+            <w:tcW w:w="6912" w:type="dxa"/>
+            <w:vAlign w:val="center"/>
           </w:tcPr>
           <w:p>
+            <w:pPr>
+              <w:keepNext w:val="0"/>
+              <w:spacing w:before="0" w:after="0" w:line="252" w:lineRule="auto"/>
+              <w:jc w:val="left"/>
+            </w:pPr>
             <w:r>
+              <w:rPr>
+                <w:color w:val="000000"/>
+                <w:sz w:val="20"/>
+              </w:rPr>
               <w:t>Evaluation Service + Attempt/Question data</w:t>
             </w:r>
           </w:p>
@@ -1591,23 +2732,44 @@
       <w:tr>
         <w:trPr>
           <w:jc w:val="center"/>
+          <w:cantSplit/>
         </w:trPr>
         <w:tc>
           <w:tcPr>
-            <w:tcW w:w="5040" w:type="dxa"/>
+            <w:tcW w:w="3168" w:type="dxa"/>
+            <w:vAlign w:val="center"/>
           </w:tcPr>
           <w:p>
+            <w:pPr>
+              <w:keepNext w:val="0"/>
+              <w:spacing w:before="0" w:after="0" w:line="252" w:lineRule="auto"/>
+              <w:jc w:val="left"/>
+            </w:pPr>
             <w:r>
+              <w:rPr>
+                <w:color w:val="000000"/>
+                <w:sz w:val="20"/>
+              </w:rPr>
               <w:t>RES-FR-01..02</w:t>
             </w:r>
           </w:p>
         </w:tc>
         <w:tc>
           <w:tcPr>
-            <w:tcW w:w="5040" w:type="dxa"/>
+            <w:tcW w:w="6912" w:type="dxa"/>
+            <w:vAlign w:val="center"/>
           </w:tcPr>
           <w:p>
+            <w:pPr>
+              <w:keepNext w:val="0"/>
+              <w:spacing w:before="0" w:after="0" w:line="252" w:lineRule="auto"/>
+              <w:jc w:val="left"/>
+            </w:pPr>
             <w:r>
+              <w:rPr>
+                <w:color w:val="000000"/>
+                <w:sz w:val="20"/>
+              </w:rPr>
               <w:t>Results routes/service + ownership checks</w:t>
             </w:r>
           </w:p>
@@ -1616,23 +2778,44 @@
       <w:tr>
         <w:trPr>
           <w:jc w:val="center"/>
+          <w:cantSplit/>
         </w:trPr>
         <w:tc>
           <w:tcPr>
-            <w:tcW w:w="5040" w:type="dxa"/>
+            <w:tcW w:w="3168" w:type="dxa"/>
+            <w:vAlign w:val="center"/>
           </w:tcPr>
           <w:p>
+            <w:pPr>
+              <w:keepNext w:val="0"/>
+              <w:spacing w:before="0" w:after="0" w:line="252" w:lineRule="auto"/>
+              <w:jc w:val="left"/>
+            </w:pPr>
             <w:r>
+              <w:rPr>
+                <w:color w:val="000000"/>
+                <w:sz w:val="20"/>
+              </w:rPr>
               <w:t>OEP-NF-001..005</w:t>
             </w:r>
           </w:p>
         </w:tc>
         <w:tc>
           <w:tcPr>
-            <w:tcW w:w="5040" w:type="dxa"/>
+            <w:tcW w:w="6912" w:type="dxa"/>
+            <w:vAlign w:val="center"/>
           </w:tcPr>
           <w:p>
+            <w:pPr>
+              <w:keepNext w:val="0"/>
+              <w:spacing w:before="0" w:after="0" w:line="252" w:lineRule="auto"/>
+              <w:jc w:val="left"/>
+            </w:pPr>
             <w:r>
+              <w:rPr>
+                <w:color w:val="000000"/>
+                <w:sz w:val="20"/>
+              </w:rPr>
               <w:t>Cross-cutting API, error handling, testing and compatibility mechanisms</w:t>
             </w:r>
           </w:p>
@@ -1644,6 +2827,10 @@
         <w:pStyle w:val="Heading2"/>
       </w:pPr>
       <w:r>
+        <w:rPr>
+          <w:color w:val="000000"/>
+          <w:u w:val="none"/>
+        </w:rPr>
         <w:t>3.9 Security Architecture</w:t>
       </w:r>
     </w:p>
@@ -1653,10 +2840,19 @@
       </w:r>
     </w:p>
     <w:p>
+      <w:r>
+        <w:t>Use one server-managed session mechanism with HttpOnly cookies, Secure over HTTPS, a documented SameSite policy and CSRF protection. Logout invalidates the server session. Each request checks current stored active status/role, resource ownership and lifecycle. Anonymous/inactive access fails; Admin has account-management permissions only. Preserve historical references after role/status changes and exclude answer keys/correctness flags from Student payloads. The agreement maps these controls to TC-RBAC-01 through TC-RBAC-26; execution remains pending.</w:t>
+      </w:r>
+    </w:p>
+    <w:p>
       <w:pPr>
         <w:pStyle w:val="Heading1"/>
       </w:pPr>
       <w:r>
+        <w:rPr>
+          <w:color w:val="000000"/>
+          <w:u w:val="none"/>
+        </w:rPr>
         <w:lastRenderedPageBreak/>
         <w:t>4. Design</w:t>
       </w:r>
@@ -1666,6 +2862,10 @@
         <w:pStyle w:val="Heading2"/>
       </w:pPr>
       <w:r>
+        <w:rPr>
+          <w:color w:val="000000"/>
+          <w:u w:val="none"/>
+        </w:rPr>
         <w:t>4.1 Design Overview</w:t>
       </w:r>
     </w:p>
@@ -1679,6 +2879,10 @@
         <w:pStyle w:val="Heading2"/>
       </w:pPr>
       <w:r>
+        <w:rPr>
+          <w:color w:val="000000"/>
+          <w:u w:val="none"/>
+        </w:rPr>
         <w:t>4.2 UML Sequence Diagrams</w:t>
       </w:r>
     </w:p>
@@ -1687,6 +2891,10 @@
         <w:pStyle w:val="Heading3"/>
       </w:pPr>
       <w:r>
+        <w:rPr>
+          <w:color w:val="000000"/>
+          <w:u w:val="none"/>
+        </w:rPr>
         <w:t>4.2.1 Instructor Creates and Publishes an Exam</w:t>
       </w:r>
     </w:p>
@@ -1751,6 +2959,10 @@
         <w:pStyle w:val="Heading3"/>
       </w:pPr>
       <w:r>
+        <w:rPr>
+          <w:color w:val="000000"/>
+          <w:u w:val="none"/>
+        </w:rPr>
         <w:t>4.2.2 Student Starts and Submits an Attempt</w:t>
       </w:r>
     </w:p>
@@ -1815,6 +3027,10 @@
         <w:pStyle w:val="Heading2"/>
       </w:pPr>
       <w:r>
+        <w:rPr>
+          <w:color w:val="000000"/>
+          <w:u w:val="none"/>
+        </w:rPr>
         <w:t>4.3 API Design</w:t>
       </w:r>
     </w:p>
@@ -1823,29 +3039,53 @@
         <w:tblStyle w:val="TableGrid"/>
         <w:tblW w:w="0" w:type="auto"/>
         <w:jc w:val="center"/>
+        <w:tblLayout w:type="fixed"/>
         <w:tblLook w:val="04A0" w:firstRow="1" w:lastRow="0" w:firstColumn="1" w:lastColumn="0" w:noHBand="0" w:noVBand="1"/>
+        <w:tblBorders>
+          <w:top w:val="single" w:sz="4" w:color="D9D9D9"/>
+          <w:left w:val="single" w:sz="4" w:color="D9D9D9"/>
+          <w:bottom w:val="single" w:sz="4" w:color="D9D9D9"/>
+          <w:right w:val="single" w:sz="4" w:color="D9D9D9"/>
+          <w:insideH w:val="single" w:sz="4" w:color="D9D9D9"/>
+          <w:insideV w:val="single" w:sz="4" w:color="D9D9D9"/>
+        </w:tblBorders>
+        <w:tblCellMar>
+          <w:top w:w="70" w:type="dxa"/>
+          <w:bottom w:w="70" w:type="dxa"/>
+          <w:left w:w="70" w:type="dxa"/>
+          <w:right w:w="70" w:type="dxa"/>
+        </w:tblCellMar>
       </w:tblPr>
       <w:tblGrid>
-        <w:gridCol w:w="1349"/>
-        <w:gridCol w:w="2862"/>
-        <w:gridCol w:w="1771"/>
-        <w:gridCol w:w="2584"/>
-        <w:gridCol w:w="1730"/>
+        <w:gridCol w:w="720"/>
+        <w:gridCol w:w="2304"/>
+        <w:gridCol w:w="2160"/>
+        <w:gridCol w:w="3240"/>
+        <w:gridCol w:w="1656"/>
       </w:tblGrid>
       <w:tr>
         <w:trPr>
           <w:tblHeader/>
           <w:jc w:val="center"/>
+          <w:cantSplit/>
         </w:trPr>
         <w:tc>
           <w:tcPr>
-            <w:tcW w:w="2016" w:type="dxa"/>
+            <w:tcW w:w="720" w:type="dxa"/>
             <w:vAlign w:val="center"/>
+            <w:shd w:fill="F1F1F1"/>
           </w:tcPr>
           <w:p>
+            <w:pPr>
+              <w:keepNext/>
+              <w:spacing w:before="0" w:after="0" w:line="252" w:lineRule="auto"/>
+              <w:jc w:val="left"/>
+            </w:pPr>
             <w:r>
               <w:rPr>
                 <w:b/>
+                <w:color w:val="000000"/>
+                <w:sz w:val="20"/>
               </w:rPr>
               <w:t>Method</w:t>
             </w:r>
@@ -1853,13 +3093,21 @@
         </w:tc>
         <w:tc>
           <w:tcPr>
-            <w:tcW w:w="2016" w:type="dxa"/>
+            <w:tcW w:w="2304" w:type="dxa"/>
             <w:vAlign w:val="center"/>
+            <w:shd w:fill="F1F1F1"/>
           </w:tcPr>
           <w:p>
+            <w:pPr>
+              <w:keepNext/>
+              <w:spacing w:before="0" w:after="0" w:line="252" w:lineRule="auto"/>
+              <w:jc w:val="left"/>
+            </w:pPr>
             <w:r>
               <w:rPr>
                 <w:b/>
+                <w:color w:val="000000"/>
+                <w:sz w:val="20"/>
               </w:rPr>
               <w:t>Endpoint</w:t>
             </w:r>
@@ -1867,13 +3115,21 @@
         </w:tc>
         <w:tc>
           <w:tcPr>
-            <w:tcW w:w="2016" w:type="dxa"/>
+            <w:tcW w:w="2160" w:type="dxa"/>
             <w:vAlign w:val="center"/>
+            <w:shd w:fill="F1F1F1"/>
           </w:tcPr>
           <w:p>
+            <w:pPr>
+              <w:keepNext/>
+              <w:spacing w:before="0" w:after="0" w:line="252" w:lineRule="auto"/>
+              <w:jc w:val="left"/>
+            </w:pPr>
             <w:r>
               <w:rPr>
                 <w:b/>
+                <w:color w:val="000000"/>
+                <w:sz w:val="20"/>
               </w:rPr>
               <w:t>Request</w:t>
             </w:r>
@@ -1881,13 +3137,21 @@
         </w:tc>
         <w:tc>
           <w:tcPr>
-            <w:tcW w:w="2016" w:type="dxa"/>
+            <w:tcW w:w="3240" w:type="dxa"/>
             <w:vAlign w:val="center"/>
+            <w:shd w:fill="F1F1F1"/>
           </w:tcPr>
           <w:p>
+            <w:pPr>
+              <w:keepNext/>
+              <w:spacing w:before="0" w:after="0" w:line="252" w:lineRule="auto"/>
+              <w:jc w:val="left"/>
+            </w:pPr>
             <w:r>
               <w:rPr>
                 <w:b/>
+                <w:color w:val="000000"/>
+                <w:sz w:val="20"/>
               </w:rPr>
               <w:t>Response / Errors</w:t>
             </w:r>
@@ -1895,13 +3159,21 @@
         </w:tc>
         <w:tc>
           <w:tcPr>
-            <w:tcW w:w="2016" w:type="dxa"/>
+            <w:tcW w:w="1656" w:type="dxa"/>
             <w:vAlign w:val="center"/>
+            <w:shd w:fill="F1F1F1"/>
           </w:tcPr>
           <w:p>
+            <w:pPr>
+              <w:keepNext/>
+              <w:spacing w:before="0" w:after="0" w:line="252" w:lineRule="auto"/>
+              <w:jc w:val="left"/>
+            </w:pPr>
             <w:r>
               <w:rPr>
                 <w:b/>
+                <w:color w:val="000000"/>
+                <w:sz w:val="20"/>
               </w:rPr>
               <w:t>Requirements</w:t>
             </w:r>
@@ -1911,53 +3183,104 @@
       <w:tr>
         <w:trPr>
           <w:jc w:val="center"/>
+          <w:cantSplit/>
         </w:trPr>
         <w:tc>
           <w:tcPr>
-            <w:tcW w:w="2016" w:type="dxa"/>
+            <w:tcW w:w="720" w:type="dxa"/>
+            <w:vAlign w:val="center"/>
           </w:tcPr>
           <w:p>
+            <w:pPr>
+              <w:keepNext w:val="0"/>
+              <w:spacing w:before="0" w:after="0" w:line="252" w:lineRule="auto"/>
+              <w:jc w:val="left"/>
+            </w:pPr>
             <w:r>
+              <w:rPr>
+                <w:color w:val="000000"/>
+                <w:sz w:val="20"/>
+              </w:rPr>
               <w:t>POST</w:t>
             </w:r>
           </w:p>
         </w:tc>
         <w:tc>
           <w:tcPr>
-            <w:tcW w:w="2016" w:type="dxa"/>
+            <w:tcW w:w="2304" w:type="dxa"/>
+            <w:vAlign w:val="center"/>
           </w:tcPr>
           <w:p>
+            <w:pPr>
+              <w:keepNext w:val="0"/>
+              <w:spacing w:before="0" w:after="0" w:line="252" w:lineRule="auto"/>
+              <w:jc w:val="left"/>
+            </w:pPr>
             <w:r>
+              <w:rPr>
+                <w:color w:val="000000"/>
+                <w:sz w:val="20"/>
+              </w:rPr>
               <w:t>/api/auth/login</w:t>
             </w:r>
           </w:p>
         </w:tc>
         <w:tc>
           <w:tcPr>
-            <w:tcW w:w="2016" w:type="dxa"/>
+            <w:tcW w:w="2160" w:type="dxa"/>
+            <w:vAlign w:val="center"/>
           </w:tcPr>
           <w:p>
+            <w:pPr>
+              <w:keepNext w:val="0"/>
+              <w:spacing w:before="0" w:after="0" w:line="252" w:lineRule="auto"/>
+              <w:jc w:val="left"/>
+            </w:pPr>
             <w:r>
+              <w:rPr>
+                <w:color w:val="000000"/>
+                <w:sz w:val="20"/>
+              </w:rPr>
               <w:t>{email, password}</w:t>
             </w:r>
           </w:p>
         </w:tc>
         <w:tc>
           <w:tcPr>
-            <w:tcW w:w="2016" w:type="dxa"/>
+            <w:tcW w:w="3240" w:type="dxa"/>
+            <w:vAlign w:val="center"/>
           </w:tcPr>
           <w:p>
+            <w:pPr>
+              <w:keepNext w:val="0"/>
+              <w:spacing w:before="0" w:after="0" w:line="252" w:lineRule="auto"/>
+              <w:jc w:val="left"/>
+            </w:pPr>
             <w:r>
+              <w:rPr>
+                <w:color w:val="000000"/>
+                <w:sz w:val="20"/>
+              </w:rPr>
               <w:t>200 {user}; 401 invalid credentials</w:t>
             </w:r>
           </w:p>
         </w:tc>
         <w:tc>
           <w:tcPr>
-            <w:tcW w:w="2016" w:type="dxa"/>
+            <w:tcW w:w="1656" w:type="dxa"/>
+            <w:vAlign w:val="center"/>
           </w:tcPr>
           <w:p>
+            <w:pPr>
+              <w:keepNext w:val="0"/>
+              <w:spacing w:before="0" w:after="0" w:line="252" w:lineRule="auto"/>
+              <w:jc w:val="left"/>
+            </w:pPr>
             <w:r>
+              <w:rPr>
+                <w:color w:val="000000"/>
+                <w:sz w:val="20"/>
+              </w:rPr>
               <w:t>AUTH-FR-01</w:t>
             </w:r>
           </w:p>
@@ -1966,53 +3289,104 @@
       <w:tr>
         <w:trPr>
           <w:jc w:val="center"/>
+          <w:cantSplit/>
         </w:trPr>
         <w:tc>
           <w:tcPr>
-            <w:tcW w:w="2016" w:type="dxa"/>
+            <w:tcW w:w="720" w:type="dxa"/>
+            <w:vAlign w:val="center"/>
           </w:tcPr>
           <w:p>
+            <w:pPr>
+              <w:keepNext w:val="0"/>
+              <w:spacing w:before="0" w:after="0" w:line="252" w:lineRule="auto"/>
+              <w:jc w:val="left"/>
+            </w:pPr>
             <w:r>
+              <w:rPr>
+                <w:color w:val="000000"/>
+                <w:sz w:val="20"/>
+              </w:rPr>
               <w:t>POST</w:t>
             </w:r>
           </w:p>
         </w:tc>
         <w:tc>
           <w:tcPr>
-            <w:tcW w:w="2016" w:type="dxa"/>
+            <w:tcW w:w="2304" w:type="dxa"/>
+            <w:vAlign w:val="center"/>
           </w:tcPr>
           <w:p>
+            <w:pPr>
+              <w:keepNext w:val="0"/>
+              <w:spacing w:before="0" w:after="0" w:line="252" w:lineRule="auto"/>
+              <w:jc w:val="left"/>
+            </w:pPr>
             <w:r>
+              <w:rPr>
+                <w:color w:val="000000"/>
+                <w:sz w:val="20"/>
+              </w:rPr>
               <w:t>/api/auth/logout</w:t>
             </w:r>
           </w:p>
         </w:tc>
         <w:tc>
           <w:tcPr>
-            <w:tcW w:w="2016" w:type="dxa"/>
+            <w:tcW w:w="2160" w:type="dxa"/>
+            <w:vAlign w:val="center"/>
           </w:tcPr>
           <w:p>
+            <w:pPr>
+              <w:keepNext w:val="0"/>
+              <w:spacing w:before="0" w:after="0" w:line="252" w:lineRule="auto"/>
+              <w:jc w:val="left"/>
+            </w:pPr>
             <w:r>
+              <w:rPr>
+                <w:color w:val="000000"/>
+                <w:sz w:val="20"/>
+              </w:rPr>
               <w:t>none / auth context</w:t>
             </w:r>
           </w:p>
         </w:tc>
         <w:tc>
           <w:tcPr>
-            <w:tcW w:w="2016" w:type="dxa"/>
+            <w:tcW w:w="3240" w:type="dxa"/>
+            <w:vAlign w:val="center"/>
           </w:tcPr>
           <w:p>
+            <w:pPr>
+              <w:keepNext w:val="0"/>
+              <w:spacing w:before="0" w:after="0" w:line="252" w:lineRule="auto"/>
+              <w:jc w:val="left"/>
+            </w:pPr>
             <w:r>
+              <w:rPr>
+                <w:color w:val="000000"/>
+                <w:sz w:val="20"/>
+              </w:rPr>
               <w:t>200 success</w:t>
             </w:r>
           </w:p>
         </w:tc>
         <w:tc>
           <w:tcPr>
-            <w:tcW w:w="2016" w:type="dxa"/>
+            <w:tcW w:w="1656" w:type="dxa"/>
+            <w:vAlign w:val="center"/>
           </w:tcPr>
           <w:p>
+            <w:pPr>
+              <w:keepNext w:val="0"/>
+              <w:spacing w:before="0" w:after="0" w:line="252" w:lineRule="auto"/>
+              <w:jc w:val="left"/>
+            </w:pPr>
             <w:r>
+              <w:rPr>
+                <w:color w:val="000000"/>
+                <w:sz w:val="20"/>
+              </w:rPr>
               <w:t>AUTH-FR-02</w:t>
             </w:r>
           </w:p>
@@ -2021,53 +3395,104 @@
       <w:tr>
         <w:trPr>
           <w:jc w:val="center"/>
+          <w:cantSplit/>
         </w:trPr>
         <w:tc>
           <w:tcPr>
-            <w:tcW w:w="2016" w:type="dxa"/>
+            <w:tcW w:w="720" w:type="dxa"/>
+            <w:vAlign w:val="center"/>
           </w:tcPr>
           <w:p>
+            <w:pPr>
+              <w:keepNext w:val="0"/>
+              <w:spacing w:before="0" w:after="0" w:line="252" w:lineRule="auto"/>
+              <w:jc w:val="left"/>
+            </w:pPr>
             <w:r>
+              <w:rPr>
+                <w:color w:val="000000"/>
+                <w:sz w:val="20"/>
+              </w:rPr>
               <w:t>POST</w:t>
             </w:r>
           </w:p>
         </w:tc>
         <w:tc>
           <w:tcPr>
-            <w:tcW w:w="2016" w:type="dxa"/>
+            <w:tcW w:w="2304" w:type="dxa"/>
+            <w:vAlign w:val="center"/>
           </w:tcPr>
           <w:p>
+            <w:pPr>
+              <w:keepNext w:val="0"/>
+              <w:spacing w:before="0" w:after="0" w:line="252" w:lineRule="auto"/>
+              <w:jc w:val="left"/>
+            </w:pPr>
             <w:r>
+              <w:rPr>
+                <w:color w:val="000000"/>
+                <w:sz w:val="20"/>
+              </w:rPr>
               <w:t>/api/exams</w:t>
             </w:r>
           </w:p>
         </w:tc>
         <w:tc>
           <w:tcPr>
-            <w:tcW w:w="2016" w:type="dxa"/>
+            <w:tcW w:w="2160" w:type="dxa"/>
+            <w:vAlign w:val="center"/>
           </w:tcPr>
           <w:p>
+            <w:pPr>
+              <w:keepNext w:val="0"/>
+              <w:spacing w:before="0" w:after="0" w:line="252" w:lineRule="auto"/>
+              <w:jc w:val="left"/>
+            </w:pPr>
             <w:r>
+              <w:rPr>
+                <w:color w:val="000000"/>
+                <w:sz w:val="20"/>
+              </w:rPr>
               <w:t>{title, description, startTime, duration}</w:t>
             </w:r>
           </w:p>
         </w:tc>
         <w:tc>
           <w:tcPr>
-            <w:tcW w:w="2016" w:type="dxa"/>
+            <w:tcW w:w="3240" w:type="dxa"/>
+            <w:vAlign w:val="center"/>
           </w:tcPr>
           <w:p>
+            <w:pPr>
+              <w:keepNext w:val="0"/>
+              <w:spacing w:before="0" w:after="0" w:line="252" w:lineRule="auto"/>
+              <w:jc w:val="left"/>
+            </w:pPr>
             <w:r>
+              <w:rPr>
+                <w:color w:val="000000"/>
+                <w:sz w:val="20"/>
+              </w:rPr>
               <w:t>201 {exam}; 400/403 on invalid/unauthorized</w:t>
             </w:r>
           </w:p>
         </w:tc>
         <w:tc>
           <w:tcPr>
-            <w:tcW w:w="2016" w:type="dxa"/>
+            <w:tcW w:w="1656" w:type="dxa"/>
+            <w:vAlign w:val="center"/>
           </w:tcPr>
           <w:p>
+            <w:pPr>
+              <w:keepNext w:val="0"/>
+              <w:spacing w:before="0" w:after="0" w:line="252" w:lineRule="auto"/>
+              <w:jc w:val="left"/>
+            </w:pPr>
             <w:r>
+              <w:rPr>
+                <w:color w:val="000000"/>
+                <w:sz w:val="20"/>
+              </w:rPr>
               <w:t>EXAM-FR-01</w:t>
             </w:r>
           </w:p>
@@ -2076,53 +3501,104 @@
       <w:tr>
         <w:trPr>
           <w:jc w:val="center"/>
+          <w:cantSplit/>
         </w:trPr>
         <w:tc>
           <w:tcPr>
-            <w:tcW w:w="2016" w:type="dxa"/>
+            <w:tcW w:w="720" w:type="dxa"/>
+            <w:vAlign w:val="center"/>
           </w:tcPr>
           <w:p>
+            <w:pPr>
+              <w:keepNext w:val="0"/>
+              <w:spacing w:before="0" w:after="0" w:line="252" w:lineRule="auto"/>
+              <w:jc w:val="left"/>
+            </w:pPr>
             <w:r>
+              <w:rPr>
+                <w:color w:val="000000"/>
+                <w:sz w:val="20"/>
+              </w:rPr>
               <w:t>PUT</w:t>
             </w:r>
           </w:p>
         </w:tc>
         <w:tc>
           <w:tcPr>
-            <w:tcW w:w="2016" w:type="dxa"/>
+            <w:tcW w:w="2304" w:type="dxa"/>
+            <w:vAlign w:val="center"/>
           </w:tcPr>
           <w:p>
+            <w:pPr>
+              <w:keepNext w:val="0"/>
+              <w:spacing w:before="0" w:after="0" w:line="252" w:lineRule="auto"/>
+              <w:jc w:val="left"/>
+            </w:pPr>
             <w:r>
+              <w:rPr>
+                <w:color w:val="000000"/>
+                <w:sz w:val="20"/>
+              </w:rPr>
               <w:t>/api/exams/:id</w:t>
             </w:r>
           </w:p>
         </w:tc>
         <w:tc>
           <w:tcPr>
-            <w:tcW w:w="2016" w:type="dxa"/>
+            <w:tcW w:w="2160" w:type="dxa"/>
+            <w:vAlign w:val="center"/>
           </w:tcPr>
           <w:p>
+            <w:pPr>
+              <w:keepNext w:val="0"/>
+              <w:spacing w:before="0" w:after="0" w:line="252" w:lineRule="auto"/>
+              <w:jc w:val="left"/>
+            </w:pPr>
             <w:r>
+              <w:rPr>
+                <w:color w:val="000000"/>
+                <w:sz w:val="20"/>
+              </w:rPr>
               <w:t>editable draft fields</w:t>
             </w:r>
           </w:p>
         </w:tc>
         <w:tc>
           <w:tcPr>
-            <w:tcW w:w="2016" w:type="dxa"/>
+            <w:tcW w:w="3240" w:type="dxa"/>
+            <w:vAlign w:val="center"/>
           </w:tcPr>
           <w:p>
+            <w:pPr>
+              <w:keepNext w:val="0"/>
+              <w:spacing w:before="0" w:after="0" w:line="252" w:lineRule="auto"/>
+              <w:jc w:val="left"/>
+            </w:pPr>
             <w:r>
+              <w:rPr>
+                <w:color w:val="000000"/>
+                <w:sz w:val="20"/>
+              </w:rPr>
               <w:t>200 {exam}; 403/409 if non-owner/non-draft</w:t>
             </w:r>
           </w:p>
         </w:tc>
         <w:tc>
           <w:tcPr>
-            <w:tcW w:w="2016" w:type="dxa"/>
+            <w:tcW w:w="1656" w:type="dxa"/>
+            <w:vAlign w:val="center"/>
           </w:tcPr>
           <w:p>
+            <w:pPr>
+              <w:keepNext w:val="0"/>
+              <w:spacing w:before="0" w:after="0" w:line="252" w:lineRule="auto"/>
+              <w:jc w:val="left"/>
+            </w:pPr>
             <w:r>
+              <w:rPr>
+                <w:color w:val="000000"/>
+                <w:sz w:val="20"/>
+              </w:rPr>
               <w:t>EXAM-FR-02</w:t>
             </w:r>
           </w:p>
@@ -2131,53 +3607,104 @@
       <w:tr>
         <w:trPr>
           <w:jc w:val="center"/>
+          <w:cantSplit/>
         </w:trPr>
         <w:tc>
           <w:tcPr>
-            <w:tcW w:w="2016" w:type="dxa"/>
+            <w:tcW w:w="720" w:type="dxa"/>
+            <w:vAlign w:val="center"/>
           </w:tcPr>
           <w:p>
+            <w:pPr>
+              <w:keepNext w:val="0"/>
+              <w:spacing w:before="0" w:after="0" w:line="252" w:lineRule="auto"/>
+              <w:jc w:val="left"/>
+            </w:pPr>
             <w:r>
+              <w:rPr>
+                <w:color w:val="000000"/>
+                <w:sz w:val="20"/>
+              </w:rPr>
               <w:t>POST</w:t>
             </w:r>
           </w:p>
         </w:tc>
         <w:tc>
           <w:tcPr>
-            <w:tcW w:w="2016" w:type="dxa"/>
+            <w:tcW w:w="2304" w:type="dxa"/>
+            <w:vAlign w:val="center"/>
           </w:tcPr>
           <w:p>
+            <w:pPr>
+              <w:keepNext w:val="0"/>
+              <w:spacing w:before="0" w:after="0" w:line="252" w:lineRule="auto"/>
+              <w:jc w:val="left"/>
+            </w:pPr>
             <w:r>
+              <w:rPr>
+                <w:color w:val="000000"/>
+                <w:sz w:val="20"/>
+              </w:rPr>
               <w:t>/api/exams/:id/publish</w:t>
             </w:r>
           </w:p>
         </w:tc>
         <w:tc>
           <w:tcPr>
-            <w:tcW w:w="2016" w:type="dxa"/>
+            <w:tcW w:w="2160" w:type="dxa"/>
+            <w:vAlign w:val="center"/>
           </w:tcPr>
           <w:p>
+            <w:pPr>
+              <w:keepNext w:val="0"/>
+              <w:spacing w:before="0" w:after="0" w:line="252" w:lineRule="auto"/>
+              <w:jc w:val="left"/>
+            </w:pPr>
             <w:r>
+              <w:rPr>
+                <w:color w:val="000000"/>
+                <w:sz w:val="20"/>
+              </w:rPr>
               <w:t>none</w:t>
             </w:r>
           </w:p>
         </w:tc>
         <w:tc>
           <w:tcPr>
-            <w:tcW w:w="2016" w:type="dxa"/>
+            <w:tcW w:w="3240" w:type="dxa"/>
+            <w:vAlign w:val="center"/>
           </w:tcPr>
           <w:p>
+            <w:pPr>
+              <w:keepNext w:val="0"/>
+              <w:spacing w:before="0" w:after="0" w:line="252" w:lineRule="auto"/>
+              <w:jc w:val="left"/>
+            </w:pPr>
             <w:r>
+              <w:rPr>
+                <w:color w:val="000000"/>
+                <w:sz w:val="20"/>
+              </w:rPr>
               <w:t>200 published exam; 400 if invalid</w:t>
             </w:r>
           </w:p>
         </w:tc>
         <w:tc>
           <w:tcPr>
-            <w:tcW w:w="2016" w:type="dxa"/>
+            <w:tcW w:w="1656" w:type="dxa"/>
+            <w:vAlign w:val="center"/>
           </w:tcPr>
           <w:p>
+            <w:pPr>
+              <w:keepNext w:val="0"/>
+              <w:spacing w:before="0" w:after="0" w:line="252" w:lineRule="auto"/>
+              <w:jc w:val="left"/>
+            </w:pPr>
             <w:r>
+              <w:rPr>
+                <w:color w:val="000000"/>
+                <w:sz w:val="20"/>
+              </w:rPr>
               <w:t>EXAM-FR-04</w:t>
             </w:r>
           </w:p>
@@ -2186,53 +3713,104 @@
       <w:tr>
         <w:trPr>
           <w:jc w:val="center"/>
+          <w:cantSplit/>
         </w:trPr>
         <w:tc>
           <w:tcPr>
-            <w:tcW w:w="2016" w:type="dxa"/>
+            <w:tcW w:w="720" w:type="dxa"/>
+            <w:vAlign w:val="center"/>
           </w:tcPr>
           <w:p>
+            <w:pPr>
+              <w:keepNext w:val="0"/>
+              <w:spacing w:before="0" w:after="0" w:line="252" w:lineRule="auto"/>
+              <w:jc w:val="left"/>
+            </w:pPr>
             <w:r>
+              <w:rPr>
+                <w:color w:val="000000"/>
+                <w:sz w:val="20"/>
+              </w:rPr>
               <w:t>POST</w:t>
             </w:r>
           </w:p>
         </w:tc>
         <w:tc>
           <w:tcPr>
-            <w:tcW w:w="2016" w:type="dxa"/>
+            <w:tcW w:w="2304" w:type="dxa"/>
+            <w:vAlign w:val="center"/>
           </w:tcPr>
           <w:p>
+            <w:pPr>
+              <w:keepNext w:val="0"/>
+              <w:spacing w:before="0" w:after="0" w:line="252" w:lineRule="auto"/>
+              <w:jc w:val="left"/>
+            </w:pPr>
             <w:r>
+              <w:rPr>
+                <w:color w:val="000000"/>
+                <w:sz w:val="20"/>
+              </w:rPr>
               <w:t>/api/exams/:examId/questions</w:t>
             </w:r>
           </w:p>
         </w:tc>
         <w:tc>
           <w:tcPr>
-            <w:tcW w:w="2016" w:type="dxa"/>
+            <w:tcW w:w="2160" w:type="dxa"/>
+            <w:vAlign w:val="center"/>
           </w:tcPr>
           <w:p>
+            <w:pPr>
+              <w:keepNext w:val="0"/>
+              <w:spacing w:before="0" w:after="0" w:line="252" w:lineRule="auto"/>
+              <w:jc w:val="left"/>
+            </w:pPr>
             <w:r>
-              <w:t>{questionText, options, correctOption, marks}</w:t>
+              <w:rPr>
+                <w:color w:val="000000"/>
+                <w:sz w:val="20"/>
+              </w:rPr>
+              <w:t>{questionText, options, correctOption}; fixed +1/0 scoring</w:t>
             </w:r>
           </w:p>
         </w:tc>
         <w:tc>
           <w:tcPr>
-            <w:tcW w:w="2016" w:type="dxa"/>
+            <w:tcW w:w="3240" w:type="dxa"/>
+            <w:vAlign w:val="center"/>
           </w:tcPr>
           <w:p>
+            <w:pPr>
+              <w:keepNext w:val="0"/>
+              <w:spacing w:before="0" w:after="0" w:line="252" w:lineRule="auto"/>
+              <w:jc w:val="left"/>
+            </w:pPr>
             <w:r>
+              <w:rPr>
+                <w:color w:val="000000"/>
+                <w:sz w:val="20"/>
+              </w:rPr>
               <w:t>201 {question}; 400/403 on failure</w:t>
             </w:r>
           </w:p>
         </w:tc>
         <w:tc>
           <w:tcPr>
-            <w:tcW w:w="2016" w:type="dxa"/>
+            <w:tcW w:w="1656" w:type="dxa"/>
+            <w:vAlign w:val="center"/>
           </w:tcPr>
           <w:p>
+            <w:pPr>
+              <w:keepNext w:val="0"/>
+              <w:spacing w:before="0" w:after="0" w:line="252" w:lineRule="auto"/>
+              <w:jc w:val="left"/>
+            </w:pPr>
             <w:r>
+              <w:rPr>
+                <w:color w:val="000000"/>
+                <w:sz w:val="20"/>
+              </w:rPr>
               <w:t>QUES-FR-01</w:t>
             </w:r>
           </w:p>
@@ -2241,53 +3819,104 @@
       <w:tr>
         <w:trPr>
           <w:jc w:val="center"/>
+          <w:cantSplit/>
         </w:trPr>
         <w:tc>
           <w:tcPr>
-            <w:tcW w:w="2016" w:type="dxa"/>
+            <w:tcW w:w="720" w:type="dxa"/>
+            <w:vAlign w:val="center"/>
           </w:tcPr>
           <w:p>
+            <w:pPr>
+              <w:keepNext w:val="0"/>
+              <w:spacing w:before="0" w:after="0" w:line="252" w:lineRule="auto"/>
+              <w:jc w:val="left"/>
+            </w:pPr>
             <w:r>
+              <w:rPr>
+                <w:color w:val="000000"/>
+                <w:sz w:val="20"/>
+              </w:rPr>
               <w:t>POST</w:t>
             </w:r>
           </w:p>
         </w:tc>
         <w:tc>
           <w:tcPr>
-            <w:tcW w:w="2016" w:type="dxa"/>
+            <w:tcW w:w="2304" w:type="dxa"/>
+            <w:vAlign w:val="center"/>
           </w:tcPr>
           <w:p>
+            <w:pPr>
+              <w:keepNext w:val="0"/>
+              <w:spacing w:before="0" w:after="0" w:line="252" w:lineRule="auto"/>
+              <w:jc w:val="left"/>
+            </w:pPr>
             <w:r>
+              <w:rPr>
+                <w:color w:val="000000"/>
+                <w:sz w:val="20"/>
+              </w:rPr>
               <w:t>/api/exams/:examId/attempts</w:t>
             </w:r>
           </w:p>
         </w:tc>
         <w:tc>
           <w:tcPr>
-            <w:tcW w:w="2016" w:type="dxa"/>
+            <w:tcW w:w="2160" w:type="dxa"/>
+            <w:vAlign w:val="center"/>
           </w:tcPr>
           <w:p>
+            <w:pPr>
+              <w:keepNext w:val="0"/>
+              <w:spacing w:before="0" w:after="0" w:line="252" w:lineRule="auto"/>
+              <w:jc w:val="left"/>
+            </w:pPr>
             <w:r>
+              <w:rPr>
+                <w:color w:val="000000"/>
+                <w:sz w:val="20"/>
+              </w:rPr>
               <w:t>none</w:t>
             </w:r>
           </w:p>
         </w:tc>
         <w:tc>
           <w:tcPr>
-            <w:tcW w:w="2016" w:type="dxa"/>
+            <w:tcW w:w="3240" w:type="dxa"/>
+            <w:vAlign w:val="center"/>
           </w:tcPr>
           <w:p>
+            <w:pPr>
+              <w:keepNext w:val="0"/>
+              <w:spacing w:before="0" w:after="0" w:line="252" w:lineRule="auto"/>
+              <w:jc w:val="left"/>
+            </w:pPr>
             <w:r>
+              <w:rPr>
+                <w:color w:val="000000"/>
+                <w:sz w:val="20"/>
+              </w:rPr>
               <w:t>201 {attempt, questionsWithoutAnswers}</w:t>
             </w:r>
           </w:p>
         </w:tc>
         <w:tc>
           <w:tcPr>
-            <w:tcW w:w="2016" w:type="dxa"/>
+            <w:tcW w:w="1656" w:type="dxa"/>
+            <w:vAlign w:val="center"/>
           </w:tcPr>
           <w:p>
+            <w:pPr>
+              <w:keepNext w:val="0"/>
+              <w:spacing w:before="0" w:after="0" w:line="252" w:lineRule="auto"/>
+              <w:jc w:val="left"/>
+            </w:pPr>
             <w:r>
+              <w:rPr>
+                <w:color w:val="000000"/>
+                <w:sz w:val="20"/>
+              </w:rPr>
               <w:t>ATT-FR-02</w:t>
             </w:r>
           </w:p>
@@ -2296,53 +3925,104 @@
       <w:tr>
         <w:trPr>
           <w:jc w:val="center"/>
+          <w:cantSplit/>
         </w:trPr>
         <w:tc>
           <w:tcPr>
-            <w:tcW w:w="2016" w:type="dxa"/>
+            <w:tcW w:w="720" w:type="dxa"/>
+            <w:vAlign w:val="center"/>
           </w:tcPr>
           <w:p>
+            <w:pPr>
+              <w:keepNext w:val="0"/>
+              <w:spacing w:before="0" w:after="0" w:line="252" w:lineRule="auto"/>
+              <w:jc w:val="left"/>
+            </w:pPr>
             <w:r>
+              <w:rPr>
+                <w:color w:val="000000"/>
+                <w:sz w:val="20"/>
+              </w:rPr>
               <w:t>PUT</w:t>
             </w:r>
           </w:p>
         </w:tc>
         <w:tc>
           <w:tcPr>
-            <w:tcW w:w="2016" w:type="dxa"/>
+            <w:tcW w:w="2304" w:type="dxa"/>
+            <w:vAlign w:val="center"/>
           </w:tcPr>
           <w:p>
+            <w:pPr>
+              <w:keepNext w:val="0"/>
+              <w:spacing w:before="0" w:after="0" w:line="252" w:lineRule="auto"/>
+              <w:jc w:val="left"/>
+            </w:pPr>
             <w:r>
+              <w:rPr>
+                <w:color w:val="000000"/>
+                <w:sz w:val="20"/>
+              </w:rPr>
               <w:t>/api/attempts/:id/responses</w:t>
             </w:r>
           </w:p>
         </w:tc>
         <w:tc>
           <w:tcPr>
-            <w:tcW w:w="2016" w:type="dxa"/>
+            <w:tcW w:w="2160" w:type="dxa"/>
+            <w:vAlign w:val="center"/>
           </w:tcPr>
           <w:p>
+            <w:pPr>
+              <w:keepNext w:val="0"/>
+              <w:spacing w:before="0" w:after="0" w:line="252" w:lineRule="auto"/>
+              <w:jc w:val="left"/>
+            </w:pPr>
             <w:r>
+              <w:rPr>
+                <w:color w:val="000000"/>
+                <w:sz w:val="20"/>
+              </w:rPr>
               <w:t>{questionId, selectedOption}</w:t>
             </w:r>
           </w:p>
         </w:tc>
         <w:tc>
           <w:tcPr>
-            <w:tcW w:w="2016" w:type="dxa"/>
+            <w:tcW w:w="3240" w:type="dxa"/>
+            <w:vAlign w:val="center"/>
           </w:tcPr>
           <w:p>
+            <w:pPr>
+              <w:keepNext w:val="0"/>
+              <w:spacing w:before="0" w:after="0" w:line="252" w:lineRule="auto"/>
+              <w:jc w:val="left"/>
+            </w:pPr>
             <w:r>
+              <w:rPr>
+                <w:color w:val="000000"/>
+                <w:sz w:val="20"/>
+              </w:rPr>
               <w:t>200 saved response</w:t>
             </w:r>
           </w:p>
         </w:tc>
         <w:tc>
           <w:tcPr>
-            <w:tcW w:w="2016" w:type="dxa"/>
+            <w:tcW w:w="1656" w:type="dxa"/>
+            <w:vAlign w:val="center"/>
           </w:tcPr>
           <w:p>
+            <w:pPr>
+              <w:keepNext w:val="0"/>
+              <w:spacing w:before="0" w:after="0" w:line="252" w:lineRule="auto"/>
+              <w:jc w:val="left"/>
+            </w:pPr>
             <w:r>
+              <w:rPr>
+                <w:color w:val="000000"/>
+                <w:sz w:val="20"/>
+              </w:rPr>
               <w:t>ATT-FR-03</w:t>
             </w:r>
           </w:p>
@@ -2351,53 +4031,104 @@
       <w:tr>
         <w:trPr>
           <w:jc w:val="center"/>
+          <w:cantSplit/>
         </w:trPr>
         <w:tc>
           <w:tcPr>
-            <w:tcW w:w="2016" w:type="dxa"/>
+            <w:tcW w:w="720" w:type="dxa"/>
+            <w:vAlign w:val="center"/>
           </w:tcPr>
           <w:p>
+            <w:pPr>
+              <w:keepNext w:val="0"/>
+              <w:spacing w:before="0" w:after="0" w:line="252" w:lineRule="auto"/>
+              <w:jc w:val="left"/>
+            </w:pPr>
             <w:r>
+              <w:rPr>
+                <w:color w:val="000000"/>
+                <w:sz w:val="20"/>
+              </w:rPr>
               <w:t>POST</w:t>
             </w:r>
           </w:p>
         </w:tc>
         <w:tc>
           <w:tcPr>
-            <w:tcW w:w="2016" w:type="dxa"/>
+            <w:tcW w:w="2304" w:type="dxa"/>
+            <w:vAlign w:val="center"/>
           </w:tcPr>
           <w:p>
+            <w:pPr>
+              <w:keepNext w:val="0"/>
+              <w:spacing w:before="0" w:after="0" w:line="252" w:lineRule="auto"/>
+              <w:jc w:val="left"/>
+            </w:pPr>
             <w:r>
+              <w:rPr>
+                <w:color w:val="000000"/>
+                <w:sz w:val="20"/>
+              </w:rPr>
               <w:t>/api/attempts/:id/submit</w:t>
             </w:r>
           </w:p>
         </w:tc>
         <w:tc>
           <w:tcPr>
-            <w:tcW w:w="2016" w:type="dxa"/>
+            <w:tcW w:w="2160" w:type="dxa"/>
+            <w:vAlign w:val="center"/>
           </w:tcPr>
           <w:p>
+            <w:pPr>
+              <w:keepNext w:val="0"/>
+              <w:spacing w:before="0" w:after="0" w:line="252" w:lineRule="auto"/>
+              <w:jc w:val="left"/>
+            </w:pPr>
             <w:r>
+              <w:rPr>
+                <w:color w:val="000000"/>
+                <w:sz w:val="20"/>
+              </w:rPr>
               <w:t>none</w:t>
             </w:r>
           </w:p>
         </w:tc>
         <w:tc>
           <w:tcPr>
-            <w:tcW w:w="2016" w:type="dxa"/>
+            <w:tcW w:w="3240" w:type="dxa"/>
+            <w:vAlign w:val="center"/>
           </w:tcPr>
           <w:p>
+            <w:pPr>
+              <w:keepNext w:val="0"/>
+              <w:spacing w:before="0" w:after="0" w:line="252" w:lineRule="auto"/>
+              <w:jc w:val="left"/>
+            </w:pPr>
             <w:r>
-              <w:t>200 {score/result}; 409 if already expired/submitted</w:t>
+              <w:rPr>
+                <w:color w:val="000000"/>
+                <w:sz w:val="20"/>
+              </w:rPr>
+              <w:t>200 persisted submitted/result-or-pending outcome; repeated/racing finalization is idempotent</w:t>
             </w:r>
           </w:p>
         </w:tc>
         <w:tc>
           <w:tcPr>
-            <w:tcW w:w="2016" w:type="dxa"/>
+            <w:tcW w:w="1656" w:type="dxa"/>
+            <w:vAlign w:val="center"/>
           </w:tcPr>
           <w:p>
+            <w:pPr>
+              <w:keepNext w:val="0"/>
+              <w:spacing w:before="0" w:after="0" w:line="252" w:lineRule="auto"/>
+              <w:jc w:val="left"/>
+            </w:pPr>
             <w:r>
+              <w:rPr>
+                <w:color w:val="000000"/>
+                <w:sz w:val="20"/>
+              </w:rPr>
               <w:t>ATT-FR-05/06, EVAL-FR-01/02</w:t>
             </w:r>
           </w:p>
@@ -2406,53 +4137,104 @@
       <w:tr>
         <w:trPr>
           <w:jc w:val="center"/>
+          <w:cantSplit/>
         </w:trPr>
         <w:tc>
           <w:tcPr>
-            <w:tcW w:w="2016" w:type="dxa"/>
+            <w:tcW w:w="720" w:type="dxa"/>
+            <w:vAlign w:val="center"/>
           </w:tcPr>
           <w:p>
+            <w:pPr>
+              <w:keepNext w:val="0"/>
+              <w:spacing w:before="0" w:after="0" w:line="252" w:lineRule="auto"/>
+              <w:jc w:val="left"/>
+            </w:pPr>
             <w:r>
+              <w:rPr>
+                <w:color w:val="000000"/>
+                <w:sz w:val="20"/>
+              </w:rPr>
               <w:t>GET</w:t>
             </w:r>
           </w:p>
         </w:tc>
         <w:tc>
           <w:tcPr>
-            <w:tcW w:w="2016" w:type="dxa"/>
+            <w:tcW w:w="2304" w:type="dxa"/>
+            <w:vAlign w:val="center"/>
           </w:tcPr>
           <w:p>
+            <w:pPr>
+              <w:keepNext w:val="0"/>
+              <w:spacing w:before="0" w:after="0" w:line="252" w:lineRule="auto"/>
+              <w:jc w:val="left"/>
+            </w:pPr>
             <w:r>
+              <w:rPr>
+                <w:color w:val="000000"/>
+                <w:sz w:val="20"/>
+              </w:rPr>
               <w:t>/api/results/me</w:t>
             </w:r>
           </w:p>
         </w:tc>
         <w:tc>
           <w:tcPr>
-            <w:tcW w:w="2016" w:type="dxa"/>
+            <w:tcW w:w="2160" w:type="dxa"/>
+            <w:vAlign w:val="center"/>
           </w:tcPr>
           <w:p>
+            <w:pPr>
+              <w:keepNext w:val="0"/>
+              <w:spacing w:before="0" w:after="0" w:line="252" w:lineRule="auto"/>
+              <w:jc w:val="left"/>
+            </w:pPr>
             <w:r>
+              <w:rPr>
+                <w:color w:val="000000"/>
+                <w:sz w:val="20"/>
+              </w:rPr>
               <w:t>none</w:t>
             </w:r>
           </w:p>
         </w:tc>
         <w:tc>
           <w:tcPr>
-            <w:tcW w:w="2016" w:type="dxa"/>
+            <w:tcW w:w="3240" w:type="dxa"/>
+            <w:vAlign w:val="center"/>
           </w:tcPr>
           <w:p>
+            <w:pPr>
+              <w:keepNext w:val="0"/>
+              <w:spacing w:before="0" w:after="0" w:line="252" w:lineRule="auto"/>
+              <w:jc w:val="left"/>
+            </w:pPr>
             <w:r>
+              <w:rPr>
+                <w:color w:val="000000"/>
+                <w:sz w:val="20"/>
+              </w:rPr>
               <w:t>200 own result list</w:t>
             </w:r>
           </w:p>
         </w:tc>
         <w:tc>
           <w:tcPr>
-            <w:tcW w:w="2016" w:type="dxa"/>
+            <w:tcW w:w="1656" w:type="dxa"/>
+            <w:vAlign w:val="center"/>
           </w:tcPr>
           <w:p>
+            <w:pPr>
+              <w:keepNext w:val="0"/>
+              <w:spacing w:before="0" w:after="0" w:line="252" w:lineRule="auto"/>
+              <w:jc w:val="left"/>
+            </w:pPr>
             <w:r>
+              <w:rPr>
+                <w:color w:val="000000"/>
+                <w:sz w:val="20"/>
+              </w:rPr>
               <w:t>RES-FR-01</w:t>
             </w:r>
           </w:p>
@@ -2461,53 +4243,104 @@
       <w:tr>
         <w:trPr>
           <w:jc w:val="center"/>
+          <w:cantSplit/>
         </w:trPr>
         <w:tc>
           <w:tcPr>
-            <w:tcW w:w="2016" w:type="dxa"/>
+            <w:tcW w:w="720" w:type="dxa"/>
+            <w:vAlign w:val="center"/>
           </w:tcPr>
           <w:p>
+            <w:pPr>
+              <w:keepNext w:val="0"/>
+              <w:spacing w:before="0" w:after="0" w:line="252" w:lineRule="auto"/>
+              <w:jc w:val="left"/>
+            </w:pPr>
             <w:r>
+              <w:rPr>
+                <w:color w:val="000000"/>
+                <w:sz w:val="20"/>
+              </w:rPr>
               <w:t>GET</w:t>
             </w:r>
           </w:p>
         </w:tc>
         <w:tc>
           <w:tcPr>
-            <w:tcW w:w="2016" w:type="dxa"/>
+            <w:tcW w:w="2304" w:type="dxa"/>
+            <w:vAlign w:val="center"/>
           </w:tcPr>
           <w:p>
+            <w:pPr>
+              <w:keepNext w:val="0"/>
+              <w:spacing w:before="0" w:after="0" w:line="252" w:lineRule="auto"/>
+              <w:jc w:val="left"/>
+            </w:pPr>
             <w:r>
+              <w:rPr>
+                <w:color w:val="000000"/>
+                <w:sz w:val="20"/>
+              </w:rPr>
               <w:t>/api/exams/:examId/results</w:t>
             </w:r>
           </w:p>
         </w:tc>
         <w:tc>
           <w:tcPr>
-            <w:tcW w:w="2016" w:type="dxa"/>
+            <w:tcW w:w="2160" w:type="dxa"/>
+            <w:vAlign w:val="center"/>
           </w:tcPr>
           <w:p>
+            <w:pPr>
+              <w:keepNext w:val="0"/>
+              <w:spacing w:before="0" w:after="0" w:line="252" w:lineRule="auto"/>
+              <w:jc w:val="left"/>
+            </w:pPr>
             <w:r>
+              <w:rPr>
+                <w:color w:val="000000"/>
+                <w:sz w:val="20"/>
+              </w:rPr>
               <w:t>none</w:t>
             </w:r>
           </w:p>
         </w:tc>
         <w:tc>
           <w:tcPr>
-            <w:tcW w:w="2016" w:type="dxa"/>
+            <w:tcW w:w="3240" w:type="dxa"/>
+            <w:vAlign w:val="center"/>
           </w:tcPr>
           <w:p>
+            <w:pPr>
+              <w:keepNext w:val="0"/>
+              <w:spacing w:before="0" w:after="0" w:line="252" w:lineRule="auto"/>
+              <w:jc w:val="left"/>
+            </w:pPr>
             <w:r>
+              <w:rPr>
+                <w:color w:val="000000"/>
+                <w:sz w:val="20"/>
+              </w:rPr>
               <w:t>200 owned-exam results; 403 otherwise</w:t>
             </w:r>
           </w:p>
         </w:tc>
         <w:tc>
           <w:tcPr>
-            <w:tcW w:w="2016" w:type="dxa"/>
+            <w:tcW w:w="1656" w:type="dxa"/>
+            <w:vAlign w:val="center"/>
           </w:tcPr>
           <w:p>
+            <w:pPr>
+              <w:keepNext w:val="0"/>
+              <w:spacing w:before="0" w:after="0" w:line="252" w:lineRule="auto"/>
+              <w:jc w:val="left"/>
+            </w:pPr>
             <w:r>
+              <w:rPr>
+                <w:color w:val="000000"/>
+                <w:sz w:val="20"/>
+              </w:rPr>
               <w:t>RES-FR-02</w:t>
             </w:r>
           </w:p>
@@ -2519,6 +4352,10 @@
         <w:pStyle w:val="Heading2"/>
       </w:pPr>
       <w:r>
+        <w:rPr>
+          <w:color w:val="000000"/>
+          <w:u w:val="none"/>
+        </w:rPr>
         <w:lastRenderedPageBreak/>
         <w:t>4.4 Error Handling, Logging &amp; Monitoring</w:t>
       </w:r>
@@ -2568,6 +4405,10 @@
         <w:pStyle w:val="Heading2"/>
       </w:pPr>
       <w:r>
+        <w:rPr>
+          <w:color w:val="000000"/>
+          <w:u w:val="none"/>
+        </w:rPr>
         <w:t>4.5 UX Design</w:t>
       </w:r>
     </w:p>
@@ -2616,6 +4457,10 @@
         <w:pStyle w:val="Heading2"/>
       </w:pPr>
       <w:r>
+        <w:rPr>
+          <w:color w:val="000000"/>
+          <w:u w:val="none"/>
+        </w:rPr>
         <w:t>4.6 Open Issues &amp; Next Steps</w:t>
       </w:r>
     </w:p>
@@ -2624,7 +4469,7 @@
         <w:pStyle w:val="ListBullet"/>
       </w:pPr>
       <w:r>
-        <w:t>Finalize authentication transport/session mechanism during Sprint 1.</w:t>
+        <w:t>Implement the required server-managed session mechanism in Sprint 1; record session store, cookie/CSRF settings and local CORS origins in #23/#24 PRs.</w:t>
       </w:r>
     </w:p>
     <w:p>
@@ -2644,6 +4489,11 @@
       </w:r>
     </w:p>
     <w:p>
+      <w:r>
+        <w:t>Keep fixed +1/0 scoring, one resumable attempt, immutable publication and server-driven browser-closed expiry consistent with the SRS and existing issues. Persist submission before evaluation; retry evaluation without reopening answers. Exact interfaces remain implementation handoffs, not completed code.</w:t>
+      </w:r>
+    </w:p>
+    <w:p>
       <w:pPr>
         <w:pStyle w:val="ListBullet"/>
       </w:pPr>
@@ -2656,6 +4506,10 @@
         <w:pStyle w:val="Heading1"/>
       </w:pPr>
       <w:r>
+        <w:rPr>
+          <w:color w:val="000000"/>
+          <w:u w:val="none"/>
+        </w:rPr>
         <w:t>5. Appendices</w:t>
       </w:r>
     </w:p>
@@ -3298,7 +5152,7 @@
       <w:rFonts w:asciiTheme="majorHAnsi" w:eastAsiaTheme="majorEastAsia" w:hAnsiTheme="majorHAnsi" w:cstheme="majorBidi"/>
       <w:b/>
       <w:bCs/>
-      <w:color w:val="365F91" w:themeColor="accent1" w:themeShade="BF"/>
+      <w:color w:val="000000"/>
       <w:sz w:val="28"/>
       <w:szCs w:val="28"/>
     </w:rPr>
@@ -3322,7 +5176,7 @@
       <w:rFonts w:asciiTheme="majorHAnsi" w:eastAsiaTheme="majorEastAsia" w:hAnsiTheme="majorHAnsi" w:cstheme="majorBidi"/>
       <w:b/>
       <w:bCs/>
-      <w:color w:val="4F81BD" w:themeColor="accent1"/>
+      <w:color w:val="000000"/>
       <w:sz w:val="26"/>
       <w:szCs w:val="26"/>
     </w:rPr>
@@ -3346,7 +5200,7 @@
       <w:rFonts w:asciiTheme="majorHAnsi" w:eastAsiaTheme="majorEastAsia" w:hAnsiTheme="majorHAnsi" w:cstheme="majorBidi"/>
       <w:b/>
       <w:bCs/>
-      <w:color w:val="4F81BD" w:themeColor="accent1"/>
+      <w:color w:val="000000"/>
     </w:rPr>
   </w:style>
   <w:style w:type="paragraph" w:styleId="Heading4">
@@ -3371,7 +5225,7 @@
       <w:bCs/>
       <w:i/>
       <w:iCs/>
-      <w:color w:val="4F81BD" w:themeColor="accent1"/>
+      <w:color w:val="000000"/>
     </w:rPr>
   </w:style>
   <w:style w:type="paragraph" w:styleId="Heading5">
@@ -3392,7 +5246,7 @@
     </w:pPr>
     <w:rPr>
       <w:rFonts w:asciiTheme="majorHAnsi" w:eastAsiaTheme="majorEastAsia" w:hAnsiTheme="majorHAnsi" w:cstheme="majorBidi"/>
-      <w:color w:val="243F60" w:themeColor="accent1" w:themeShade="7F"/>
+      <w:color w:val="000000"/>
     </w:rPr>
   </w:style>
   <w:style w:type="paragraph" w:styleId="Heading6">
@@ -3415,7 +5269,7 @@
       <w:rFonts w:asciiTheme="majorHAnsi" w:eastAsiaTheme="majorEastAsia" w:hAnsiTheme="majorHAnsi" w:cstheme="majorBidi"/>
       <w:i/>
       <w:iCs/>
-      <w:color w:val="243F60" w:themeColor="accent1" w:themeShade="7F"/>
+      <w:color w:val="000000"/>
     </w:rPr>
   </w:style>
   <w:style w:type="paragraph" w:styleId="Heading7">
@@ -3438,7 +5292,7 @@
       <w:rFonts w:asciiTheme="majorHAnsi" w:eastAsiaTheme="majorEastAsia" w:hAnsiTheme="majorHAnsi" w:cstheme="majorBidi"/>
       <w:i/>
       <w:iCs/>
-      <w:color w:val="404040" w:themeColor="text1" w:themeTint="BF"/>
+      <w:color w:val="000000"/>
     </w:rPr>
   </w:style>
   <w:style w:type="paragraph" w:styleId="Heading8">
@@ -3459,7 +5313,7 @@
     </w:pPr>
     <w:rPr>
       <w:rFonts w:asciiTheme="majorHAnsi" w:eastAsiaTheme="majorEastAsia" w:hAnsiTheme="majorHAnsi" w:cstheme="majorBidi"/>
-      <w:color w:val="4F81BD" w:themeColor="accent1"/>
+      <w:color w:val="000000"/>
       <w:szCs w:val="20"/>
     </w:rPr>
   </w:style>
@@ -3483,7 +5337,7 @@
       <w:rFonts w:asciiTheme="majorHAnsi" w:eastAsiaTheme="majorEastAsia" w:hAnsiTheme="majorHAnsi" w:cstheme="majorBidi"/>
       <w:i/>
       <w:iCs/>
-      <w:color w:val="404040" w:themeColor="text1" w:themeTint="BF"/>
+      <w:color w:val="000000"/>
       <w:szCs w:val="20"/>
     </w:rPr>
   </w:style>
@@ -3576,7 +5430,7 @@
       <w:rFonts w:asciiTheme="majorHAnsi" w:eastAsiaTheme="majorEastAsia" w:hAnsiTheme="majorHAnsi" w:cstheme="majorBidi"/>
       <w:b/>
       <w:bCs/>
-      <w:color w:val="365F91" w:themeColor="accent1" w:themeShade="BF"/>
+      <w:color w:val="000000"/>
       <w:sz w:val="28"/>
       <w:szCs w:val="28"/>
     </w:rPr>
@@ -3591,7 +5445,7 @@
       <w:rFonts w:asciiTheme="majorHAnsi" w:eastAsiaTheme="majorEastAsia" w:hAnsiTheme="majorHAnsi" w:cstheme="majorBidi"/>
       <w:b/>
       <w:bCs/>
-      <w:color w:val="4F81BD" w:themeColor="accent1"/>
+      <w:color w:val="000000"/>
       <w:sz w:val="26"/>
       <w:szCs w:val="26"/>
     </w:rPr>
@@ -3606,7 +5460,7 @@
       <w:rFonts w:asciiTheme="majorHAnsi" w:eastAsiaTheme="majorEastAsia" w:hAnsiTheme="majorHAnsi" w:cstheme="majorBidi"/>
       <w:b/>
       <w:bCs/>
-      <w:color w:val="4F81BD" w:themeColor="accent1"/>
+      <w:color w:val="000000"/>
     </w:rPr>
   </w:style>
   <w:style w:type="paragraph" w:styleId="Title">
@@ -3626,7 +5480,7 @@
     </w:pPr>
     <w:rPr>
       <w:rFonts w:asciiTheme="majorHAnsi" w:eastAsiaTheme="majorEastAsia" w:hAnsiTheme="majorHAnsi" w:cstheme="majorBidi"/>
-      <w:color w:val="17365D" w:themeColor="text2" w:themeShade="BF"/>
+      <w:color w:val="000000"/>
       <w:spacing w:val="5"/>
       <w:kern w:val="28"/>
       <w:sz w:val="52"/>
@@ -3981,7 +5835,7 @@
       <w:bCs/>
       <w:i/>
       <w:iCs/>
-      <w:color w:val="4F81BD" w:themeColor="accent1"/>
+      <w:color w:val="000000"/>
     </w:rPr>
   </w:style>
   <w:style w:type="character" w:customStyle="1" w:styleId="Heading5Char">
@@ -3993,7 +5847,7 @@
     <w:rsid w:val="00FC693F"/>
     <w:rPr>
       <w:rFonts w:asciiTheme="majorHAnsi" w:eastAsiaTheme="majorEastAsia" w:hAnsiTheme="majorHAnsi" w:cstheme="majorBidi"/>
-      <w:color w:val="243F60" w:themeColor="accent1" w:themeShade="7F"/>
+      <w:color w:val="000000"/>
     </w:rPr>
   </w:style>
   <w:style w:type="character" w:customStyle="1" w:styleId="Heading6Char">
@@ -4007,7 +5861,7 @@
       <w:rFonts w:asciiTheme="majorHAnsi" w:eastAsiaTheme="majorEastAsia" w:hAnsiTheme="majorHAnsi" w:cstheme="majorBidi"/>
       <w:i/>
       <w:iCs/>
-      <w:color w:val="243F60" w:themeColor="accent1" w:themeShade="7F"/>
+      <w:color w:val="000000"/>
     </w:rPr>
   </w:style>
   <w:style w:type="character" w:customStyle="1" w:styleId="Heading7Char">
@@ -4021,7 +5875,7 @@
       <w:rFonts w:asciiTheme="majorHAnsi" w:eastAsiaTheme="majorEastAsia" w:hAnsiTheme="majorHAnsi" w:cstheme="majorBidi"/>
       <w:i/>
       <w:iCs/>
-      <w:color w:val="404040" w:themeColor="text1" w:themeTint="BF"/>
+      <w:color w:val="000000"/>
     </w:rPr>
   </w:style>
   <w:style w:type="character" w:customStyle="1" w:styleId="Heading8Char">
@@ -4033,7 +5887,7 @@
     <w:rsid w:val="00FC693F"/>
     <w:rPr>
       <w:rFonts w:asciiTheme="majorHAnsi" w:eastAsiaTheme="majorEastAsia" w:hAnsiTheme="majorHAnsi" w:cstheme="majorBidi"/>
-      <w:color w:val="4F81BD" w:themeColor="accent1"/>
+      <w:color w:val="000000"/>
       <w:sz w:val="20"/>
       <w:szCs w:val="20"/>
     </w:rPr>
@@ -4049,7 +5903,7 @@
       <w:rFonts w:asciiTheme="majorHAnsi" w:eastAsiaTheme="majorEastAsia" w:hAnsiTheme="majorHAnsi" w:cstheme="majorBidi"/>
       <w:i/>
       <w:iCs/>
-      <w:color w:val="404040" w:themeColor="text1" w:themeTint="BF"/>
+      <w:color w:val="000000"/>
       <w:sz w:val="20"/>
       <w:szCs w:val="20"/>
     </w:rPr>

</xml_diff>